<commit_message>
feat: add the goal in my life is you chap 23
</commit_message>
<xml_diff>
--- a/public/Books/The goal in my life is you.docx
+++ b/public/Books/The goal in my life is you.docx
@@ -20621,19 +20621,7 @@
     </w:p>
     <w:p>
       <w:r>
-        <w:t xml:space="preserve">« Si je suis de bonne humeur, </w:t>
-      </w:r>
-      <w:r>
-        <w:t>ça ne va pas</w:t>
-      </w:r>
-      <w:r>
-        <w:t xml:space="preserve">, si je suis de mauvaise humeur, </w:t>
-      </w:r>
-      <w:r>
-        <w:t>ça ne va pas</w:t>
-      </w:r>
-      <w:r>
-        <w:t xml:space="preserve"> non plus. Qu'est-ce que vous voulez, à la fin ? »</w:t>
+        <w:t>« Si je suis de bonne humeur, ça ne va pas, si je suis de mauvaise humeur, ça ne va pas non plus. Qu'est-ce que vous voulez, à la fin ? »</w:t>
       </w:r>
     </w:p>
     <w:p>
@@ -23783,6 +23771,2384 @@
         <w:t xml:space="preserve"> avait qualifiés de « carrément chauds ». Euh… c’est le moment de sourire ? Laisse tomber ! Aujourd’hui, on va voir si mon pyjama va me permettre de dormir… ou pas !</w:t>
       </w:r>
     </w:p>
+    <w:p/>
+    <w:p/>
+    <w:p/>
+    <w:p/>
+    <w:p/>
+    <w:p/>
+    <w:p>
+      <w:pPr>
+        <w:rPr>
+          <w:b/>
+          <w:bCs/>
+          <w:sz w:val="40"/>
+          <w:szCs w:val="40"/>
+        </w:rPr>
+      </w:pPr>
+      <w:r>
+        <w:rPr>
+          <w:b/>
+          <w:bCs/>
+          <w:sz w:val="40"/>
+          <w:szCs w:val="40"/>
+        </w:rPr>
+        <w:lastRenderedPageBreak/>
+        <w:t>Chapitre 22</w:t>
+      </w:r>
+    </w:p>
+    <w:p>
+      <w:pPr>
+        <w:rPr>
+          <w:b/>
+          <w:bCs/>
+          <w:sz w:val="40"/>
+          <w:szCs w:val="40"/>
+        </w:rPr>
+      </w:pPr>
+    </w:p>
+    <w:p>
+      <w:pPr>
+        <w:rPr>
+          <w:b/>
+          <w:bCs/>
+          <w:sz w:val="40"/>
+          <w:szCs w:val="40"/>
+        </w:rPr>
+      </w:pPr>
+    </w:p>
+    <w:p>
+      <w:r>
+        <w:rPr>
+          <w:i/>
+          <w:iCs/>
+        </w:rPr>
+        <w:t>Bip. – Clac !</w:t>
+      </w:r>
+    </w:p>
+    <w:p>
+      <w:proofErr w:type="spellStart"/>
+      <w:r>
+        <w:rPr>
+          <w:i/>
+          <w:iCs/>
+        </w:rPr>
+        <w:t>Thump</w:t>
+      </w:r>
+      <w:proofErr w:type="spellEnd"/>
+      <w:r>
+        <w:rPr>
+          <w:i/>
+          <w:iCs/>
+        </w:rPr>
+        <w:t xml:space="preserve"> </w:t>
+      </w:r>
+      <w:proofErr w:type="spellStart"/>
+      <w:r>
+        <w:rPr>
+          <w:i/>
+          <w:iCs/>
+        </w:rPr>
+        <w:t>thump</w:t>
+      </w:r>
+      <w:proofErr w:type="spellEnd"/>
+      <w:r>
+        <w:rPr>
+          <w:i/>
+          <w:iCs/>
+        </w:rPr>
+        <w:t xml:space="preserve">. </w:t>
+      </w:r>
+      <w:proofErr w:type="spellStart"/>
+      <w:r>
+        <w:rPr>
+          <w:i/>
+          <w:iCs/>
+        </w:rPr>
+        <w:t>Thump</w:t>
+      </w:r>
+      <w:proofErr w:type="spellEnd"/>
+      <w:r>
+        <w:rPr>
+          <w:i/>
+          <w:iCs/>
+        </w:rPr>
+        <w:t xml:space="preserve"> </w:t>
+      </w:r>
+      <w:proofErr w:type="spellStart"/>
+      <w:r>
+        <w:rPr>
+          <w:i/>
+          <w:iCs/>
+        </w:rPr>
+        <w:t>thump</w:t>
+      </w:r>
+      <w:proofErr w:type="spellEnd"/>
+      <w:r>
+        <w:rPr>
+          <w:i/>
+          <w:iCs/>
+        </w:rPr>
+        <w:t>.</w:t>
+      </w:r>
+    </w:p>
+    <w:p>
+      <w:r>
+        <w:t>Je regarde la porte qui s’ouvre, et Bel entre. Mais elle ne lève pas les yeux, trop occupée à regarder son téléphone, sans se douter que quelqu’un l’observe.</w:t>
+      </w:r>
+    </w:p>
+    <w:p>
+      <w:r>
+        <w:t>Elle enlève ses chaussures, puis se dirige droit vers le canapé où je suis assise. Et elle ne lève toujours pas les yeux.</w:t>
+      </w:r>
+    </w:p>
+    <w:p>
+      <w:r>
+        <w:rPr>
+          <w:i/>
+          <w:iCs/>
+        </w:rPr>
+        <w:t>Han.</w:t>
+      </w:r>
+    </w:p>
+    <w:p>
+      <w:r>
+        <w:t>« Comment es-tu entrée ?! » Elle sursaute quand elle me voit enfin. Je me lève, dans ma tenue ultra-sexy, et elle me détaille du regard.</w:t>
+      </w:r>
+    </w:p>
+    <w:p>
+      <w:r>
+        <w:t>« … » Elle est plus abasourdie qu’effrayée, et ça me rend un peu gênée. Même si on a déjà été intimes plusieurs fois, on ne s’est pas vues depuis un an. Et à sa place, j’aurais déjà pris un balai pour la frapper.</w:t>
+      </w:r>
+    </w:p>
+    <w:p>
+      <w:r>
+        <w:t>« Euh… Ben voulait te parler. »</w:t>
+      </w:r>
+    </w:p>
+    <w:p>
+      <w:r>
+        <w:t>« Me parler dans cette tenue ? T’es folle ? » Elle détourne la tête. Je vois le bout de ses oreilles blanches rosir.</w:t>
+      </w:r>
+    </w:p>
+    <w:p>
+      <w:r>
+        <w:t>Bel est gênée ?</w:t>
+      </w:r>
+      <w:r>
+        <w:br/>
+      </w:r>
+      <w:proofErr w:type="spellStart"/>
+      <w:r>
+        <w:rPr>
+          <w:i/>
+          <w:iCs/>
+        </w:rPr>
+        <w:t>Thump</w:t>
+      </w:r>
+      <w:proofErr w:type="spellEnd"/>
+      <w:r>
+        <w:rPr>
+          <w:i/>
+          <w:iCs/>
+        </w:rPr>
+        <w:t xml:space="preserve"> </w:t>
+      </w:r>
+      <w:proofErr w:type="spellStart"/>
+      <w:r>
+        <w:rPr>
+          <w:i/>
+          <w:iCs/>
+        </w:rPr>
+        <w:t>thump</w:t>
+      </w:r>
+      <w:proofErr w:type="spellEnd"/>
+      <w:r>
+        <w:rPr>
+          <w:i/>
+          <w:iCs/>
+        </w:rPr>
+        <w:t xml:space="preserve">. </w:t>
+      </w:r>
+      <w:proofErr w:type="spellStart"/>
+      <w:r>
+        <w:rPr>
+          <w:i/>
+          <w:iCs/>
+        </w:rPr>
+        <w:t>Thump</w:t>
+      </w:r>
+      <w:proofErr w:type="spellEnd"/>
+      <w:r>
+        <w:rPr>
+          <w:i/>
+          <w:iCs/>
+        </w:rPr>
+        <w:t xml:space="preserve"> </w:t>
+      </w:r>
+      <w:proofErr w:type="spellStart"/>
+      <w:r>
+        <w:rPr>
+          <w:i/>
+          <w:iCs/>
+        </w:rPr>
+        <w:t>thump</w:t>
+      </w:r>
+      <w:proofErr w:type="spellEnd"/>
+      <w:r>
+        <w:rPr>
+          <w:i/>
+          <w:iCs/>
+        </w:rPr>
+        <w:t>.</w:t>
+      </w:r>
+    </w:p>
+    <w:p>
+      <w:r>
+        <w:t>Réaliser qu’elle est gênée jusqu’aux oreilles me rend toute ma confiance. Je m’approche d’elle, lui prends la main, doucement. Bien sûr, elle la retire aussitôt.</w:t>
+      </w:r>
+    </w:p>
+    <w:p>
+      <w:r>
+        <w:t>« Qu’est-ce que tu manigances encore ? »</w:t>
+      </w:r>
+    </w:p>
+    <w:p>
+      <w:r>
+        <w:t>« Rien. Si je manigançais ce que tu crois, est-ce que je te dérangerais autant ? »</w:t>
+      </w:r>
+    </w:p>
+    <w:p>
+      <w:r>
+        <w:t>« … »</w:t>
+      </w:r>
+    </w:p>
+    <w:p>
+      <w:r>
+        <w:t>« À chaque fois qu’on se voit, tu m’insultes, tu me rembarrer. Mais Ben veut quand même te voir. Pourquoi tu ne sens pas ce qu’il y a dans mon cœur ? » Je m’approche encore. Elle recule, mais trop tard, je lui saisis fermement le bras. Elle ne peut plus bouger.</w:t>
+      </w:r>
+    </w:p>
+    <w:p>
+      <w:r>
+        <w:t>« Lâche-moi… » Elle détourne la tête, d’une voix si faible qu’elle semble plus provocante qu’interdite.</w:t>
+      </w:r>
+    </w:p>
+    <w:p>
+      <w:r>
+        <w:lastRenderedPageBreak/>
+        <w:t>« On peut se réconcilier ? » Nos regards se croisent à nouveau. Cette fois, elle me fixe, comme pour chercher encore une fois la sincérité. Et évidemment, plus que la sincérité, c’est le sérieux qu’elle voit.</w:t>
+      </w:r>
+    </w:p>
+    <w:p>
+      <w:r>
+        <w:t>« Ben pense à Bel, tous les jours. Ben veut se faire pardonner pour tout ce qu’elle a fait. »</w:t>
+      </w:r>
+    </w:p>
+    <w:p>
+      <w:r>
+        <w:t>« … »</w:t>
+      </w:r>
+    </w:p>
+    <w:p>
+      <w:r>
+        <w:t>« Ben veut partager tout son bonheur avec Bel. Pardonne-moi, Bel… » Je relâche son bras et lui prends le visage entre mes mains. « Ne sois pas si dure avec Ben… S’il te plaît… On se réconcilie, non ? »</w:t>
+      </w:r>
+    </w:p>
+    <w:p>
+      <w:r>
+        <w:t>« Ben… » Elle prononce mon nom d’une voix douce. Mon cœur, à peine voilé par ce bout de tissu, s’emballe, et je retiens mon souffle.</w:t>
+      </w:r>
+    </w:p>
+    <w:p>
+      <w:r>
+        <w:t>Je ne sais pourquoi, mais l’atmosphère a changé. Tout est devenu doux, comme dans cet appartement, l’année dernière, quand on était ensemble, à partager tant de bonheur.</w:t>
+      </w:r>
+    </w:p>
+    <w:p>
+      <w:r>
+        <w:t>Je rapproche mon visage du sien, sans quitter ses yeux. Et parce qu’on ne se quitte pas des yeux, nos lèvres ne sont plus qu’à un souffle. J’ai envie de toucher ses belles lèvres. Juste ça. Aujourd’hui, juste un baiser. Ça me suffira.</w:t>
+      </w:r>
+    </w:p>
+    <w:p>
+      <w:r>
+        <w:t>« Va te changer. »</w:t>
+      </w:r>
+    </w:p>
+    <w:p>
+      <w:r>
+        <w:t>Elle recule, comme si elle venait de se rappeler quelque chose, ramasse son sac par terre et le pose sur la table. Elle s’éloigne, tandis que je reste figée, comme hors du temps.</w:t>
+      </w:r>
+    </w:p>
+    <w:p>
+      <w:r>
+        <w:t>« … » Je la regarde faire semblant de ne pas s’intéresser à moi. Elle boit un grand verre d’eau, son visage indéchiffrable.</w:t>
+      </w:r>
+    </w:p>
+    <w:p>
+      <w:r>
+        <w:t>« Va vite te changer et sors. Quelqu’un va venir. »</w:t>
+      </w:r>
+    </w:p>
+    <w:p>
+      <w:r>
+        <w:t>« Qui ? »</w:t>
+      </w:r>
+    </w:p>
+    <w:p>
+      <w:r>
+        <w:t>« … » Elle ne répond pas, passe devant moi et se dirige vers la porte. C’est le moment que je choisis pour la prendre par-derrière, comme si je n’avais plus rien à perdre.</w:t>
+      </w:r>
+    </w:p>
+    <w:p>
+      <w:r>
+        <w:t>« Qui va venir ? Tu peux me dire ? »</w:t>
+      </w:r>
+    </w:p>
+    <w:p>
+      <w:r>
+        <w:t>« Lâche-moi. »</w:t>
+      </w:r>
+    </w:p>
+    <w:p>
+      <w:r>
+        <w:t>« Non. » Je dépose un baiser sur sa nuque. Son parfum léger me fait tourner la tête. Au point que j’ai envie de lui arracher sa belle robe, de ne rien lui laisser.</w:t>
+      </w:r>
+    </w:p>
+    <w:p>
+      <w:r>
+        <w:t>« Tu sens bon… » Son parfum m’achève à nouveau. Comment fait-on pour sentir aussi bon après une journée de travail ? Je commence à embrasser son cou avec passion, tout en la maintenant fermement.</w:t>
+      </w:r>
+    </w:p>
+    <w:p>
+      <w:r>
+        <w:t>« Lâche-moi. Arrête. »</w:t>
+      </w:r>
+    </w:p>
+    <w:p>
+      <w:r>
+        <w:lastRenderedPageBreak/>
+        <w:t>« Ben s’est ennuyée de toi, Bel. Au point de vouloir te dévorer toute crue. » Je la plaque contre la porte, pour qu’on ait un point d’appui. Ma main glisse sous son chemisier, l’autre lui tient les deux poignets.</w:t>
+      </w:r>
+    </w:p>
+    <w:p>
+      <w:r>
+        <w:t>Elle se débat un peu, le visage contre la porte, mais elle ne peut rien contre ma force, mon corps plaqué contre le sien. Finalement, ma main s’arrête sur son ventre plat, qu’elle contracte. Je le sens.</w:t>
+      </w:r>
+    </w:p>
+    <w:p>
+      <w:r>
+        <w:t>« Lâche-toi une fois de plus avec moi, d’accord ? »</w:t>
+      </w:r>
+    </w:p>
+    <w:p>
+      <w:r>
+        <w:t>« Tu vas encore me quitter… »</w:t>
+      </w:r>
+    </w:p>
+    <w:p>
+      <w:proofErr w:type="spellStart"/>
+      <w:r>
+        <w:rPr>
+          <w:i/>
+          <w:iCs/>
+        </w:rPr>
+        <w:t>Thump</w:t>
+      </w:r>
+      <w:proofErr w:type="spellEnd"/>
+      <w:r>
+        <w:rPr>
+          <w:i/>
+          <w:iCs/>
+        </w:rPr>
+        <w:t xml:space="preserve"> </w:t>
+      </w:r>
+      <w:proofErr w:type="spellStart"/>
+      <w:r>
+        <w:rPr>
+          <w:i/>
+          <w:iCs/>
+        </w:rPr>
+        <w:t>thump</w:t>
+      </w:r>
+      <w:proofErr w:type="spellEnd"/>
+      <w:r>
+        <w:rPr>
+          <w:i/>
+          <w:iCs/>
+        </w:rPr>
+        <w:t xml:space="preserve">. </w:t>
+      </w:r>
+      <w:proofErr w:type="spellStart"/>
+      <w:r>
+        <w:rPr>
+          <w:i/>
+          <w:iCs/>
+        </w:rPr>
+        <w:t>Thump</w:t>
+      </w:r>
+      <w:proofErr w:type="spellEnd"/>
+      <w:r>
+        <w:rPr>
+          <w:i/>
+          <w:iCs/>
+        </w:rPr>
+        <w:t xml:space="preserve"> </w:t>
+      </w:r>
+      <w:proofErr w:type="spellStart"/>
+      <w:r>
+        <w:rPr>
+          <w:i/>
+          <w:iCs/>
+        </w:rPr>
+        <w:t>thump</w:t>
+      </w:r>
+      <w:proofErr w:type="spellEnd"/>
+      <w:r>
+        <w:rPr>
+          <w:i/>
+          <w:iCs/>
+        </w:rPr>
+        <w:t>.</w:t>
+      </w:r>
+    </w:p>
+    <w:p>
+      <w:r>
+        <w:t>Ses paroles, comme si j’avais retrouvé l’ancienne Bel, font battre mon cœur plus fort. Sa voix est redevenue douce, je souris.</w:t>
+      </w:r>
+    </w:p>
+    <w:p>
+      <w:r>
+        <w:t>« Ben ne te quittera plus jamais. Parce que Ben t’… »</w:t>
+      </w:r>
+    </w:p>
+    <w:p>
+      <w:r>
+        <w:t>« Rin arrive ! »</w:t>
+      </w:r>
+    </w:p>
+    <w:p>
+      <w:r>
+        <w:t>Et mon « je t’aime » est avalé par ce nom qui m’agace à chaque fois. Bel me repousse d’un coup de coude, facilement, alors que je suis encore sonnée par ce nom.</w:t>
+      </w:r>
+    </w:p>
+    <w:p>
+      <w:r>
+        <w:t>« Tout à l’heure, tu as dit que qui arrivait ? »</w:t>
+      </w:r>
+    </w:p>
+    <w:p>
+      <w:r>
+        <w:t>« Viens… » Elle me traîne dans une autre pièce, la petite cuisine où on a déjà mangé des sandwiches ensemble.</w:t>
+      </w:r>
+    </w:p>
+    <w:p>
+      <w:r>
+        <w:t>« Qui vient ? Rin ? La gamine ? »</w:t>
+      </w:r>
+    </w:p>
+    <w:p>
+      <w:r>
+        <w:t>« Reste là, sans faire de bruit, si tu ne veux pas que quelqu’un te voie dans cette tenue idiote. » Je regarde Bel aller ouvrir la porte. Je vérifie discrètement que c’est bien elle.</w:t>
+      </w:r>
+    </w:p>
+    <w:p>
+      <w:r>
+        <w:t>« Rin, ça va ? Qu’est-ce qui t’arrive encore</w:t>
+      </w:r>
+      <w:proofErr w:type="gramStart"/>
+      <w:r>
+        <w:t xml:space="preserve"> ?…</w:t>
+      </w:r>
+      <w:proofErr w:type="gramEnd"/>
+      <w:r>
+        <w:t xml:space="preserve"> Entre, on parlera à l’intérieur. » J’entends Bel, je tends le cou pour voir. Évidemment, c’est celle qui m’énerve.</w:t>
+      </w:r>
+    </w:p>
+    <w:p>
+      <w:r>
+        <w:t>Cette gamine…</w:t>
+      </w:r>
+    </w:p>
+    <w:p>
+      <w:r>
+        <w:t>Je regarde Bel, le bras autour de ses épaules, pleine d’attention. Au même moment, Bel croise mon regard.</w:t>
+      </w:r>
+    </w:p>
+    <w:p>
+      <w:r>
+        <w:t xml:space="preserve">« </w:t>
+      </w:r>
+      <w:proofErr w:type="spellStart"/>
+      <w:r>
+        <w:t>P’Bel</w:t>
+      </w:r>
+      <w:proofErr w:type="spellEnd"/>
+      <w:r>
+        <w:t>… tu es… toute seule ? »</w:t>
+      </w:r>
+    </w:p>
+    <w:p>
+      <w:r>
+        <w:t>« Oui. Rin, assieds-toi d’abord, je vais te chercher de l’eau. » Bel vient chercher de l’eau là où je me cache. Elle prend une bouteille, mais je la retiens.</w:t>
+      </w:r>
+    </w:p>
+    <w:p>
+      <w:r>
+        <w:t>« Tu n’as pas l’intention de faire quelque chose avec elle dans cet appartement, si ? »</w:t>
+      </w:r>
+    </w:p>
+    <w:p>
+      <w:r>
+        <w:t>« Esprit tordu… » Elle se dégage et va retrouver la gamine.</w:t>
+      </w:r>
+    </w:p>
+    <w:p>
+      <w:r>
+        <w:lastRenderedPageBreak/>
+        <w:t>« Rin, qu’est-ce qu’il y a ? Tu peux me le dire ? »</w:t>
+      </w:r>
+    </w:p>
+    <w:p>
+      <w:r>
+        <w:t>« … »</w:t>
+      </w:r>
+    </w:p>
+    <w:p>
+      <w:r>
+        <w:t>« C’est à cause de Kan, non ? » Je regarde la gamine sursauter, sans comprendre. Si je devais deviner, Kan doit être la meilleure amie de Bel. Pourquoi cette gamine sursaute en entendant son nom ? Une dispute entre sœurs ? Cette fille est la sœur de l’amie de Bel ?</w:t>
+      </w:r>
+    </w:p>
+    <w:p>
+      <w:r>
+        <w:t>« Comment… »</w:t>
+      </w:r>
+    </w:p>
+    <w:p>
+      <w:r>
+        <w:t>« Comment je sais ? »</w:t>
+      </w:r>
+    </w:p>
+    <w:p>
+      <w:r>
+        <w:t>« … »</w:t>
+      </w:r>
+    </w:p>
+    <w:p>
+      <w:r>
+        <w:t>« L’autre jour, quand on achetait du maquillage… dans les toilettes, je t’ai vue. »</w:t>
+      </w:r>
+    </w:p>
+    <w:p>
+      <w:r>
+        <w:t xml:space="preserve">« </w:t>
+      </w:r>
+      <w:proofErr w:type="spellStart"/>
+      <w:r>
+        <w:t>P’Bel</w:t>
+      </w:r>
+      <w:proofErr w:type="spellEnd"/>
+      <w:r>
+        <w:t xml:space="preserve"> a vu… tu veux dire… »</w:t>
+      </w:r>
+    </w:p>
+    <w:p>
+      <w:r>
+        <w:t xml:space="preserve">« Des frère et sœur ne s’embrassent pas normalement, non ? » En entendant ces mots, je repense à la tête de Bel l’autre jour, quand j’étais venue essayer de me faire pardonner avec mon titre </w:t>
+      </w:r>
+      <w:proofErr w:type="spellStart"/>
+      <w:r>
+        <w:t>putaclier</w:t>
+      </w:r>
+      <w:proofErr w:type="spellEnd"/>
+      <w:r>
+        <w:t>. Attends… Donc son amie et cette gamine… celle qui s’appelle Kan sort avec cette gamine ? Donc Bel n’a pas le droit de la draguer.</w:t>
+      </w:r>
+    </w:p>
+    <w:p>
+      <w:r>
+        <w:t>À cette idée, mon agacement s’estompe, remplacé par un grand sourire.</w:t>
+      </w:r>
+    </w:p>
+    <w:p>
+      <w:r>
+        <w:t xml:space="preserve">« Même si tu le savais, tu as quand même été gentille avec Rin, euh… Rin n’a pas imaginé toute seule, n’est-ce pas ? Que </w:t>
+      </w:r>
+      <w:proofErr w:type="spellStart"/>
+      <w:r>
+        <w:t>P’Bel</w:t>
+      </w:r>
+      <w:proofErr w:type="spellEnd"/>
+      <w:r>
+        <w:t>… »</w:t>
+      </w:r>
+    </w:p>
+    <w:p>
+      <w:r>
+        <w:t xml:space="preserve">« </w:t>
+      </w:r>
+      <w:proofErr w:type="spellStart"/>
+      <w:r>
+        <w:t>Mmmm</w:t>
+      </w:r>
+      <w:proofErr w:type="spellEnd"/>
+      <w:r>
+        <w:t xml:space="preserve">… si tu veux dire que </w:t>
+      </w:r>
+      <w:proofErr w:type="spellStart"/>
+      <w:r>
+        <w:t>P’Bel</w:t>
+      </w:r>
+      <w:proofErr w:type="spellEnd"/>
+      <w:r>
+        <w:t xml:space="preserve"> aime Rin, ce n’est pas faux. Bel aime bien Rin, c’est vrai… » Bel pose son menton dans sa main et regarde la gamine avec douceur. Ce regard qui m’a tant fait craquer.</w:t>
+      </w:r>
+    </w:p>
+    <w:p>
+      <w:r>
+        <w:t>« Tu ne pleures plus… »</w:t>
+      </w:r>
+    </w:p>
+    <w:p>
+      <w:r>
+        <w:t>« Mes larmes ont dû avoir peur aussi. »</w:t>
+      </w:r>
+    </w:p>
+    <w:p>
+      <w:r>
+        <w:t>« Puisqu’on en est là, Bel va te dire franchement. Comme ça, les choses seront claires. »</w:t>
+      </w:r>
+    </w:p>
+    <w:p>
+      <w:r>
+        <w:t>Moi qui écoute tout, je me sens étrange à ces mots. Je me cale contre le mur pour mieux entendre ce qu’elle va dire.</w:t>
+      </w:r>
+    </w:p>
+    <w:p>
+      <w:r>
+        <w:t xml:space="preserve">« Bel t’aime bien, Rin. Depuis la première fois qu’on s’est vues. Tu es une fille mignonne, </w:t>
+      </w:r>
+      <w:proofErr w:type="spellStart"/>
+      <w:r>
+        <w:t>P’Bel</w:t>
+      </w:r>
+      <w:proofErr w:type="spellEnd"/>
+      <w:r>
+        <w:t xml:space="preserve"> avait envie d’apprendre à te connaître… »</w:t>
+      </w:r>
+    </w:p>
+    <w:p>
+      <w:proofErr w:type="spellStart"/>
+      <w:r>
+        <w:rPr>
+          <w:i/>
+          <w:iCs/>
+        </w:rPr>
+        <w:t>Thump</w:t>
+      </w:r>
+      <w:proofErr w:type="spellEnd"/>
+      <w:r>
+        <w:rPr>
+          <w:i/>
+          <w:iCs/>
+        </w:rPr>
+        <w:t xml:space="preserve"> </w:t>
+      </w:r>
+      <w:proofErr w:type="spellStart"/>
+      <w:r>
+        <w:rPr>
+          <w:i/>
+          <w:iCs/>
+        </w:rPr>
+        <w:t>thump</w:t>
+      </w:r>
+      <w:proofErr w:type="spellEnd"/>
+      <w:r>
+        <w:rPr>
+          <w:i/>
+          <w:iCs/>
+        </w:rPr>
+        <w:t xml:space="preserve">. </w:t>
+      </w:r>
+      <w:proofErr w:type="spellStart"/>
+      <w:r>
+        <w:rPr>
+          <w:i/>
+          <w:iCs/>
+        </w:rPr>
+        <w:t>Thump</w:t>
+      </w:r>
+      <w:proofErr w:type="spellEnd"/>
+      <w:r>
+        <w:rPr>
+          <w:i/>
+          <w:iCs/>
+        </w:rPr>
+        <w:t xml:space="preserve"> </w:t>
+      </w:r>
+      <w:proofErr w:type="spellStart"/>
+      <w:r>
+        <w:rPr>
+          <w:i/>
+          <w:iCs/>
+        </w:rPr>
+        <w:t>thump</w:t>
+      </w:r>
+      <w:proofErr w:type="spellEnd"/>
+      <w:r>
+        <w:rPr>
+          <w:i/>
+          <w:iCs/>
+        </w:rPr>
+        <w:t>.</w:t>
+      </w:r>
+    </w:p>
+    <w:p>
+      <w:r>
+        <w:t>En entendant distinctement sa déclaration, je serre les poings, ne sachant quoi faire. Mais ce qui me fait encore plus mal, c’est que Bel embrasse la joue de cette gamine. Oui… la bouche que je veux toucher est en train de déposer un baiser sur sa joue blanche.</w:t>
+      </w:r>
+    </w:p>
+    <w:p>
+      <w:proofErr w:type="spellStart"/>
+      <w:r>
+        <w:rPr>
+          <w:i/>
+          <w:iCs/>
+        </w:rPr>
+        <w:t>Thump</w:t>
+      </w:r>
+      <w:proofErr w:type="spellEnd"/>
+      <w:r>
+        <w:rPr>
+          <w:i/>
+          <w:iCs/>
+        </w:rPr>
+        <w:t xml:space="preserve"> </w:t>
+      </w:r>
+      <w:proofErr w:type="spellStart"/>
+      <w:r>
+        <w:rPr>
+          <w:i/>
+          <w:iCs/>
+        </w:rPr>
+        <w:t>thump</w:t>
+      </w:r>
+      <w:proofErr w:type="spellEnd"/>
+      <w:r>
+        <w:rPr>
+          <w:i/>
+          <w:iCs/>
+        </w:rPr>
+        <w:t xml:space="preserve"> </w:t>
+      </w:r>
+      <w:proofErr w:type="spellStart"/>
+      <w:r>
+        <w:rPr>
+          <w:i/>
+          <w:iCs/>
+        </w:rPr>
+        <w:t>thump</w:t>
+      </w:r>
+      <w:proofErr w:type="spellEnd"/>
+      <w:r>
+        <w:rPr>
+          <w:i/>
+          <w:iCs/>
+        </w:rPr>
+        <w:t xml:space="preserve"> </w:t>
+      </w:r>
+      <w:proofErr w:type="spellStart"/>
+      <w:r>
+        <w:rPr>
+          <w:i/>
+          <w:iCs/>
+        </w:rPr>
+        <w:t>thump</w:t>
+      </w:r>
+      <w:proofErr w:type="spellEnd"/>
+      <w:r>
+        <w:rPr>
+          <w:i/>
+          <w:iCs/>
+        </w:rPr>
+        <w:t>.</w:t>
+      </w:r>
+    </w:p>
+    <w:p>
+      <w:r>
+        <w:lastRenderedPageBreak/>
+        <w:t>J’expire plusieurs fois, bruyamment, avant de m’écarter du mur. Mes larmes, que je ne devrais pas laisser couler maintenant, débordent et tombent sans s’arrêter. Je me couvre la bouche pour étouffer mes sanglots.</w:t>
+      </w:r>
+    </w:p>
+    <w:p>
+      <w:r>
+        <w:t>Quand je l’ai vue sortir des toilettes avec cette gamine, je croyais avoir touché le fond. Mais la voir l’embrasser comme ça, c’est cent fois pire. Ce que je vois me fait mal, et je ne peux rien faire d’autre que pleurer.</w:t>
+      </w:r>
+    </w:p>
+    <w:p>
+      <w:r>
+        <w:t>« </w:t>
+      </w:r>
+      <w:r>
+        <w:rPr>
+          <w:i/>
+          <w:iCs/>
+        </w:rPr>
+        <w:t>Hic</w:t>
+      </w:r>
+      <w:r>
+        <w:t>… »</w:t>
+      </w:r>
+    </w:p>
+    <w:p>
+      <w:r>
+        <w:t>Je vais m’asseoir dans un coin, le plus loin possible d’elles. J’entends leurs voix, mais je ne cherche plus à comprendre.</w:t>
+      </w:r>
+      <w:r>
+        <w:br/>
+        <w:t>Ce que j’ai vu me force à me demander si je dois encore espérer. Dois-je rester et supporter, ou fuir ? Mais dès que je pense à fuir, mes larmes redoublent. La réponse est claire : fuir ferait peut-être plus mal que rester.</w:t>
+      </w:r>
+    </w:p>
+    <w:p>
+      <w:r>
+        <w:t>Je me sens trop faible. Trop faible pour m’en aller.</w:t>
+      </w:r>
+    </w:p>
+    <w:p>
+      <w:r>
+        <w:t>Un long moment après, la porte s’ouvre et se referme. Je suis seule. Si Bel était là, elle m’aurait déjà jetée dehors.</w:t>
+      </w:r>
+    </w:p>
+    <w:p>
+      <w:r>
+        <w:t>Rester ne sert à rien.</w:t>
+      </w:r>
+    </w:p>
+    <w:p>
+      <w:r>
+        <w:t>J’essuie mes larmes d’un revers de main, vais chercher mon sac en papier, en tremblant. Mes yeux pleurent encore, mais il faut que je me change. Je me sens si mal que je n’ai même pas envie de bouger. Si je pouvais disparaître, je serais chez moi, sur mon lit, immobile, à espérer que l’immobilité apaise la douleur.</w:t>
+      </w:r>
+    </w:p>
+    <w:p>
+      <w:r>
+        <w:t>Je sors la montre au cadran fêlé de ma poche. La montre qui devait servir de prétexte pour la voir. C’est fini. Je la pose sur la table, près du canapé, avec la rose. Je cherche un stylo et un papier, pour laisser un mot. Mon dernier message avant de fuir pour me ressaisir.</w:t>
+      </w:r>
+    </w:p>
+    <w:p>
+      <w:r>
+        <w:t>Encore une fois, ce que je voulais lui dire de vive voix, je dois l’écrire. Parce que je suis trop faible pour attendre qu’elle revienne, pour parler sans pleurer. Je me déteste pour ça, mais je suis bien plus vulnérable que je ne le pensais. Tellement que je n’arrive même pas à gérer mes propres émotions.</w:t>
+      </w:r>
+    </w:p>
+    <w:p>
+      <w:r>
+        <w:t>‘Cette montre t’appartient toujours, Bel. Si tu veux donner une dernière chance à Ben, porte-</w:t>
+      </w:r>
+      <w:proofErr w:type="spellStart"/>
+      <w:r>
+        <w:t>la.</w:t>
+      </w:r>
+      <w:proofErr w:type="spellEnd"/>
+    </w:p>
+    <w:p>
+      <w:r>
+        <w:t>Mais si ce que Ben te demande est trop, tu peux la jeter.</w:t>
+      </w:r>
+      <w:r>
+        <w:br/>
+        <w:t>Ben ne la gardera pas non plus.</w:t>
+      </w:r>
+      <w:r>
+        <w:br/>
+        <w:t>Cette fois, Ben ne reviendra pas avant un moment. Mais un jour, elle reviendra voir si tu as gardé cette montre.</w:t>
+      </w:r>
+    </w:p>
+    <w:p>
+      <w:r>
+        <w:t>Et à ce moment-là, Ben saura si elle doit oublier Bel, ou si on peut être à nouveau ensemble :)</w:t>
+      </w:r>
+    </w:p>
+    <w:p>
+      <w:r>
+        <w:lastRenderedPageBreak/>
+        <w:t>Ben pense à toi.’</w:t>
+      </w:r>
+    </w:p>
+    <w:p>
+      <w:r>
+        <w:t>.</w:t>
+      </w:r>
+    </w:p>
+    <w:p>
+      <w:r>
+        <w:t>.</w:t>
+      </w:r>
+    </w:p>
+    <w:p>
+      <w:r>
+        <w:t>J’ai dessiné un petit sourire, mais mes larmes coulent. Je les essuie pour qu’elles ne tombent pas sur le papier.</w:t>
+      </w:r>
+    </w:p>
+    <w:p>
+      <w:proofErr w:type="spellStart"/>
+      <w:r>
+        <w:rPr>
+          <w:i/>
+          <w:iCs/>
+        </w:rPr>
+        <w:t>Criiit</w:t>
+      </w:r>
+      <w:proofErr w:type="spellEnd"/>
+    </w:p>
+    <w:p>
+      <w:r>
+        <w:t>« Allô… »</w:t>
+      </w:r>
+    </w:p>
+    <w:p>
+      <w:r>
+        <w:t>(</w:t>
+      </w:r>
+      <w:r>
+        <w:rPr>
+          <w:i/>
+          <w:iCs/>
+        </w:rPr>
+        <w:t>Ta doctoresse a disparu avec la gamine, je ne sais pas où elles sont. Et toi, t’es où ? Pourquoi tu les as laissées descendre ?</w:t>
+      </w:r>
+      <w:r>
+        <w:t>)</w:t>
+      </w:r>
+    </w:p>
+    <w:p>
+      <w:r>
+        <w:t xml:space="preserve">« </w:t>
+      </w:r>
+      <w:proofErr w:type="spellStart"/>
+      <w:r>
+        <w:t>P’Wi</w:t>
+      </w:r>
+      <w:proofErr w:type="spellEnd"/>
+      <w:r>
+        <w:t>… </w:t>
+      </w:r>
+      <w:r>
+        <w:rPr>
+          <w:i/>
+          <w:iCs/>
+        </w:rPr>
+        <w:t>hic</w:t>
+      </w:r>
+      <w:r>
+        <w:t> »</w:t>
+      </w:r>
+    </w:p>
+    <w:p>
+      <w:r>
+        <w:t>(</w:t>
+      </w:r>
+      <w:r>
+        <w:rPr>
+          <w:i/>
+          <w:iCs/>
+        </w:rPr>
+        <w:t>Tu pleures, Ben ?</w:t>
+      </w:r>
+      <w:r>
+        <w:t>)</w:t>
+      </w:r>
+    </w:p>
+    <w:p>
+      <w:r>
+        <w:t>« Oui… » Je ne réponds que ça, prends mon sac, mets ma casquette et mes lunettes noires, même s’il fait noir.</w:t>
+      </w:r>
+    </w:p>
+    <w:p>
+      <w:proofErr w:type="spellStart"/>
+      <w:r>
+        <w:t>P’Wi</w:t>
+      </w:r>
+      <w:proofErr w:type="spellEnd"/>
+      <w:r>
+        <w:t xml:space="preserve"> m’attend devant l’immeuble. Il me couvre les épaules avec un manteau, m’ouvre la portière sans poser de question.</w:t>
+      </w:r>
+    </w:p>
+    <w:p>
+      <w:r>
+        <w:t>« Tu ne demandes rien ? </w:t>
+      </w:r>
+      <w:r>
+        <w:rPr>
+          <w:i/>
+          <w:iCs/>
+        </w:rPr>
+        <w:t>hic</w:t>
+      </w:r>
+      <w:r>
+        <w:t>… »</w:t>
+      </w:r>
+    </w:p>
+    <w:p>
+      <w:r>
+        <w:t>« Tu raconteras quand tu voudras. »</w:t>
+      </w:r>
+    </w:p>
+    <w:p>
+      <w:r>
+        <w:t>« Celle qui est descendue avec Bel, c’est celle dont je t’ai parlé. »</w:t>
+      </w:r>
+    </w:p>
+    <w:p>
+      <w:r>
+        <w:t>« Je vois. À ce point mignonne, tu as raison d’avoir peur. »</w:t>
+      </w:r>
+    </w:p>
+    <w:p>
+      <w:r>
+        <w:t>« </w:t>
+      </w:r>
+      <w:proofErr w:type="spellStart"/>
+      <w:r>
+        <w:rPr>
+          <w:i/>
+          <w:iCs/>
+        </w:rPr>
+        <w:t>Hiiin</w:t>
+      </w:r>
+      <w:proofErr w:type="spellEnd"/>
+      <w:r>
+        <w:t>… Ben est tellement plus belle ! »</w:t>
+      </w:r>
+    </w:p>
+    <w:p>
+      <w:r>
+        <w:t>« Oui, oui, t’es plus belle. Ça va ? » Il pose sa main sur ma tête, je secoue la tête.</w:t>
+      </w:r>
+    </w:p>
+    <w:p>
+      <w:r>
+        <w:t>« On dirait que ce pyjama n’aura servi à rien. » Je le regarde. « Tu vas pleurer toute la nuit. »</w:t>
+      </w:r>
+    </w:p>
+    <w:p>
+      <w:r>
+        <w:t>« </w:t>
+      </w:r>
+      <w:proofErr w:type="spellStart"/>
+      <w:r>
+        <w:rPr>
+          <w:i/>
+          <w:iCs/>
+        </w:rPr>
+        <w:t>Hiiin</w:t>
+      </w:r>
+      <w:proofErr w:type="spellEnd"/>
+      <w:r>
+        <w:t>… Va brûler cette tenue ! »</w:t>
+      </w:r>
+    </w:p>
+    <w:p>
+      <w:r>
+        <w:t>« Oui, oui… » Il plaisante, mais je sais à quel point il tient à moi. Pourquoi Bel, elle, n’a jamais d’attention pour moi ? Ou alors, parce que moi non plus, je n’ai jamais pensé à ce qu’elle ressentait. Je ne valais pas mieux, à l’époque. J’ai été aussi cruelle avec elle qu’elle l’est avec moi aujourd’hui.</w:t>
+      </w:r>
+    </w:p>
+    <w:p>
+      <w:r>
+        <w:t>Après ce jour, deux mois sont passés. Je ne suis pas retournée la voir, et tant mieux, elle n’a pas cherché à me contacter. Hm. J’avais pourtant dit que je viendrais voir si elle avait remis la montre, mais je n’ai jamais trouvé le bon moment. Non, ce n’est pas une question de moment. J’attends simplement d’aller mieux.</w:t>
+      </w:r>
+    </w:p>
+    <w:p>
+      <w:r>
+        <w:lastRenderedPageBreak/>
+        <w:t>« À quoi tu penses, toute seule ? Va chanter. » Vich s’assoit à côté de moi, me montrant la scène où le réalisateur et la maquilleuse chantent, joyeux.</w:t>
+      </w:r>
+    </w:p>
+    <w:p>
+      <w:r>
+        <w:t>Aujourd’hui, jour aussi ennuyeux que les autres, c’est la fin du tournage du feuilleton avec Vich. Presque tout le monde est à la fête, sauf ceux qui sont en déplacement.</w:t>
+      </w:r>
+    </w:p>
+    <w:p>
+      <w:r>
+        <w:t>Je sirote ma bière, fais un signe à mon ami qui bouge la tête en rythme.</w:t>
+      </w:r>
+    </w:p>
+    <w:p>
+      <w:r>
+        <w:t>« Arrête de faire ta déprimée. Va chanter, les caméras de la chaîne sont là. »</w:t>
+      </w:r>
+    </w:p>
+    <w:p>
+      <w:r>
+        <w:t>« Maintenant ? »</w:t>
+      </w:r>
+    </w:p>
+    <w:p>
+      <w:r>
+        <w:t>« Oui, regarde. » Il montre une fille familière, souvent aperçue après le journal télévisé. Instinctivement, mon sourire, absent de la journée, réapparaît. Le mot « actrice » et « jeu d’actrice » me forcent à sourire encore.</w:t>
+      </w:r>
+    </w:p>
+    <w:p>
+      <w:r>
+        <w:t>Toute fête a une fin. C’est ce qu’on dit souvent, et celle-ci n’y échappe pas, même si je ne l’ai pas trouvée amusante.</w:t>
+      </w:r>
+    </w:p>
+    <w:p>
+      <w:proofErr w:type="spellStart"/>
+      <w:r>
+        <w:rPr>
+          <w:i/>
+          <w:iCs/>
+        </w:rPr>
+        <w:t>Criiit</w:t>
+      </w:r>
+      <w:proofErr w:type="spellEnd"/>
+    </w:p>
+    <w:p>
+      <w:r>
+        <w:t>« Allô… »</w:t>
+      </w:r>
+    </w:p>
+    <w:p>
+      <w:r>
+        <w:t>(</w:t>
+      </w:r>
+      <w:r>
+        <w:rPr>
+          <w:i/>
+          <w:iCs/>
+        </w:rPr>
+        <w:t>Tu es où ? Tu as bu ?</w:t>
+      </w:r>
+      <w:r>
+        <w:t>)</w:t>
+      </w:r>
+    </w:p>
+    <w:p>
+      <w:r>
+        <w:t>« Un peu. »</w:t>
+      </w:r>
+    </w:p>
+    <w:p>
+      <w:r>
+        <w:t>(</w:t>
+      </w:r>
+      <w:r>
+        <w:rPr>
+          <w:i/>
+          <w:iCs/>
+        </w:rPr>
+        <w:t>Tu peux rentrer toute seule ?</w:t>
+      </w:r>
+      <w:r>
+        <w:t>)</w:t>
+      </w:r>
+    </w:p>
+    <w:p>
+      <w:r>
+        <w:t xml:space="preserve">« Oui. Va te coucher, </w:t>
+      </w:r>
+      <w:proofErr w:type="spellStart"/>
+      <w:r>
+        <w:t>P’Wi</w:t>
+      </w:r>
+      <w:proofErr w:type="spellEnd"/>
+      <w:r>
+        <w:t>. »</w:t>
+      </w:r>
+    </w:p>
+    <w:p>
+      <w:r>
+        <w:t>(</w:t>
+      </w:r>
+      <w:r>
+        <w:rPr>
+          <w:i/>
+          <w:iCs/>
+        </w:rPr>
+        <w:t>OK. Demain, je passerai avec à manger. T’es en repos, dors plus tard, ne sois pas à t’ennuyer dès le matin, compris ?</w:t>
+      </w:r>
+      <w:r>
+        <w:t>)</w:t>
+      </w:r>
+    </w:p>
+    <w:p>
+      <w:r>
+        <w:t>« Oui, oui, d’accord. » Je raccroche, remonte dans ma voiture garée non loin.</w:t>
+      </w:r>
+    </w:p>
+    <w:p>
+      <w:r>
+        <w:t>Pendant ces deux mois, je n’ai pensé qu’à elle. À force d’y penser, en conduisant, l’alcool aidant, je me suis retrouvée là où je n’aurais pas dû : devant son immeuble.</w:t>
+      </w:r>
+    </w:p>
+    <w:p>
+      <w:r>
+        <w:t>« Putain… » Je m’insulte moi-même quand mon esprit revient un peu. Ce n’est pas chez moi, je ne devrais pas être là. Mais on fait toujours des conneries quand on a moins de cent pour cent de ses facultés.</w:t>
+      </w:r>
+    </w:p>
+    <w:p>
+      <w:r>
+        <w:t>J’entre dans l’immeuble, la même casquette, j’attends que quelqu’un sorte. Il est presque une heure du matin, mais certains ont faim. Je prends l’ascenseur.</w:t>
+      </w:r>
+    </w:p>
+    <w:p>
+      <w:r>
+        <w:t>Devant sa porte, je laisse mes peurs, mes hésitations, et je compose le code.</w:t>
+      </w:r>
+    </w:p>
+    <w:p>
+      <w:r>
+        <w:t>Incroyable. Deux mois ont passé, elle n’a pas changé le code qu’elle sait que j’ai utilisé.</w:t>
+      </w:r>
+    </w:p>
+    <w:p>
+      <w:r>
+        <w:rPr>
+          <w:i/>
+          <w:iCs/>
+        </w:rPr>
+        <w:t>Bip. – Clac !</w:t>
+      </w:r>
+    </w:p>
+    <w:p>
+      <w:r>
+        <w:lastRenderedPageBreak/>
+        <w:t>Son appartement est vide. Je m’attends à la trouver. Non. Je suis seule. Je marche, je m’assois par terre, près de son lit. Je respecte au moins l’interdiction de froisser ses draps.</w:t>
+      </w:r>
+    </w:p>
+    <w:p>
+      <w:r>
+        <w:t>« Où elle est ? »</w:t>
+      </w:r>
+    </w:p>
+    <w:p>
+      <w:r>
+        <w:t>C’était la dernière phrase audible de la soirée. Je l’attends plus d’une heure, il est deux heures et demie du matin, elle n’est toujours pas rentrée.</w:t>
+      </w:r>
+    </w:p>
+    <w:p>
+      <w:r>
+        <w:t>Je me lève, décidée à partir quand la porte s’ouvre.</w:t>
+      </w:r>
+    </w:p>
+    <w:p>
+      <w:r>
+        <w:rPr>
+          <w:i/>
+          <w:iCs/>
+        </w:rPr>
+        <w:t>Bip. – Clac !</w:t>
+      </w:r>
+    </w:p>
+    <w:p>
+      <w:proofErr w:type="spellStart"/>
+      <w:r>
+        <w:rPr>
+          <w:i/>
+          <w:iCs/>
+        </w:rPr>
+        <w:t>Thump</w:t>
+      </w:r>
+      <w:proofErr w:type="spellEnd"/>
+      <w:r>
+        <w:rPr>
+          <w:i/>
+          <w:iCs/>
+        </w:rPr>
+        <w:t xml:space="preserve"> </w:t>
+      </w:r>
+      <w:proofErr w:type="spellStart"/>
+      <w:r>
+        <w:rPr>
+          <w:i/>
+          <w:iCs/>
+        </w:rPr>
+        <w:t>thump</w:t>
+      </w:r>
+      <w:proofErr w:type="spellEnd"/>
+      <w:r>
+        <w:rPr>
+          <w:i/>
+          <w:iCs/>
+        </w:rPr>
+        <w:t xml:space="preserve"> </w:t>
+      </w:r>
+      <w:proofErr w:type="spellStart"/>
+      <w:r>
+        <w:rPr>
+          <w:i/>
+          <w:iCs/>
+        </w:rPr>
+        <w:t>thump</w:t>
+      </w:r>
+      <w:proofErr w:type="spellEnd"/>
+      <w:r>
+        <w:rPr>
+          <w:i/>
+          <w:iCs/>
+        </w:rPr>
+        <w:t xml:space="preserve"> </w:t>
+      </w:r>
+      <w:proofErr w:type="spellStart"/>
+      <w:r>
+        <w:rPr>
+          <w:i/>
+          <w:iCs/>
+        </w:rPr>
+        <w:t>thump</w:t>
+      </w:r>
+      <w:proofErr w:type="spellEnd"/>
+      <w:r>
+        <w:rPr>
+          <w:i/>
+          <w:iCs/>
+        </w:rPr>
+        <w:t>.</w:t>
+      </w:r>
+    </w:p>
+    <w:p>
+      <w:r>
+        <w:t>Je n’avais pas peur en entrant, mais là, je me cache dans la salle de bain. </w:t>
+      </w:r>
+      <w:proofErr w:type="spellStart"/>
+      <w:r>
+        <w:rPr>
+          <w:i/>
+          <w:iCs/>
+        </w:rPr>
+        <w:t>Heuh</w:t>
+      </w:r>
+      <w:proofErr w:type="spellEnd"/>
+      <w:r>
+        <w:t>, l’être humain est contradictoire.</w:t>
+      </w:r>
+    </w:p>
+    <w:p>
+      <w:r>
+        <w:t>Derrière le mur, je regarde discrètement : elle cherche quelque chose près de son lit.</w:t>
+      </w:r>
+    </w:p>
+    <w:p>
+      <w:proofErr w:type="spellStart"/>
+      <w:r>
+        <w:rPr>
+          <w:i/>
+          <w:iCs/>
+        </w:rPr>
+        <w:t>Thump</w:t>
+      </w:r>
+      <w:proofErr w:type="spellEnd"/>
+      <w:r>
+        <w:rPr>
+          <w:i/>
+          <w:iCs/>
+        </w:rPr>
+        <w:t xml:space="preserve"> </w:t>
+      </w:r>
+      <w:proofErr w:type="spellStart"/>
+      <w:r>
+        <w:rPr>
+          <w:i/>
+          <w:iCs/>
+        </w:rPr>
+        <w:t>thump</w:t>
+      </w:r>
+      <w:proofErr w:type="spellEnd"/>
+      <w:r>
+        <w:rPr>
+          <w:i/>
+          <w:iCs/>
+        </w:rPr>
+        <w:t xml:space="preserve">. </w:t>
+      </w:r>
+      <w:proofErr w:type="spellStart"/>
+      <w:r>
+        <w:rPr>
+          <w:i/>
+          <w:iCs/>
+        </w:rPr>
+        <w:t>Thump</w:t>
+      </w:r>
+      <w:proofErr w:type="spellEnd"/>
+      <w:r>
+        <w:rPr>
+          <w:i/>
+          <w:iCs/>
+        </w:rPr>
+        <w:t xml:space="preserve"> </w:t>
+      </w:r>
+      <w:proofErr w:type="spellStart"/>
+      <w:r>
+        <w:rPr>
+          <w:i/>
+          <w:iCs/>
+        </w:rPr>
+        <w:t>thump</w:t>
+      </w:r>
+      <w:proofErr w:type="spellEnd"/>
+      <w:r>
+        <w:rPr>
+          <w:i/>
+          <w:iCs/>
+        </w:rPr>
+        <w:t>.</w:t>
+      </w:r>
+    </w:p>
+    <w:p>
+      <w:r>
+        <w:t>C’est nos affaires.</w:t>
+      </w:r>
+    </w:p>
+    <w:p>
+      <w:r>
+        <w:t>Je regarde les photos, les billets de cinéma, le bracelet, la montre, la rose… tout ce que j’ai laissé. Mon cœur s’emballe. Elle ne les a pas jetés. La montre que j’espérais la voir porter est toujours là.</w:t>
+      </w:r>
+    </w:p>
+    <w:p>
+      <w:r>
+        <w:t>Elle les regarde longtemps, puis sa petite main caresse doucement la montre.</w:t>
+      </w:r>
+    </w:p>
+    <w:p>
+      <w:r>
+        <w:t>« Je ne sais même pas pourquoi tu m’as fait ça… Ben. »</w:t>
+      </w:r>
+    </w:p>
+    <w:p>
+      <w:r>
+        <w:t>Soudain, mon nom sort de ses belles lèvres. C’est à la fois bien et mal, car elle se couvre le visage et se met à pleurer.</w:t>
+      </w:r>
+    </w:p>
+    <w:p>
+      <w:r>
+        <w:t>Alors, ma patience s’envole. Je sors, la prends dans mes bras par-derrière, et je pleure autant qu’elle.</w:t>
+      </w:r>
+    </w:p>
+    <w:p>
+      <w:r>
+        <w:t>« Pardonne-moi. »</w:t>
+      </w:r>
+    </w:p>
+    <w:p>
+      <w:r>
+        <w:t>« Ben ! » À sa voix, elle est surprise. Mais je m’en fiche. Si elle pleure à cause de moi, c’est qu’au fond, elle ne m’a pas oubliée, pas plus que je ne l’ai oubliée.</w:t>
+      </w:r>
+    </w:p>
+    <w:p>
+      <w:r>
+        <w:t>« Comment es-tu entrée ? Depuis quand es-tu là ? »</w:t>
+      </w:r>
+    </w:p>
+    <w:p>
+      <w:r>
+        <w:t>« Et toi, pourquoi tu n’as pas changé le code, alors que tu sais que Ben pourrait entrer à tout moment ? »</w:t>
+      </w:r>
+    </w:p>
+    <w:p>
+      <w:r>
+        <w:t>« … »</w:t>
+      </w:r>
+    </w:p>
+    <w:p>
+      <w:r>
+        <w:t>« Tu m’aimes encore, n’est-ce pas ? » Je me détache un peu, la force à me regarder.</w:t>
+      </w:r>
+    </w:p>
+    <w:p>
+      <w:r>
+        <w:lastRenderedPageBreak/>
+        <w:t>« Tu n’y peux rien, Bel. Tu ne sais pas ce que je ressens, mais moi, je sais ce que je ressens… » Je caresse sa joue, essuie ses larmes. Elle pleure encore, mais elle est toujours aussi belle.</w:t>
+      </w:r>
+    </w:p>
+    <w:p>
+      <w:r>
+        <w:t>« Ben te fait encore pleurer, n’est-ce pas ? »</w:t>
+      </w:r>
+    </w:p>
+    <w:p>
+      <w:r>
+        <w:t>Je l’embrasse sur l’autre joue. Elle ne proteste pas.</w:t>
+      </w:r>
+      <w:r>
+        <w:br/>
+        <w:t>Mes lèvres glissent sur sa peau, s’arrêtent au coin de sa bouche. Son parfum familier me fait plonger mon regard dans le sien.</w:t>
+      </w:r>
+    </w:p>
+    <w:p>
+      <w:r>
+        <w:t>« Tu as bu ? »</w:t>
+      </w:r>
+    </w:p>
+    <w:p>
+      <w:r>
+        <w:t>« Oui. »</w:t>
+      </w:r>
+    </w:p>
+    <w:p>
+      <w:r>
+        <w:t>« Avec qui ? »</w:t>
+      </w:r>
+    </w:p>
+    <w:p>
+      <w:r>
+        <w:t>« Avec des amis… et Rin. » Je ne sais pourquoi elle a sorti son nom, mais ça m’énerve. Je me rapproche.</w:t>
+      </w:r>
+    </w:p>
+    <w:p>
+      <w:r>
+        <w:t>« Pas bien… » Et j’écrase ma bouche contre les siennes, comme pour la punir.</w:t>
+      </w:r>
+    </w:p>
+    <w:p>
+      <w:r>
+        <w:t>Elle lève la tête, les bras m’enlacent doucement. On s’embrasse lentement, comme si on avait des heures devant nous.</w:t>
+      </w:r>
+    </w:p>
+    <w:p>
+      <w:r>
+        <w:t>« Mmm… » Sa voix, sa gorge, me fait chavirer, réveille mon désir.</w:t>
+      </w:r>
+    </w:p>
+    <w:p>
+      <w:r>
+        <w:t>Je l’allonge par terre, comme si une seconde d’interruption suffirait à la faire fuir.</w:t>
+      </w:r>
+    </w:p>
+    <w:p>
+      <w:r>
+        <w:t>« Ben… »</w:t>
+      </w:r>
+    </w:p>
+    <w:p>
+      <w:r>
+        <w:t>« Oui… » Je n’ose imaginer à quel point je suis câline et suppliante. Mais ce seul mot la fait taire. Elle s’allonge, les joues rouges, se couvre le visage.</w:t>
+      </w:r>
+    </w:p>
+    <w:p>
+      <w:r>
+        <w:t>Mes lèvres descendent sur son cou. Ma main caresse sa cuisse, comme si ce corps m’avait manqué.</w:t>
+      </w:r>
+    </w:p>
+    <w:p>
+      <w:r>
+        <w:t>« Tu sens bon… » Je ne sais même pas si j’ai parlé tout haut. Elle bouge, fuit un peu. Je m’attaque à son chemisier blanc.</w:t>
+      </w:r>
+    </w:p>
+    <w:p>
+      <w:r>
+        <w:t>Quand je lève les yeux sur son corps affalé par terre, mon cœur, déjà emballé, s’emballe encore plus. Les images de ce corps, je les ai imaginées mille fois. Mais le voir en vrai, c’est cent fois plus excitant. J’ai envie de la dévorer, pour que personne d’autre ne la voie.</w:t>
+      </w:r>
+    </w:p>
+    <w:p>
+      <w:r>
+        <w:t>Cette idée en tête, mes mains obéissent. Je déboutonne son chemisier, j’embrasse sa poitrine sous son joli soutien-gorge. Ma bouche ne quitte pas sa peau. Elle se tortille, supplie, ce qui m’excite davantage. Mes lèvres descendent plus bas…</w:t>
+      </w:r>
+    </w:p>
+    <w:p>
+      <w:r>
+        <w:t>« Ben… » Un seul mot, et je redouble d’ardeur. Je l’embrasse fort sur son ventre qui se contracte, puis plus bas, sous sa jupe.</w:t>
+      </w:r>
+    </w:p>
+    <w:p>
+      <w:r>
+        <w:t>Ma main glisse sous sa jupe. Mais au moment d’explorer, elle arrête ma main.</w:t>
+      </w:r>
+    </w:p>
+    <w:p>
+      <w:r>
+        <w:lastRenderedPageBreak/>
+        <w:t>« Tu vas me quitter ? » Sa voix douce me fait trembler. Je lève les yeux vers elle.</w:t>
+      </w:r>
+    </w:p>
+    <w:p>
+      <w:r>
+        <w:t>« Ben ne te quittera pas. »</w:t>
+      </w:r>
+    </w:p>
+    <w:p>
+      <w:r>
+        <w:t>« Tu peux le jurer ? »</w:t>
+      </w:r>
+    </w:p>
+    <w:p>
+      <w:r>
+        <w:t>« Je te le jure. » Et comme si mes paroles la libéraient, elle me lâche la main, et la pose sur son visage.</w:t>
+      </w:r>
+    </w:p>
+    <w:p>
+      <w:r>
+        <w:t>« Tu as besoin de Ben ? … » Je l’embrasse encore plus bas. Elle se tortille, mais reste silencieuse, ne me supplie pas d’aller plus loin.</w:t>
+      </w:r>
+    </w:p>
+    <w:p>
+      <w:r>
+        <w:t>« Si tu ne dis rien, Ben va te rendre folle. »</w:t>
+      </w:r>
+    </w:p>
+    <w:p>
+      <w:r>
+        <w:t>Et ma menace fonctionne. Elle baisse la tête vers moi, les joues roses. Je ne crois pas que ce soit l’alcool, c’est moi qui la mets dans cet état.</w:t>
+      </w:r>
+    </w:p>
+    <w:p>
+      <w:r>
+        <w:t>« Dis-le… » Ma main remonte plus haut. Elle serre les jambes, mais je les écarte.</w:t>
+      </w:r>
+    </w:p>
+    <w:p>
+      <w:r>
+        <w:t xml:space="preserve">« … » Elle me regarde, hésitante. Je la regarde pour la rassurer : tout va bien, rien à craindre. On a toutes </w:t>
+      </w:r>
+      <w:r>
+        <w:t>les deux envies</w:t>
+      </w:r>
+      <w:r>
+        <w:t xml:space="preserve"> l’une de l’autre.</w:t>
+      </w:r>
+    </w:p>
+    <w:p>
+      <w:r>
+        <w:t>« Bel a besoin de Ben… »</w:t>
+      </w:r>
+    </w:p>
+    <w:p/>
+    <w:p/>
+    <w:p/>
+    <w:p/>
+    <w:p/>
+    <w:p/>
+    <w:p/>
+    <w:p/>
+    <w:p/>
+    <w:p/>
+    <w:p/>
+    <w:p/>
+    <w:p/>
+    <w:p/>
+    <w:p/>
+    <w:p>
+      <w:pPr>
+        <w:rPr>
+          <w:b/>
+          <w:bCs/>
+          <w:sz w:val="40"/>
+          <w:szCs w:val="40"/>
+        </w:rPr>
+      </w:pPr>
+      <w:r>
+        <w:rPr>
+          <w:b/>
+          <w:bCs/>
+          <w:sz w:val="40"/>
+          <w:szCs w:val="40"/>
+        </w:rPr>
+        <w:lastRenderedPageBreak/>
+        <w:t>Chapitre 23</w:t>
+      </w:r>
+    </w:p>
+    <w:p>
+      <w:pPr>
+        <w:rPr>
+          <w:b/>
+          <w:bCs/>
+          <w:sz w:val="40"/>
+          <w:szCs w:val="40"/>
+        </w:rPr>
+      </w:pPr>
+    </w:p>
+    <w:p>
+      <w:pPr>
+        <w:rPr>
+          <w:b/>
+          <w:bCs/>
+          <w:sz w:val="40"/>
+          <w:szCs w:val="40"/>
+        </w:rPr>
+      </w:pPr>
+    </w:p>
+    <w:p>
+      <w:r>
+        <w:t>« Ah... »</w:t>
+      </w:r>
+    </w:p>
+    <w:p>
+      <w:r>
+        <w:t>Je regarde le beau corps de la doctoresse, assise sur mes genoux. Son expression, son visage, chaque fois que je le vois, attise mon désir. Bel est si belle que je ne peux pas détourner le regard.</w:t>
+      </w:r>
+      <w:r>
+        <w:br/>
+        <w:t>Même si ça l’embête, qu’elle essaie de me couvrir les yeux, je repousse sa main. J’aime la regarder. Bel est tellement sexy que je ne peux imaginer personne d’autre me donner autant envie de la regarder.</w:t>
+      </w:r>
+    </w:p>
+    <w:p>
+      <w:r>
+        <w:t>« Tu veux que Ben t’aide</w:t>
+      </w:r>
+      <w:proofErr w:type="gramStart"/>
+      <w:r>
+        <w:t xml:space="preserve"> ?…</w:t>
+      </w:r>
+      <w:proofErr w:type="gramEnd"/>
+      <w:r>
+        <w:t xml:space="preserve"> » Je bouge lentement mes doigts en elle, pour qu’elle sache que mon aide la rendra plus heureuse que si elle se débattait seule.</w:t>
+      </w:r>
+    </w:p>
+    <w:p>
+      <w:r>
+        <w:t>« Mmm… a… aide-moi, Bel. » Sa voix hachée me fait comprendre que la faire reposer après cette première fois serait impossible. Son ton m’excite encore plus, me donne envie de l’aimer davantage. Je crois que je suis en train de redevenir accro à elle.</w:t>
+      </w:r>
+    </w:p>
+    <w:p>
+      <w:r>
+        <w:t>« Bel est si belle… » Je la complimente pour la énième fois, puis j’accélère, comme elle me l’a demandé.</w:t>
+      </w:r>
+    </w:p>
+    <w:p>
+      <w:r>
+        <w:t>C’est indescriptible.</w:t>
+      </w:r>
+      <w:r>
+        <w:br/>
+        <w:t>Je la touche comme j’en ai rêvé si longtemps.</w:t>
+      </w:r>
+      <w:r>
+        <w:br/>
+        <w:t>Et je suis en elle…</w:t>
+      </w:r>
+    </w:p>
+    <w:p>
+      <w:r>
+        <w:t>Autrefois, quand on se touchait, je me demandais souvent si ce n’était pas un rêve. Si j’étais ivre. J’avais tellement peur que ce ne soit qu’un rêve que je n’osais pas fermer les yeux.</w:t>
+      </w:r>
+    </w:p>
+    <w:p>
+      <w:r>
+        <w:t>Et celle qui me caressait la joue devait penser la même chose. J’espère juste que Bel veut aussi que ce ne soit pas qu’un rêve.</w:t>
+      </w:r>
+    </w:p>
+    <w:p>
+      <w:r>
+        <w:t>« Pourquoi tu m’as fait ça ? »</w:t>
+      </w:r>
+    </w:p>
+    <w:p>
+      <w:r>
+        <w:t>« Parce que Ben t’aime. »</w:t>
+      </w:r>
+    </w:p>
+    <w:p>
+      <w:r>
+        <w:t>« Pas ça… » Elle détourne la tête, gênée. Elle a compris ce que je voulais dire.</w:t>
+      </w:r>
+    </w:p>
+    <w:p>
+      <w:r>
+        <w:t>« Quoi, alors ? »</w:t>
+      </w:r>
+    </w:p>
+    <w:p>
+      <w:r>
+        <w:t xml:space="preserve">« L’année dernière. Pourquoi tu as fait ça </w:t>
+      </w:r>
+      <w:proofErr w:type="gramStart"/>
+      <w:r>
+        <w:t>…</w:t>
+      </w:r>
+      <w:r>
+        <w:t>?</w:t>
+      </w:r>
+      <w:proofErr w:type="gramEnd"/>
+      <w:r>
+        <w:t xml:space="preserve"> » Elle me regarde à nouveau. Il y a de la tristesse dans ses yeux. Je lui prends les mains.</w:t>
+      </w:r>
+    </w:p>
+    <w:p>
+      <w:r>
+        <w:lastRenderedPageBreak/>
+        <w:t>« Tu peux me laisser un peu de temps ? Dans trois mois, Ben t’expliquera. » Je la serre dans mes bras, peur qu’elle ne fuie si je ne lui dis pas tout.</w:t>
+      </w:r>
+    </w:p>
+    <w:p>
+      <w:r>
+        <w:t>« Quand ce sera le moment, Ben acceptera ta décision. Mais en attendant, reste avec moi, Bel. Ben ne veut pas te perdre… »</w:t>
+      </w:r>
+    </w:p>
+    <w:p>
+      <w:r>
+        <w:t>« Pourquoi tu ne peux pas me le dire maintenant ? »</w:t>
+      </w:r>
+    </w:p>
+    <w:p>
+      <w:r>
+        <w:t>« … »</w:t>
+      </w:r>
+    </w:p>
+    <w:p>
+      <w:r>
+        <w:t>« Et si tu me quittes encore ? »</w:t>
+      </w:r>
+    </w:p>
+    <w:p>
+      <w:r>
+        <w:t>« Ça n’arrivera pas. Attends-moi… » Je l’embrasse doucement pour l’empêcher de poser d’autres questions. Et c’est étrange : dès que nos lèvres se touchent, le désir revient, plus fort.</w:t>
+      </w:r>
+    </w:p>
+    <w:p>
+      <w:r>
+        <w:t>« Tu ne vas pas dormir de la nuit, Bel. » Je la regarde. Ses yeux sont humides.</w:t>
+      </w:r>
+    </w:p>
+    <w:p>
+      <w:r>
+        <w:t>« Demain, Bel est en repos. »</w:t>
+      </w:r>
+    </w:p>
+    <w:p>
+      <w:r>
+        <w:t>« Ben aussi. » Ces mots font monter notre excitation. Je veux l’allonger pour mieux faire, mais elle résiste.</w:t>
+      </w:r>
+    </w:p>
+    <w:p>
+      <w:r>
+        <w:t>« Ce n’est pas</w:t>
+      </w:r>
+      <w:r>
+        <w:t xml:space="preserve"> juste. » Elle me pousse, m’allonge, puis s’assoit à califourchon sur moi.</w:t>
+      </w:r>
+    </w:p>
+    <w:p>
+      <w:r>
+        <w:t>« Pas juste, comment ? »</w:t>
+      </w:r>
+    </w:p>
+    <w:p>
+      <w:r>
+        <w:t>« Cette fois, c’est mon tour… » Elle se lèvre les lèvres d’un air malicieux. Mon cœur s’emballe. Cette douceur soudaine qui se transforme en audace…</w:t>
+      </w:r>
+    </w:p>
+    <w:p>
+      <w:r>
+        <w:t>« Ce n’est pas</w:t>
+      </w:r>
+      <w:r>
+        <w:t xml:space="preserve"> bien. »</w:t>
+      </w:r>
+    </w:p>
+    <w:p>
+      <w:r>
+        <w:t>« Pas bien, quoi ? »</w:t>
+      </w:r>
+    </w:p>
+    <w:p>
+      <w:r>
+        <w:t>« Quand tu fais cette tête, Ben a l’impression d’exploser. C’est trop sexy… » Je passe ma main sur sa poitrine. Elle est parfaitement offerte. J’ai envie de la faire jouir encore une fois, pour la punir de faire cette tête provocante.</w:t>
+      </w:r>
+    </w:p>
+    <w:p>
+      <w:r>
+        <w:t>Bel attrape mes deux poignets, les plaque de chaque côté de mon corps. Elle m’embrasse, doucement d’abord, puis plus fort. Son baiser est indescriptible. Et même si nos cœurs ne sont pas encore tout à fait réconciliés, il y a de fortes chances qu’elle me pardonne. Rien qu’à voir ses gestes, c’est évident.</w:t>
+      </w:r>
+    </w:p>
+    <w:p>
+      <w:r>
+        <w:t>Bel aussi m’aime…</w:t>
+      </w:r>
+    </w:p>
+    <w:p>
+      <w:r>
+        <w:t>« … » Le bruit léger de la climatisation me réveille. Mon corps est nu.</w:t>
+      </w:r>
+    </w:p>
+    <w:p>
+      <w:r>
+        <w:t>Onze heures passées.</w:t>
+      </w:r>
+      <w:r>
+        <w:br/>
+        <w:t xml:space="preserve">Je regarde autour, me lève, prends un t-shirt dans son placard. Pourquoi l’appartement est si </w:t>
+      </w:r>
+      <w:r>
+        <w:lastRenderedPageBreak/>
+        <w:t>silencieux ? En réalisant que je suis seule, un flot d’émotions m’envahit. Je prends mon téléphone pour l’appeler. Puis mon regard tombe sur un mot, près du lit.</w:t>
+      </w:r>
+    </w:p>
+    <w:p>
+      <w:r>
+        <w:t>‘Je sors acheter des trucs. Si tu as faim, sers-toi d’abord.’</w:t>
+      </w:r>
+    </w:p>
+    <w:p>
+      <w:r>
+        <w:t>« Ce n’était pas un rêve. » Je souris. Qui aurait cru que deux personnes qui s’étaient séparées si mal pouvaient se réconcilier ainsi ? Je ne sais si je dois remercier mes sentiments ou l’alcool qu’on a bu ensemble.</w:t>
+      </w:r>
+    </w:p>
+    <w:p>
+      <w:proofErr w:type="spellStart"/>
+      <w:r>
+        <w:rPr>
+          <w:i/>
+          <w:iCs/>
+        </w:rPr>
+        <w:t>Criiit</w:t>
+      </w:r>
+      <w:proofErr w:type="spellEnd"/>
+    </w:p>
+    <w:p>
+      <w:r>
+        <w:t>« Allô. »</w:t>
+      </w:r>
+    </w:p>
+    <w:p>
+      <w:r>
+        <w:t>(</w:t>
+      </w:r>
+      <w:r>
+        <w:rPr>
+          <w:i/>
+          <w:iCs/>
+        </w:rPr>
+        <w:t>Où es-tu ? Je t’ai apporté à manger, t’es pas là.</w:t>
+      </w:r>
+      <w:r>
+        <w:t>)</w:t>
+      </w:r>
+    </w:p>
+    <w:p>
+      <w:r>
+        <w:t>« Je dors à la maison. »</w:t>
+      </w:r>
+    </w:p>
+    <w:p>
+      <w:r>
+        <w:t>(</w:t>
+      </w:r>
+      <w:r>
+        <w:rPr>
+          <w:i/>
+          <w:iCs/>
+        </w:rPr>
+        <w:t>Arrête tes conneries, j’ai cherché partout.</w:t>
+      </w:r>
+      <w:r>
+        <w:t>)</w:t>
+      </w:r>
+    </w:p>
+    <w:p>
+      <w:r>
+        <w:t>« Chez Bel. »</w:t>
+      </w:r>
+    </w:p>
+    <w:p>
+      <w:r>
+        <w:t>(</w:t>
+      </w:r>
+      <w:r>
+        <w:rPr>
+          <w:i/>
+          <w:iCs/>
+        </w:rPr>
+        <w:t>C’est ça, j’ai cher… Hein ? Chez qui ?</w:t>
+      </w:r>
+      <w:r>
+        <w:t>)</w:t>
+      </w:r>
+    </w:p>
+    <w:p>
+      <w:r>
+        <w:t>« Je suis dans l’appartement de Bel. »</w:t>
+      </w:r>
+    </w:p>
+    <w:p>
+      <w:r>
+        <w:t>(</w:t>
+      </w:r>
+      <w:r>
+        <w:rPr>
+          <w:i/>
+          <w:iCs/>
+        </w:rPr>
+        <w:t>Pourquoi t’es là ? Ne me dis pas que…</w:t>
+      </w:r>
+      <w:r>
+        <w:t>)</w:t>
+      </w:r>
+    </w:p>
+    <w:p>
+      <w:r>
+        <w:t xml:space="preserve">« On a un peu discuté, puis comme on n’arrivait pas à se comprendre, on s’est expliqué avec le corps. » Je souris en éloignant le téléphone de mon oreille, un cri strident retentit. Même </w:t>
+      </w:r>
+      <w:proofErr w:type="spellStart"/>
+      <w:r>
+        <w:t>P’Wi</w:t>
+      </w:r>
+      <w:proofErr w:type="spellEnd"/>
+      <w:r>
+        <w:t xml:space="preserve"> est content, alors inutile de dire à quel point je me sens bien.</w:t>
+      </w:r>
+    </w:p>
+    <w:p>
+      <w:r>
+        <w:t>(</w:t>
+      </w:r>
+      <w:r>
+        <w:rPr>
+          <w:i/>
+          <w:iCs/>
+        </w:rPr>
+        <w:t>T’es terrible ! C’est toi le mari ou c’est elle ?!</w:t>
+      </w:r>
+      <w:r>
+        <w:t>)</w:t>
+      </w:r>
+    </w:p>
+    <w:p>
+      <w:r>
+        <w:t>« Ferme-la !!! »</w:t>
+      </w:r>
+    </w:p>
+    <w:p>
+      <w:r>
+        <w:t>Après avoir raccroché, je vais me doucher, m’habiller, sortir acheter à manger. Mais dans la salle de bain, son parfum m’embaume, mon cœur s’emballe. Je pose ma main sur ma poitrine. Même absente, elle laisse son odeur pour me troubler. Cette doctoresse est une vraie garce, elle aussi.</w:t>
+      </w:r>
+    </w:p>
+    <w:p>
+      <w:r>
+        <w:t>Aïe ! Prends ta douche !</w:t>
+      </w:r>
+    </w:p>
+    <w:p>
+      <w:r>
+        <w:t>Après ma douche, je marche de long en large, je prépare des trucs pour elle, qui ne va pas tarder à rentrer. C’est embêtant : sans maquillage ni tenue, je dois me couvrir totalement pour ne pas être reconnue. Sortir acheter de quoi cuisiner, c’est compliqué. Mais je veux que son premier repas du jour soit parfait.</w:t>
+      </w:r>
+    </w:p>
+    <w:p>
+      <w:r>
+        <w:t>Les légumes bio sont bien rangés, les tomates m’attendent. Je répondrai qu’elle rentre. Et pourquoi je l’attends ? Parce que je veux partager ce repas avec elle. Il est presque seize heures, et je n’ai rien avalé de la journée, sauf un carton de lait à midi.</w:t>
+      </w:r>
+    </w:p>
+    <w:p>
+      <w:r>
+        <w:lastRenderedPageBreak/>
+        <w:t xml:space="preserve">Mais ce qui est plus impressionnant que ma salade santé, c’est ma tenue. Après une réconciliation, rester passive, ne rien faire… ce serait dommage. J’ai mis un tablier, mais rien en dessous. Euh… on dirait que la frustration du pyjama trop transparent est restée, et que cette idée saugrenue m’est venue toute seule, sans que </w:t>
+      </w:r>
+      <w:proofErr w:type="spellStart"/>
+      <w:r>
+        <w:t>P’Wi</w:t>
+      </w:r>
+      <w:proofErr w:type="spellEnd"/>
+      <w:r>
+        <w:t xml:space="preserve"> n’ait besoin de la souffler.</w:t>
+      </w:r>
+    </w:p>
+    <w:p>
+      <w:r>
+        <w:rPr>
+          <w:i/>
+          <w:iCs/>
+        </w:rPr>
+        <w:t>Bip. – Clac !</w:t>
+      </w:r>
+    </w:p>
+    <w:p>
+      <w:r>
+        <w:t>Je suis en train de couper une tomate. Je lève la tête. Elle entre, l’air neutre. Je l’appelle, pour qu’elle sache que je ne suis pas partie.</w:t>
+      </w:r>
+    </w:p>
+    <w:p>
+      <w:r>
+        <w:t>« Tu es rentrée ? » Elle me regarde, s’arrête net. Choquée ? Par ma présence, ou par ma tenue si sexy qu’elle détourne la tête ?</w:t>
+      </w:r>
+    </w:p>
+    <w:p>
+      <w:r>
+        <w:t>« O… oui. » Elle va dans la chambre, me laissant là, sans un mot.</w:t>
+      </w:r>
+    </w:p>
+    <w:p>
+      <w:r>
+        <w:t>Quoi ! Pas un commentaire ? S’habiller en sexy pour rien.</w:t>
+      </w:r>
+    </w:p>
+    <w:p>
+      <w:r>
+        <w:t>Je pose mon couteau, énervée, puis le reprends. Je coupe les tomates plus vite, sans m’en rendre compte.</w:t>
+      </w:r>
+    </w:p>
+    <w:p>
+      <w:r>
+        <w:t>« Aïe ! »</w:t>
+      </w:r>
+    </w:p>
+    <w:p>
+      <w:r>
+        <w:t>Le sang perle sur mon index. Putain ! Obligée de l’embêter, en plus de me faire mal ? Qu’est-ce que j’ai fait au ciel ?</w:t>
+      </w:r>
+    </w:p>
+    <w:p>
+      <w:r>
+        <w:t>Je regarde mon doigt, dépitée. Soudain, quelqu’un me prend la main.</w:t>
+      </w:r>
+    </w:p>
+    <w:p>
+      <w:r>
+        <w:t>« Comment tu coupes, toi ? Fais attention ! »</w:t>
+      </w:r>
+    </w:p>
+    <w:p>
+      <w:proofErr w:type="spellStart"/>
+      <w:r>
+        <w:rPr>
+          <w:i/>
+          <w:iCs/>
+        </w:rPr>
+        <w:t>Thump</w:t>
+      </w:r>
+      <w:proofErr w:type="spellEnd"/>
+      <w:r>
+        <w:rPr>
+          <w:i/>
+          <w:iCs/>
+        </w:rPr>
+        <w:t xml:space="preserve"> </w:t>
+      </w:r>
+      <w:proofErr w:type="spellStart"/>
+      <w:r>
+        <w:rPr>
+          <w:i/>
+          <w:iCs/>
+        </w:rPr>
+        <w:t>thump</w:t>
+      </w:r>
+      <w:proofErr w:type="spellEnd"/>
+      <w:r>
+        <w:rPr>
+          <w:i/>
+          <w:iCs/>
+        </w:rPr>
+        <w:t xml:space="preserve"> </w:t>
+      </w:r>
+      <w:proofErr w:type="spellStart"/>
+      <w:r>
+        <w:rPr>
+          <w:i/>
+          <w:iCs/>
+        </w:rPr>
+        <w:t>thump</w:t>
+      </w:r>
+      <w:proofErr w:type="spellEnd"/>
+      <w:r>
+        <w:rPr>
+          <w:i/>
+          <w:iCs/>
+        </w:rPr>
+        <w:t xml:space="preserve"> </w:t>
+      </w:r>
+      <w:proofErr w:type="spellStart"/>
+      <w:r>
+        <w:rPr>
+          <w:i/>
+          <w:iCs/>
+        </w:rPr>
+        <w:t>thump</w:t>
+      </w:r>
+      <w:proofErr w:type="spellEnd"/>
+      <w:r>
+        <w:rPr>
+          <w:i/>
+          <w:iCs/>
+        </w:rPr>
+        <w:t>.</w:t>
+      </w:r>
+    </w:p>
+    <w:p>
+      <w:r>
+        <w:t>Elle a les sourcils froncés, en colère. Mon cœur s’emballe. Elle s’inquiète pour moi, non ? Juste cette idée, et je ne peux plus la quitter des yeux.</w:t>
+      </w:r>
+    </w:p>
+    <w:p>
+      <w:r>
+        <w:t>Elle me traîne jusqu’à une chaise, disparaît. Je tends le cou. Quand elle revient, elle a une petite trousse de secours. Elle prépare tout sur la table, tire une chaise, s’assoit en face de moi, nos genoux se touchant.</w:t>
+      </w:r>
+    </w:p>
+    <w:p>
+      <w:r>
+        <w:t>« Donne ta main. » Je la lui tends, docile. C’est elle la plus forte, maintenant. Je la regarde, ses doigts fins, les cotons, l’alcool à friction, tout doucement.</w:t>
+      </w:r>
+    </w:p>
+    <w:p>
+      <w:r>
+        <w:t>C’est un spectacle fascinant, je ne peux plus détourner les yeux.</w:t>
+      </w:r>
+      <w:r>
+        <w:br/>
+        <w:t>À part quand on est au lit, c’est ce genre d’attention, de sa part, qui me rend dingue. J’ai envie de me rouler par terre devant tant d’autorité.</w:t>
+      </w:r>
+    </w:p>
+    <w:p>
+      <w:r>
+        <w:t>« Ne le fais plus. »</w:t>
+      </w:r>
+    </w:p>
+    <w:p>
+      <w:r>
+        <w:t>« Ben ne le fera plus. Tu veux qu’elle mange quoi ? »</w:t>
+      </w:r>
+    </w:p>
+    <w:p>
+      <w:r>
+        <w:t>« Tu commandes. Il y a des dizaines de restos dans le coin. »</w:t>
+      </w:r>
+    </w:p>
+    <w:p>
+      <w:r>
+        <w:lastRenderedPageBreak/>
+        <w:t>« Mais Ben veut faire à manger pour Bel. »</w:t>
+      </w:r>
+    </w:p>
+    <w:p>
+      <w:r>
+        <w:t>« Si c’est pour moi, ne le fais surtout pas. Ça ne me fait pas plaisir de te voir te blesser. Commande, la prochaine fois. » Elle me regarde, sérieuse. Oui… cette autorité me fait fondre. Elle est si puissante que je lui obéis.</w:t>
+      </w:r>
+    </w:p>
+    <w:p>
+      <w:r>
+        <w:t>« Mais Bel ne goûtera jamais la cuisine de Ben… » Je fais la moue, boudeuse. Ce n’est pas très mature, mais face à cette version plus dure de Bel, j’ai envie d’être câline. Décidément, elle a toujours autant d’influence sur moi.</w:t>
+      </w:r>
+    </w:p>
+    <w:p>
+      <w:r>
+        <w:t>« C’est toi qui as fait ça ? » Elle regarde la grande salade sur la table. Je hoche la tête, elle sourit. On dirait que mon mode « petite fille » lui plaît.</w:t>
+      </w:r>
+    </w:p>
+    <w:p>
+      <w:r>
+        <w:t>« Bouffe santé… » Elle regarde mon corps, de haut en bas. Je me sens brûlante.</w:t>
+      </w:r>
+    </w:p>
+    <w:p>
+      <w:r>
+        <w:t>« Mais tenue incorrecte. Qui t’a appris à t’habiller comme ça ? » Je réalise que je ne suis vêtue que d’un tablier. J’ai honte. Il ne me cache même pas la poitrine. Bon, au moins, elle couvre un peu…</w:t>
+      </w:r>
+    </w:p>
+    <w:p>
+      <w:r>
+        <w:t>« Va te changer. Et on mangera la salade ensemble. »</w:t>
+      </w:r>
+    </w:p>
+    <w:p>
+      <w:r>
+        <w:t>« Tu n’aimes pas à ce point ? »</w:t>
+      </w:r>
+    </w:p>
+    <w:p>
+      <w:r>
+        <w:t>« Aimer quoi ? »</w:t>
+      </w:r>
+    </w:p>
+    <w:p>
+      <w:r>
+        <w:t>« La façon dont Ben s’habille, non ? »</w:t>
+      </w:r>
+    </w:p>
+    <w:p>
+      <w:r>
+        <w:t>« Si tu t’habilles comme ça, tu vas attraper froid. Va te changer. » Elle ne répond pas à ma question. Je me lève, mécontente.</w:t>
+      </w:r>
+    </w:p>
+    <w:p>
+      <w:r>
+        <w:t>« J’ai essayé de te faire plaisir. Je suis déçue. » Je parle doucement, comme pour moi-même. Elle me prend la main, comme si elle avait entendu.</w:t>
+      </w:r>
+    </w:p>
+    <w:p>
+      <w:r>
+        <w:t>« Tu veux que je mange ta salade, ou que je te mange, toi ? Si tu veux que je te mange, ne te cache pas derrière la nourriture. »</w:t>
+      </w:r>
+    </w:p>
+    <w:p>
+      <w:r>
+        <w:t>Et ma déception disparaît.</w:t>
+      </w:r>
+      <w:r>
+        <w:br/>
+        <w:t>Ah !</w:t>
+      </w:r>
+      <w:r>
+        <w:br/>
+        <w:t>Mrs Dieu qui sait tout, qui aurait cru que cette version de Bel me ferait autant rougir ? Où est passée la doctoresse timide et réservée ? Ou plutôt, toute cette année sans se voir, elle non plus n’a pas dû se retenir. Quoi qu’il en soit, la Bel d’aujourd’hui me plaît tellement que j’ai envie de lui sauter dessus vingt, trente fois par jour.</w:t>
+      </w:r>
+    </w:p>
+    <w:p>
+      <w:r>
+        <w:t>Mais avant même que mon esprit ne s’emballe, mon regard tombe sur son poignet, celui qui tient ma main.</w:t>
+      </w:r>
+    </w:p>
+    <w:p>
+      <w:r>
+        <w:t xml:space="preserve">« Attends ! » Je le porte à mes yeux, pour vérifier que je ne rêve pas. C’est cette montre que j’ai toujours </w:t>
+      </w:r>
+      <w:proofErr w:type="gramStart"/>
+      <w:r>
+        <w:t>voulu</w:t>
+      </w:r>
+      <w:proofErr w:type="gramEnd"/>
+      <w:r>
+        <w:t xml:space="preserve"> la voir remettre.</w:t>
+      </w:r>
+    </w:p>
+    <w:p>
+      <w:r>
+        <w:lastRenderedPageBreak/>
+        <w:t>« Comment ça se fait qu’il n’y a plus de fêlure ? Quand l’as-tu fait réparer ? » La montre, qui était fêlée hier soir, est maintenant intacte. Aussi belle qu’au premier jour.</w:t>
+      </w:r>
+    </w:p>
+    <w:p>
+      <w:r>
+        <w:t>« Eh bien… je viens juste de la remettre. » Elle se gratte la joue, un peu gênée. Je souris largement.</w:t>
+      </w:r>
+    </w:p>
+    <w:p>
+      <w:r>
+        <w:t>« Tu as lu le mot que Ben a laissé avec la montre ? »</w:t>
+      </w:r>
+    </w:p>
+    <w:p>
+      <w:r>
+        <w:t>« Oui. »</w:t>
+      </w:r>
+    </w:p>
+    <w:p>
+      <w:r>
+        <w:t>« Alors, le fait que tu la portes, ça veut dire… » Je la regarde, les yeux brillants. Elle me sourit, comme je l’aurais espéré.</w:t>
+      </w:r>
+    </w:p>
+    <w:p>
+      <w:r>
+        <w:t>« Bel donne une chance à Ben. »</w:t>
+      </w:r>
+    </w:p>
+    <w:p>
+      <w:r>
+        <w:t>« … »</w:t>
+      </w:r>
+    </w:p>
+    <w:p>
+      <w:r>
+        <w:t>« On va se remettre ensemble… »</w:t>
+      </w:r>
+    </w:p>
+    <w:p/>
+    <w:p/>
+    <w:p/>
+    <w:p/>
+    <w:p/>
+    <w:p/>
+    <w:p/>
+    <w:p/>
+    <w:p/>
+    <w:p/>
+    <w:p/>
+    <w:p/>
+    <w:p/>
     <w:p/>
     <w:p/>
     <w:p/>
@@ -24382,7 +26748,7 @@
       <w:rFonts w:eastAsiaTheme="majorEastAsia" w:cstheme="majorBidi"/>
       <w:i/>
       <w:iCs/>
-      <w:color w:val="D9D9D9" w:themeColor="text1" w:themeTint="A6"/>
+      <w:color w:val="595959" w:themeColor="text1" w:themeTint="A6"/>
     </w:rPr>
   </w:style>
   <w:style w:type="paragraph" w:styleId="Titre7">
@@ -24403,7 +26769,7 @@
     </w:pPr>
     <w:rPr>
       <w:rFonts w:eastAsiaTheme="majorEastAsia" w:cstheme="majorBidi"/>
-      <w:color w:val="D9D9D9" w:themeColor="text1" w:themeTint="A6"/>
+      <w:color w:val="595959" w:themeColor="text1" w:themeTint="A6"/>
     </w:rPr>
   </w:style>
   <w:style w:type="paragraph" w:styleId="Titre8">
@@ -24426,7 +26792,7 @@
       <w:rFonts w:eastAsiaTheme="majorEastAsia" w:cstheme="majorBidi"/>
       <w:i/>
       <w:iCs/>
-      <w:color w:val="CECECE" w:themeColor="text1" w:themeTint="D8"/>
+      <w:color w:val="272727" w:themeColor="text1" w:themeTint="D8"/>
     </w:rPr>
   </w:style>
   <w:style w:type="paragraph" w:styleId="Titre9">
@@ -24447,7 +26813,7 @@
     </w:pPr>
     <w:rPr>
       <w:rFonts w:eastAsiaTheme="majorEastAsia" w:cstheme="majorBidi"/>
-      <w:color w:val="CECECE" w:themeColor="text1" w:themeTint="D8"/>
+      <w:color w:val="272727" w:themeColor="text1" w:themeTint="D8"/>
     </w:rPr>
   </w:style>
   <w:style w:type="character" w:default="1" w:styleId="Policepardfaut">
@@ -24554,7 +26920,7 @@
       <w:rFonts w:eastAsiaTheme="majorEastAsia" w:cstheme="majorBidi"/>
       <w:i/>
       <w:iCs/>
-      <w:color w:val="D9D9D9" w:themeColor="text1" w:themeTint="A6"/>
+      <w:color w:val="595959" w:themeColor="text1" w:themeTint="A6"/>
     </w:rPr>
   </w:style>
   <w:style w:type="character" w:customStyle="1" w:styleId="Titre7Car">
@@ -24566,7 +26932,7 @@
     <w:rsid w:val="00ED3855"/>
     <w:rPr>
       <w:rFonts w:eastAsiaTheme="majorEastAsia" w:cstheme="majorBidi"/>
-      <w:color w:val="D9D9D9" w:themeColor="text1" w:themeTint="A6"/>
+      <w:color w:val="595959" w:themeColor="text1" w:themeTint="A6"/>
     </w:rPr>
   </w:style>
   <w:style w:type="character" w:customStyle="1" w:styleId="Titre8Car">
@@ -24580,7 +26946,7 @@
       <w:rFonts w:eastAsiaTheme="majorEastAsia" w:cstheme="majorBidi"/>
       <w:i/>
       <w:iCs/>
-      <w:color w:val="CECECE" w:themeColor="text1" w:themeTint="D8"/>
+      <w:color w:val="272727" w:themeColor="text1" w:themeTint="D8"/>
     </w:rPr>
   </w:style>
   <w:style w:type="character" w:customStyle="1" w:styleId="Titre9Car">
@@ -24592,7 +26958,7 @@
     <w:rsid w:val="00ED3855"/>
     <w:rPr>
       <w:rFonts w:eastAsiaTheme="majorEastAsia" w:cstheme="majorBidi"/>
-      <w:color w:val="CECECE" w:themeColor="text1" w:themeTint="D8"/>
+      <w:color w:val="272727" w:themeColor="text1" w:themeTint="D8"/>
     </w:rPr>
   </w:style>
   <w:style w:type="paragraph" w:styleId="Titre">
@@ -24644,7 +27010,7 @@
     </w:pPr>
     <w:rPr>
       <w:rFonts w:eastAsiaTheme="majorEastAsia" w:cstheme="majorBidi"/>
-      <w:color w:val="D9D9D9" w:themeColor="text1" w:themeTint="A6"/>
+      <w:color w:val="595959" w:themeColor="text1" w:themeTint="A6"/>
       <w:spacing w:val="15"/>
       <w:sz w:val="28"/>
       <w:szCs w:val="28"/>
@@ -24658,7 +27024,7 @@
     <w:rsid w:val="00ED3855"/>
     <w:rPr>
       <w:rFonts w:eastAsiaTheme="majorEastAsia" w:cstheme="majorBidi"/>
-      <w:color w:val="D9D9D9" w:themeColor="text1" w:themeTint="A6"/>
+      <w:color w:val="595959" w:themeColor="text1" w:themeTint="A6"/>
       <w:spacing w:val="15"/>
       <w:sz w:val="28"/>
       <w:szCs w:val="28"/>
@@ -24679,7 +27045,7 @@
     <w:rPr>
       <w:i/>
       <w:iCs/>
-      <w:color w:val="D4D4D4" w:themeColor="text1" w:themeTint="BF"/>
+      <w:color w:val="404040" w:themeColor="text1" w:themeTint="BF"/>
     </w:rPr>
   </w:style>
   <w:style w:type="character" w:customStyle="1" w:styleId="CitationCar">
@@ -24691,7 +27057,7 @@
     <w:rPr>
       <w:i/>
       <w:iCs/>
-      <w:color w:val="D4D4D4" w:themeColor="text1" w:themeTint="BF"/>
+      <w:color w:val="404040" w:themeColor="text1" w:themeTint="BF"/>
     </w:rPr>
   </w:style>
   <w:style w:type="paragraph" w:styleId="Paragraphedeliste">

</xml_diff>

<commit_message>
feat: add the goal in my life is you chap 26
</commit_message>
<xml_diff>
--- a/public/Books/The goal in my life is you.docx
+++ b/public/Books/The goal in my life is you.docx
@@ -24640,13 +24640,16 @@
     </w:p>
     <w:p>
       <w:r>
-        <w:t>‘Cette montre t’appartient toujours, Bel. Si tu veux donner une dernière chance à Ben, porte-</w:t>
-      </w:r>
-      <w:proofErr w:type="spellStart"/>
-      <w:r>
-        <w:t>la.</w:t>
-      </w:r>
-      <w:proofErr w:type="spellEnd"/>
+        <w:t xml:space="preserve">‘Cette montre t’appartient toujours, Bel. Si tu veux donner une dernière chance à Ben, </w:t>
+      </w:r>
+      <w:proofErr w:type="spellStart"/>
+      <w:r>
+        <w:t>porte-la</w:t>
+      </w:r>
+      <w:proofErr w:type="spellEnd"/>
+      <w:r>
+        <w:t>.</w:t>
+      </w:r>
     </w:p>
     <w:p>
       <w:r>
@@ -26142,6 +26145,3146 @@
     <w:p/>
     <w:p/>
     <w:p/>
+    <w:p/>
+    <w:p/>
+    <w:p/>
+    <w:p/>
+    <w:p/>
+    <w:p/>
+    <w:p/>
+    <w:p/>
+    <w:p/>
+    <w:p/>
+    <w:p/>
+    <w:p/>
+    <w:p>
+      <w:pPr>
+        <w:rPr>
+          <w:b/>
+          <w:bCs/>
+          <w:sz w:val="40"/>
+          <w:szCs w:val="40"/>
+        </w:rPr>
+      </w:pPr>
+      <w:r>
+        <w:rPr>
+          <w:b/>
+          <w:bCs/>
+          <w:sz w:val="40"/>
+          <w:szCs w:val="40"/>
+        </w:rPr>
+        <w:lastRenderedPageBreak/>
+        <w:t>Chapitre 24</w:t>
+      </w:r>
+    </w:p>
+    <w:p>
+      <w:pPr>
+        <w:rPr>
+          <w:b/>
+          <w:bCs/>
+          <w:sz w:val="40"/>
+          <w:szCs w:val="40"/>
+        </w:rPr>
+      </w:pPr>
+    </w:p>
+    <w:p>
+      <w:pPr>
+        <w:rPr>
+          <w:b/>
+          <w:bCs/>
+          <w:sz w:val="40"/>
+          <w:szCs w:val="40"/>
+        </w:rPr>
+      </w:pPr>
+    </w:p>
+    <w:p>
+      <w:r>
+        <w:t>« Merci à tous d’être venus. »</w:t>
+      </w:r>
+    </w:p>
+    <w:p>
+      <w:r>
+        <w:t>Je fais un </w:t>
+      </w:r>
+      <w:proofErr w:type="spellStart"/>
+      <w:r>
+        <w:rPr>
+          <w:i/>
+          <w:iCs/>
+        </w:rPr>
+        <w:t>wai</w:t>
+      </w:r>
+      <w:proofErr w:type="spellEnd"/>
+      <w:r>
+        <w:t> pour remercier les fans, souriante. Même si en ce moment je ne tourne pas, j’ai des événements presque tous les jours. Et quand le feuilleton que je viens de finir sera diffusé, je n’aurai plus un jour de repos. Rien que d’y penser, la fatigue me tombe dessus. Mais pas d’inquiétude, j’ai maintenant une recharge de batterie à cent pour cent, disponible en quelques heures.</w:t>
+      </w:r>
+    </w:p>
+    <w:p>
+      <w:r>
+        <w:t xml:space="preserve">« On rentre directement, ou on va quelque part après ? » </w:t>
+      </w:r>
+      <w:proofErr w:type="spellStart"/>
+      <w:r>
+        <w:t>P’Wi</w:t>
+      </w:r>
+      <w:proofErr w:type="spellEnd"/>
+      <w:r>
+        <w:t xml:space="preserve"> se tourne pour me demander, tout en consultant son iPad. Je souris toujours aux fans qui nous accompagnent jusqu’à la voiture.</w:t>
+      </w:r>
+    </w:p>
+    <w:p>
+      <w:r>
+        <w:t xml:space="preserve">« On va chez </w:t>
+      </w:r>
+      <w:proofErr w:type="spellStart"/>
+      <w:r>
+        <w:t>P’Wi</w:t>
+      </w:r>
+      <w:proofErr w:type="spellEnd"/>
+      <w:r>
+        <w:t>. »</w:t>
+      </w:r>
+    </w:p>
+    <w:p>
+      <w:r>
+        <w:t>« Hein ? »</w:t>
+      </w:r>
+    </w:p>
+    <w:p>
+      <w:r>
+        <w:t xml:space="preserve">« Ben va traîner chez </w:t>
+      </w:r>
+      <w:proofErr w:type="spellStart"/>
+      <w:r>
+        <w:t>P’Wi</w:t>
+      </w:r>
+      <w:proofErr w:type="spellEnd"/>
+      <w:r>
+        <w:t>. »</w:t>
+      </w:r>
+    </w:p>
+    <w:p>
+      <w:r>
+        <w:t>« Encore ? » Je souris, prends mon téléphone et appelle quelqu’un.</w:t>
+      </w:r>
+    </w:p>
+    <w:p>
+      <w:r>
+        <w:t>« Allô, tu es fatiguée</w:t>
+      </w:r>
+      <w:proofErr w:type="gramStart"/>
+      <w:r>
+        <w:t xml:space="preserve"> ?…</w:t>
+      </w:r>
+      <w:proofErr w:type="gramEnd"/>
+      <w:r>
+        <w:t xml:space="preserve"> Si tu ne l’es pas, viens chez </w:t>
+      </w:r>
+      <w:proofErr w:type="spellStart"/>
+      <w:r>
+        <w:t>P’Wi</w:t>
+      </w:r>
+      <w:proofErr w:type="spellEnd"/>
+      <w:r>
+        <w:t>. »</w:t>
+      </w:r>
+    </w:p>
+    <w:p>
+      <w:r>
+        <w:t>« Mmm… B… Bel, ah… » La voix qui sort de ma gorge fait sourire la doctoresse qui me touche, comme si elle avait gagné.</w:t>
+      </w:r>
+    </w:p>
+    <w:p>
+      <w:r>
+        <w:t>« </w:t>
+      </w:r>
+      <w:proofErr w:type="spellStart"/>
+      <w:r>
+        <w:rPr>
+          <w:i/>
+          <w:iCs/>
+        </w:rPr>
+        <w:t>Heuh</w:t>
+      </w:r>
+      <w:proofErr w:type="spellEnd"/>
+      <w:r>
+        <w:t>… » Je m’affale sur son épaule blanche, épuisée. Qui aurait cru qu’après une journée à ausculter des patients, elle aurait encore autant d’énergie ? Si j’avais su, j’aurais choisi de manger plutôt que de faire ça.</w:t>
+      </w:r>
+    </w:p>
+    <w:p>
+      <w:r>
+        <w:t>« Tu es à bout ? »</w:t>
+      </w:r>
+    </w:p>
+    <w:p>
+      <w:r>
+        <w:t>« À bout. »</w:t>
+      </w:r>
+    </w:p>
+    <w:p>
+      <w:r>
+        <w:t>« Mais Bel n’a pas encore fini… » Je la regarde, horrifiée.</w:t>
+      </w:r>
+    </w:p>
+    <w:p>
+      <w:r>
+        <w:t>« Ça suffit. Ben a faim. »</w:t>
+      </w:r>
+    </w:p>
+    <w:p>
+      <w:r>
+        <w:t>« Tu n’as pas mangé ? »</w:t>
+      </w:r>
+    </w:p>
+    <w:p>
+      <w:r>
+        <w:t>« Non. Emmène-moi manger, s’il te plaît. » Je fais ma câline. Bel sourit, mais ses doigts, toujours en moi, s’enfoncent plus profondément. Je m’agrippe à ses épaules.</w:t>
+      </w:r>
+    </w:p>
+    <w:p>
+      <w:r>
+        <w:t>« Je t’emmènerai manger, ma chérie… Finissons ce round, d’abord. »</w:t>
+      </w:r>
+    </w:p>
+    <w:p>
+      <w:r>
+        <w:lastRenderedPageBreak/>
+        <w:t>« Mmm ! »</w:t>
+      </w:r>
+    </w:p>
+    <w:p>
+      <w:r>
+        <w:t>Après notre réconciliation, un mois a passé.</w:t>
+      </w:r>
+      <w:r>
+        <w:br/>
+        <w:t xml:space="preserve">Même si on s’est réconciliées, beaucoup de choses restent cachées. On ne peut pas se voir trop souvent, de peur que </w:t>
+      </w:r>
+      <w:proofErr w:type="spellStart"/>
+      <w:r>
+        <w:t>P’Madmée</w:t>
+      </w:r>
+      <w:proofErr w:type="spellEnd"/>
+      <w:r>
+        <w:t xml:space="preserve"> ne le découvre ou que les journalistes ne soient suspicieux. J’ai donc passé un accord avec Bel : on peut se voir, mais dans un endroit discret.</w:t>
+      </w:r>
+    </w:p>
+    <w:p>
+      <w:r>
+        <w:t xml:space="preserve">Et cet endroit, c’est la vieille maison de </w:t>
+      </w:r>
+      <w:proofErr w:type="spellStart"/>
+      <w:r>
+        <w:t>P’Wi</w:t>
+      </w:r>
+      <w:proofErr w:type="spellEnd"/>
+      <w:r>
+        <w:t>, en vente depuis un an mais invendable. La maison est au fond d’une impasse, le sol s’affaisse par endroits, un prix de plusieurs millions trop élevé pour son état. Mais c’est une bonne chose : cette maison me permet de retrouver cette doctoresse incandescente chaque fois qu’elle me manque.</w:t>
+      </w:r>
+    </w:p>
+    <w:p>
+      <w:r>
+        <w:t xml:space="preserve">Même si à chaque fois, </w:t>
+      </w:r>
+      <w:proofErr w:type="spellStart"/>
+      <w:r>
+        <w:t>P’Wi</w:t>
+      </w:r>
+      <w:proofErr w:type="spellEnd"/>
+      <w:r>
+        <w:t xml:space="preserve"> n’est pas content de devoir m’attendre des heures en bas. Mais il n’y peut rien, puisque c’est lui qui m’a laissée me réconcilier avec elle. Je ne suis pas méchante au point de le laisser </w:t>
+      </w:r>
+      <w:proofErr w:type="spellStart"/>
+      <w:r>
+        <w:t>poireter</w:t>
+      </w:r>
+      <w:proofErr w:type="spellEnd"/>
+      <w:r>
+        <w:t xml:space="preserve"> sans rien lui donner. Ma proposition : racheter cette maison. Oui, puisque c’est si difficile de trouver un endroit tranquille pour s’aimer, j’ai acheté une nouvelle maison. Pour qu’on puisse roucouler tranquillement.</w:t>
+      </w:r>
+    </w:p>
+    <w:p>
+      <w:r>
+        <w:t>« Vous avez fini ? Ça a fait combien de rounds, aujourd’hui ? »</w:t>
+      </w:r>
+    </w:p>
+    <w:p>
+      <w:r>
+        <w:rPr>
+          <w:i/>
+          <w:iCs/>
+        </w:rPr>
+        <w:t>Clac !</w:t>
+      </w:r>
+    </w:p>
+    <w:p>
+      <w:r>
+        <w:t xml:space="preserve">Je frappe </w:t>
+      </w:r>
+      <w:proofErr w:type="spellStart"/>
+      <w:r>
+        <w:t>P’Wi</w:t>
+      </w:r>
+      <w:proofErr w:type="spellEnd"/>
+      <w:r>
+        <w:t xml:space="preserve"> au bras. Il se retourne, furieux.</w:t>
+      </w:r>
+    </w:p>
+    <w:p>
+      <w:r>
+        <w:t>« Ben ! T’es trop forte, espèce de ! »</w:t>
+      </w:r>
+    </w:p>
+    <w:p>
+      <w:r>
+        <w:t>« Apprends à respecter Bel, un peu. Bel, tu peux manger sans attendre, hein. »</w:t>
+      </w:r>
+    </w:p>
+    <w:p>
+      <w:r>
+        <w:t>« Alors, Ben te rejoins. » Je hoche la tête avant de me tourner vers mon agent.</w:t>
+      </w:r>
+    </w:p>
+    <w:p>
+      <w:r>
+        <w:t>« “Bel, tu peux manger sans attendre, hein”… deux de tension, c’est ça. »</w:t>
+      </w:r>
+    </w:p>
+    <w:p>
+      <w:r>
+        <w:t>« Tu m’embêtes ! Demain, j’ai combien de boulots ? »</w:t>
+      </w:r>
+    </w:p>
+    <w:p>
+      <w:r>
+        <w:t xml:space="preserve">« Deux. Le matin à Bangkok, le soir à </w:t>
+      </w:r>
+      <w:proofErr w:type="spellStart"/>
+      <w:r>
+        <w:t>Chonburi</w:t>
+      </w:r>
+      <w:proofErr w:type="spellEnd"/>
+      <w:r>
+        <w:t>. »</w:t>
+      </w:r>
+    </w:p>
+    <w:p>
+      <w:r>
+        <w:t xml:space="preserve">« Encore en province ! » Je prends l’iPad des mains de </w:t>
+      </w:r>
+      <w:proofErr w:type="spellStart"/>
+      <w:r>
+        <w:t>P’Wi</w:t>
+      </w:r>
+      <w:proofErr w:type="spellEnd"/>
+      <w:r>
+        <w:t>. Avoir beaucoup de travail n’est pas un mal, tant que c’est à Bangkok, où j’ai plus de chances de voir Bel. Mais quand c’est en province, ça veut dire que je ne la verrai pas du tout.</w:t>
+      </w:r>
+    </w:p>
+    <w:p>
+      <w:r>
+        <w:t xml:space="preserve">« Ben… viens manger. » La doctoresse sort de la cuisine. </w:t>
+      </w:r>
+      <w:proofErr w:type="spellStart"/>
+      <w:r>
+        <w:t>P’Wi</w:t>
+      </w:r>
+      <w:proofErr w:type="spellEnd"/>
+      <w:r>
+        <w:t xml:space="preserve"> reprend son iPad.</w:t>
+      </w:r>
+    </w:p>
+    <w:p>
+      <w:r>
+        <w:t>« Va manger. Ta femme t’appelle. »</w:t>
+      </w:r>
+    </w:p>
+    <w:p>
+      <w:r>
+        <w:t>« Quelle femme ? Ça, c’est mon mari. » Je souris, puis vais dans la cuisine.</w:t>
+      </w:r>
+    </w:p>
+    <w:p>
+      <w:r>
+        <w:t>« Tu n’avais pas faim ? » Elle me sert un verre d’eau. Chaque fois que je suis avec Bel, ce que j’aime, c’est la voir prendre soin des moindres détails. Même verser un verre d’eau. Ça peut paraître insignifiant, mais pour moi, c’est une attention adorable. Je suis sûre que même s’il y avait des milliers de personnes pour le faire, la plus sincère serait Bel.</w:t>
+      </w:r>
+    </w:p>
+    <w:p>
+      <w:r>
+        <w:lastRenderedPageBreak/>
+        <w:t>« Après avoir mangé, va te reposer. Tu travailles demain ? »</w:t>
+      </w:r>
+    </w:p>
+    <w:p>
+      <w:r>
+        <w:t>« Oui. Demain, Ben va en province, je ne te verrai pas. » Je pose ma tête sur son épaule. Elle rit doucement.</w:t>
+      </w:r>
+    </w:p>
+    <w:p>
+      <w:r>
+        <w:t>« Demain, Bel n’aura pas le temps non plus. Comme ça, tu pourras te reposer un peu. »</w:t>
+      </w:r>
+    </w:p>
+    <w:p>
+      <w:r>
+        <w:t>« C’est ça, tu ne veux pas me voir ? »</w:t>
+      </w:r>
+    </w:p>
+    <w:p>
+      <w:r>
+        <w:t>« Bien sûr que si. Redresse-toi, et mange. » Je me redresse, lui tire la langue. Elle sourit.</w:t>
+      </w:r>
+    </w:p>
+    <w:p>
+      <w:r>
+        <w:t>Après cette année, je dois admettre que j’étais perdue, sans but, même après être devenue première rôle. Je ne pensais qu’au temps où j’étais avec elle. Bel est la seule personne au monde qui me donne envie de faire plus d’efforts. Pas pour qu’elle m’aime à cent pour cent, mais pour que chaque jour, qu’il arrive quoi, soit meilleur. Y compris celui-ci…</w:t>
+      </w:r>
+    </w:p>
+    <w:p>
+      <w:r>
+        <w:t>« Ce n’est pas</w:t>
+      </w:r>
+      <w:r>
+        <w:t xml:space="preserve"> juste ! » Je lui fais la tête. Elle s’assoit, les bras croisés, le regard neutre mais sévère. Je serre les lèvres, espérant qu’elle ne voit pas à quel point je tremble.</w:t>
+      </w:r>
+    </w:p>
+    <w:p>
+      <w:r>
+        <w:t>« Pas juste, comment ? »</w:t>
+      </w:r>
+    </w:p>
+    <w:p>
+      <w:r>
+        <w:t>« Ben t’a dit de ne pas faire de marques ! » Je pointe ma poitrine. Oui… on vient de finir de s’aimer, ardemment. Tellement ardemment que la doctoresse a laissé une trace. Une marque de propriété.</w:t>
+      </w:r>
+    </w:p>
+    <w:p>
+      <w:r>
+        <w:t>« Eh bien… »</w:t>
+      </w:r>
+    </w:p>
+    <w:p>
+      <w:r>
+        <w:t>« Et dans quelques heures, Ben doit travailler. En bustier, en plus ! »</w:t>
+      </w:r>
+    </w:p>
+    <w:p>
+      <w:proofErr w:type="gramStart"/>
+      <w:r>
+        <w:t>« Fallait pas</w:t>
+      </w:r>
+      <w:proofErr w:type="gramEnd"/>
+      <w:r>
+        <w:t xml:space="preserve"> être si mignonne, alors. » Elle marmonne. Je me retourne. L’air sévère disparaît, je rougis.</w:t>
+      </w:r>
+    </w:p>
+    <w:p>
+      <w:r>
+        <w:t>« Quand tu fais cette tête, qu’est-ce que Ben peut faire ? »</w:t>
+      </w:r>
+    </w:p>
+    <w:p>
+      <w:r>
+        <w:t>« Tout ce que tu veux… »</w:t>
+      </w:r>
+    </w:p>
+    <w:p>
+      <w:r>
+        <w:t xml:space="preserve">Ah ! </w:t>
+      </w:r>
+      <w:r>
+        <w:t>Elle n’a même pas</w:t>
+      </w:r>
+      <w:r>
+        <w:t xml:space="preserve"> fini sa phrase que le désert est déjà en train de brûler. Je l’attrape par la nuque et l’embrasse sur le cou, doucement. Voyant qu’elle se laisse faire, je mords, je suce.</w:t>
+      </w:r>
+    </w:p>
+    <w:p>
+      <w:r>
+        <w:t>« Ben ! »</w:t>
+      </w:r>
+    </w:p>
+    <w:p>
+      <w:r>
+        <w:t>« Réciproque ! » Je me lève et cours dans la salle de bain. Derrière la porte, elle hurle que c’est encore plus visible, sur le cou, etc. Et alors ? C’est elle la doctoresse, si j’avais fait la marque sur sa poitrine comme elle l’a fait, qui l’aurait vue ?</w:t>
+      </w:r>
+    </w:p>
+    <w:p>
+      <w:r>
+        <w:t>« Ben ! »</w:t>
+      </w:r>
+    </w:p>
+    <w:p>
+      <w:r>
+        <w:rPr>
+          <w:i/>
+          <w:iCs/>
+        </w:rPr>
+        <w:t>Han.</w:t>
+      </w:r>
+    </w:p>
+    <w:p>
+      <w:r>
+        <w:t>« Merde, j’ai encore oublié de fermer à clé ! » Je la regarde s’approcher, le cœur battant. Je la croyais furieuse, prête à m’engueuler. À son visage, elle a plutôt envie de m’achever.</w:t>
+      </w:r>
+    </w:p>
+    <w:p>
+      <w:r>
+        <w:lastRenderedPageBreak/>
+        <w:t>« Tu veux changer d’ambiance ? »</w:t>
+      </w:r>
+    </w:p>
+    <w:p>
+      <w:r>
+        <w:t>« C’est-à-dire… »</w:t>
+      </w:r>
+    </w:p>
+    <w:p>
+      <w:r>
+        <w:t xml:space="preserve">« Il reste une heure et demie avant que </w:t>
+      </w:r>
+      <w:proofErr w:type="spellStart"/>
+      <w:r>
+        <w:t>P’Wi</w:t>
+      </w:r>
+      <w:proofErr w:type="spellEnd"/>
+      <w:r>
+        <w:t xml:space="preserve"> ne vienne te chercher. Si tu ne veux pas changer de terrain, sors. »</w:t>
+      </w:r>
+    </w:p>
+    <w:p>
+      <w:r>
+        <w:t>Génial. Mais c’est excitant, quand même.</w:t>
+      </w:r>
+    </w:p>
+    <w:p>
+      <w:r>
+        <w:t>Je la suis. Il est presque vingt-deux heures. Il reste bien une heure.</w:t>
+      </w:r>
+    </w:p>
+    <w:p>
+      <w:r>
+        <w:t>« Il reste une heure, mais on ne tiendra que trente minutes… » Je pose mon téléphone, je le mets en mode réveil, puis je saute sur le lit, mon ring. Et cette fois, c’est moi qui vais gagner.</w:t>
+      </w:r>
+      <w:r>
+        <w:br/>
+        <w:t>Parce qu’elle m’obéira, dans toutes les positions…</w:t>
+      </w:r>
+    </w:p>
+    <w:p>
+      <w:r>
+        <w:t xml:space="preserve">« Je vais m’évanouir… » </w:t>
+      </w:r>
+      <w:proofErr w:type="spellStart"/>
+      <w:r>
+        <w:t>P’Wi</w:t>
+      </w:r>
+      <w:proofErr w:type="spellEnd"/>
+      <w:r>
+        <w:t xml:space="preserve"> se tient la tête. Je lui tape doucement sur l’épaule.</w:t>
+      </w:r>
+    </w:p>
+    <w:p>
+      <w:r>
+        <w:t>« Aide-moi, s’il te plaît. »</w:t>
+      </w:r>
+    </w:p>
+    <w:p>
+      <w:r>
+        <w:t>« Pourquoi vous vous êtes sucées à ce point, bordel ? »</w:t>
+      </w:r>
+    </w:p>
+    <w:p>
+      <w:r>
+        <w:rPr>
+          <w:i/>
+          <w:iCs/>
+        </w:rPr>
+        <w:t>Prout !</w:t>
+      </w:r>
+    </w:p>
+    <w:p>
+      <w:r>
+        <w:t>Bel, qui buvait un verre d’eau, s’étouffe. Je la regarde.</w:t>
+      </w:r>
+    </w:p>
+    <w:p>
+      <w:r>
+        <w:t>« Ça va ? »</w:t>
+      </w:r>
+    </w:p>
+    <w:p>
+      <w:r>
+        <w:t xml:space="preserve">« Ça va. Je monte me doucher. » Elle remporte sa bouteille avec elle, me laissant seule avec </w:t>
+      </w:r>
+      <w:proofErr w:type="spellStart"/>
+      <w:r>
+        <w:t>P’Wi</w:t>
+      </w:r>
+      <w:proofErr w:type="spellEnd"/>
+      <w:r>
+        <w:t>.</w:t>
+      </w:r>
+    </w:p>
+    <w:p>
+      <w:r>
+        <w:t>« Mettons du fond de teint par-dessus, et pas de cinéma, on va être en retard. »</w:t>
+      </w:r>
+    </w:p>
+    <w:p>
+      <w:r>
+        <w:t>« S’il y a une prochaine fois, j’engueule ton mari ! »</w:t>
+      </w:r>
+    </w:p>
+    <w:p>
+      <w:r>
+        <w:t>« Ma femme ! »</w:t>
+      </w:r>
+    </w:p>
+    <w:p>
+      <w:r>
+        <w:t>« Aïe ! Vous changez tous les jours, comment je veux savoir ? Assieds-toi là ! Je te laisse sortir dans cet état, moi. »</w:t>
+      </w:r>
+    </w:p>
+    <w:p>
+      <w:r>
+        <w:t>« Je sais, je sais. Arrête de râler, t’es pire qu’une vieille. »</w:t>
+      </w:r>
+    </w:p>
+    <w:p>
+      <w:r>
+        <w:t>Après avoir caché les marques, je suis arrivée au nouveau centre commercial. Beaucoup de monde, principalement des célébrités et des riches invités. Les fans et autres, sans invitation, se tiennent aux étages, aux couloirs, devant l’entrée. Des agents de sécurité un peu partout.</w:t>
+      </w:r>
+    </w:p>
+    <w:p>
+      <w:r>
+        <w:t>Je vais au point photo, avec les dirigeants et actionnaires. Mais mon regard tombe sur une jolie femme familière qui se tient à côté de moi. Je suis mal à l’aise.</w:t>
+      </w:r>
+    </w:p>
+    <w:p>
+      <w:r>
+        <w:t>« Tu vas bien ? » Mimi demande, souriant aux photographes. Je fais de même.</w:t>
+      </w:r>
+    </w:p>
+    <w:p>
+      <w:r>
+        <w:lastRenderedPageBreak/>
+        <w:t>« Ça va… » Pour être honnête, depuis que je l’ai quittée, je n’ose plus la regarder. Pas parce que j’ai honte, mais parce que je me sens un peu coupable de savoir qu’elle a tout tenté pour me revoir après les photos de Bel et moi.</w:t>
+      </w:r>
+    </w:p>
+    <w:p>
+      <w:r>
+        <w:t>« Je n’aurais pas dû demander. Te voilà assez célèbre pour poser à côté de moi. » Je la regarde, furieuse, puis m’éloigne.</w:t>
+      </w:r>
+    </w:p>
+    <w:p>
+      <w:r>
+        <w:t>« Et ton amie des photos, alors, comment elle va ? Dès que le buzz est retombé, vous avez arrêté de vous voir, non ? »</w:t>
+      </w:r>
+    </w:p>
+    <w:p>
+      <w:r>
+        <w:t>« … »</w:t>
+      </w:r>
+    </w:p>
+    <w:p>
+      <w:r>
+        <w:t>« Tu as dû la larguer, hein… Parce que tu es trop égoïste. » Je me retourne vers elle. J’ai envie de prendre un vase et de le lui balancer à la figure. Qu’elle n’oublie pas de qui elle parle.</w:t>
+      </w:r>
+    </w:p>
+    <w:p>
+      <w:r>
+        <w:t>« Si tu ne peux pas parler gentiment, ne parle pas. » Je réponds en souriant, pour ne pas éveiller les soupçons.</w:t>
+      </w:r>
+    </w:p>
+    <w:p>
+      <w:r>
+        <w:t>« Qu’est-ce que j’ai dit de mal ? Tu ne te fais pas des idées, toi-même ? »</w:t>
+      </w:r>
+    </w:p>
+    <w:p>
+      <w:r>
+        <w:t>« Vich ! » J’appelle mon ami, et je passe devant elle sans répondre à ses provocations.</w:t>
+      </w:r>
+    </w:p>
+    <w:p>
+      <w:r>
+        <w:t>Je ne sais pas si c’est une bonne idée, parce que dès qu’on est côte à côte, les hurlements des fans, qui voient leur couple préféré ensemble, redoublent.</w:t>
+      </w:r>
+    </w:p>
+    <w:p>
+      <w:r>
+        <w:t>« Pourquoi ce sourire forcé ? »</w:t>
+      </w:r>
+    </w:p>
+    <w:p>
+      <w:r>
+        <w:t xml:space="preserve">« Je viens de vivre un moment ennuyeux. Allez, au boulot. » Je prends le bras de Vich, suivant les consignes de </w:t>
+      </w:r>
+      <w:proofErr w:type="spellStart"/>
+      <w:r>
+        <w:t>P’Wi</w:t>
+      </w:r>
+      <w:proofErr w:type="spellEnd"/>
+      <w:r>
+        <w:t xml:space="preserve"> : les grands patrons nous regardent.</w:t>
+      </w:r>
+    </w:p>
+    <w:p>
+      <w:r>
+        <w:t>« Chuchote-moi à l’oreille, comme ça les photographes auront de quoi publier. Fais la fille heureuse. » Vich se tourne vers moi, souriant, comme si on discutait. Je lui murmure quelque chose à l’oreille, les fans hurlent.</w:t>
+      </w:r>
+    </w:p>
+    <w:p>
+      <w:r>
+        <w:t>Événement réussi.</w:t>
+      </w:r>
+    </w:p>
+    <w:p>
+      <w:r>
+        <w:t xml:space="preserve">Après la fin, Vich et moi attendons la voiture devant le centre. </w:t>
+      </w:r>
+      <w:proofErr w:type="spellStart"/>
+      <w:r>
+        <w:t>P’Wi</w:t>
+      </w:r>
+      <w:proofErr w:type="spellEnd"/>
+      <w:r>
+        <w:t xml:space="preserve"> est assis dans la voiture de Vich. Explication : les grands patrons veulent qu’on rentre ensemble.</w:t>
+      </w:r>
+    </w:p>
+    <w:p>
+      <w:r>
+        <w:t>« Je te raccompagne en premier, Ben. » Vich déboutonne le premier bouton de sa chemise. Je ne fais pas attention, je prends mon téléphone.</w:t>
+      </w:r>
+    </w:p>
+    <w:p>
+      <w:r>
+        <w:rPr>
+          <w:b/>
+          <w:bCs/>
+        </w:rPr>
+        <w:t>Ben :</w:t>
+      </w:r>
+      <w:r>
+        <w:t> Tu dors, Bel ?</w:t>
+      </w:r>
+    </w:p>
+    <w:p>
+      <w:r>
+        <w:rPr>
+          <w:b/>
+          <w:bCs/>
+        </w:rPr>
+        <w:t>Bel :</w:t>
+      </w:r>
+      <w:r>
+        <w:t> Je vais me coucher.</w:t>
+      </w:r>
+    </w:p>
+    <w:p>
+      <w:r>
+        <w:rPr>
+          <w:b/>
+          <w:bCs/>
+        </w:rPr>
+        <w:t>Ben :</w:t>
+      </w:r>
+      <w:r>
+        <w:t> Ne dors pas tout de suite, je viens.</w:t>
+      </w:r>
+    </w:p>
+    <w:p>
+      <w:r>
+        <w:t xml:space="preserve">« </w:t>
+      </w:r>
+      <w:proofErr w:type="spellStart"/>
+      <w:r>
+        <w:t>RaccoMPAGNEZ</w:t>
+      </w:r>
+      <w:proofErr w:type="spellEnd"/>
+      <w:r>
+        <w:t>-MOI au condo de mon amie. »</w:t>
+      </w:r>
+    </w:p>
+    <w:p>
+      <w:r>
+        <w:lastRenderedPageBreak/>
+        <w:t>J’entre dans l’appartement de Bel, épuisée par la journée. Fatiguée du boulot, et fatiguée de notre combat amoureux de tout à l’heure. Il n’y a donc rien d’étonnant à être à ce point crevée.</w:t>
+      </w:r>
+    </w:p>
+    <w:p>
+      <w:r>
+        <w:t>Je fais le tour, m’attendant à ce qu’elle vienne. Mais elle est sous les draps, déjà endormie, sans se rendre compte que je suis là. Elle aussi a dû être fatiguée. Je prends un pyjama, je me douche pour me détendre un peu.</w:t>
+      </w:r>
+    </w:p>
+    <w:p>
+      <w:r>
+        <w:t xml:space="preserve">Depuis qu’on s’est remises ensemble, je me sens revivre. Mais ce que Mimi a dit… je suis coupable. Je reste aussi </w:t>
+      </w:r>
+      <w:proofErr w:type="spellStart"/>
+      <w:r>
+        <w:t>égoïde</w:t>
+      </w:r>
+      <w:proofErr w:type="spellEnd"/>
+      <w:r>
+        <w:t xml:space="preserve"> qu’avant. Une fois, j’ai voulu quelque chose, alors j’ai fait du mal à celle que j’aimais. Cette fois, j’ai voulu la revoir, alors je l’ai reprise dans ma vie. Je suis tellement égoïste que j’ai peur qu’un jour elle disparaisse. Qu’est-ce que je ferai ? Est-ce que je supporterai si c’est elle qui s’en va ?</w:t>
+      </w:r>
+    </w:p>
+    <w:p>
+      <w:r>
+        <w:t>Je me glisse contre elle, l’enlace doucement, pour ne pas la réveiller.</w:t>
+      </w:r>
+    </w:p>
+    <w:p>
+      <w:r>
+        <w:t>« Ben est fatiguée. »</w:t>
+      </w:r>
+    </w:p>
+    <w:p>
+      <w:r>
+        <w:t>« Tu es arrivée ? » Sa voix ensommeillée me fait enfouir mon visage contre son dos, je hoche la tête.</w:t>
+      </w:r>
+    </w:p>
+    <w:p>
+      <w:r>
+        <w:t>« Qu’est-ce qu’il y a ? Tu es très fatiguée ? »</w:t>
+      </w:r>
+    </w:p>
+    <w:p>
+      <w:r>
+        <w:t>« Très fatiguée. »</w:t>
+      </w:r>
+    </w:p>
+    <w:p>
+      <w:r>
+        <w:t>« Alors dors. Bel n’en peut plus de sommeil non plus. »</w:t>
+      </w:r>
+    </w:p>
+    <w:p>
+      <w:r>
+        <w:t>« Bel… »</w:t>
+      </w:r>
+    </w:p>
+    <w:p>
+      <w:r>
+        <w:t xml:space="preserve">« </w:t>
+      </w:r>
+      <w:proofErr w:type="spellStart"/>
+      <w:r>
+        <w:t>Mmmm</w:t>
+      </w:r>
+      <w:proofErr w:type="spellEnd"/>
+      <w:r>
+        <w:t xml:space="preserve"> ? »</w:t>
+      </w:r>
+    </w:p>
+    <w:p>
+      <w:r>
+        <w:t>« Ben t’aime… »</w:t>
+      </w:r>
+    </w:p>
+    <w:p>
+      <w:r>
+        <w:t>« Je sais… » Elle se retourne pour me regarder. Même s’il fait noir, je devine qu’elle sourit. Ce sourire qui donne toujours envie de sourire.</w:t>
+      </w:r>
+    </w:p>
+    <w:p>
+      <w:r>
+        <w:t xml:space="preserve">Dès que j’ai prononcé ces mots, la fatigue s’est envolée, remplacée par le bien-être, la sérénité. Peu importe ce que l’avenir nous réserve, à partir d’aujourd’hui, je ne veux que Bel. Je ne demande qu’une chose : qu’elle reste avec moi, qu’elle me </w:t>
+      </w:r>
+      <w:proofErr w:type="spellStart"/>
+      <w:r>
+        <w:t>sourie</w:t>
+      </w:r>
+      <w:proofErr w:type="spellEnd"/>
+      <w:r>
+        <w:t>, qu’elle me tienne dans ses bras comme ça.</w:t>
+      </w:r>
+    </w:p>
+    <w:p>
+      <w:r>
+        <w:t>Je n’ai besoin que d’elle.</w:t>
+      </w:r>
+    </w:p>
+    <w:p/>
+    <w:p/>
+    <w:p/>
+    <w:p/>
+    <w:p>
+      <w:pPr>
+        <w:rPr>
+          <w:b/>
+          <w:bCs/>
+          <w:sz w:val="40"/>
+          <w:szCs w:val="40"/>
+        </w:rPr>
+      </w:pPr>
+      <w:r>
+        <w:rPr>
+          <w:b/>
+          <w:bCs/>
+          <w:sz w:val="40"/>
+          <w:szCs w:val="40"/>
+        </w:rPr>
+        <w:lastRenderedPageBreak/>
+        <w:t>Chapitre 25</w:t>
+      </w:r>
+    </w:p>
+    <w:p>
+      <w:pPr>
+        <w:rPr>
+          <w:b/>
+          <w:bCs/>
+          <w:sz w:val="40"/>
+          <w:szCs w:val="40"/>
+        </w:rPr>
+      </w:pPr>
+    </w:p>
+    <w:p>
+      <w:pPr>
+        <w:rPr>
+          <w:b/>
+          <w:bCs/>
+          <w:sz w:val="40"/>
+          <w:szCs w:val="40"/>
+        </w:rPr>
+      </w:pPr>
+    </w:p>
+    <w:p>
+      <w:r>
+        <w:t>« Qu'est-ce qu'il y a ? Pourquoi tu ne manges pas ? »</w:t>
+      </w:r>
+    </w:p>
+    <w:p>
+      <w:r>
+        <w:t>Bel parle alors que je ne fais que la regarder, sans détourner les yeux. Depuis que Mimi m’a dit ça l’autre jour, je n’arrête pas de me faire du souci. Je ne comprends même pas pourquoi je laisse des paroles sans importance me tracasser, alors qu’elles ne sont qu’à moitié vraies, et qu’en plus, je n’ai pas quitté Bel.</w:t>
+      </w:r>
+    </w:p>
+    <w:p>
+      <w:r>
+        <w:t>« J’aime juste te regarder. »</w:t>
+      </w:r>
+    </w:p>
+    <w:p>
+      <w:r>
+        <w:t>« Moi aussi, j’aime te regarder, mais tu dois manger. »</w:t>
+      </w:r>
+    </w:p>
+    <w:p>
+      <w:r>
+        <w:t>« Donne-moi à manger. Ouvre grand. »</w:t>
+      </w:r>
+    </w:p>
+    <w:p>
+      <w:r>
+        <w:t>« Tu es devenue tellement câline… » On dirait une plainte, mais elle me donne quand même à manger, en souriant. Il suffit que je fasse ma câline, et la doctoresse semble aimer ça. Elle sourit à chaque fois. C’est si bien que je n’ai plus envie de la quitter une seule seconde.</w:t>
+      </w:r>
+    </w:p>
+    <w:p>
+      <w:r>
+        <w:t>« On va au cinéma ? Une séance tardive. » Je baisse les yeux sur ma montre : il est presque dix-neuf heures.</w:t>
+      </w:r>
+    </w:p>
+    <w:p>
+      <w:r>
+        <w:t>« Tu n’as pas peur qu’on te reconnaisse ? »</w:t>
+      </w:r>
+    </w:p>
+    <w:p>
+      <w:r>
+        <w:t>« On se déguise… »</w:t>
+      </w:r>
+    </w:p>
+    <w:p>
+      <w:r>
+        <w:t>Et la soirée s’annonce sympa. Après le dîner, Bel sort toutes ses affaires, visiblement excitée à l’idée de choisir. Sans doute que mes vêtements, en nombre suffisant pour tenir un an, l’amusent. Moi, je m’amuse à la regarder.</w:t>
+      </w:r>
+    </w:p>
+    <w:p>
+      <w:r>
+        <w:t>« On va me reconnaître ? »</w:t>
+      </w:r>
+    </w:p>
+    <w:p>
+      <w:r>
+        <w:t xml:space="preserve">« Non… » Je me regarde dans le miroir : un grand tee-shirt noir avec capuche, un jean noir, des lunettes noires. On dirait une star de la </w:t>
+      </w:r>
+      <w:proofErr w:type="spellStart"/>
+      <w:r>
+        <w:t>K-pop</w:t>
+      </w:r>
+      <w:proofErr w:type="spellEnd"/>
+      <w:r>
+        <w:t>. Je ressemble un peu à Irene de Red Velvet, non ?</w:t>
+      </w:r>
+    </w:p>
+    <w:p>
+      <w:r>
+        <w:t>« On y va ? » Je hoche la tête. Je conduis.</w:t>
+      </w:r>
+    </w:p>
+    <w:p>
+      <w:r>
+        <w:t>On a choisi les places du fond, tout en haut. Avec l’heure tardive, il n’y a presque personne. Je ne suis pas obligée de me méfier, je peux lui tenir la main, lui prendre le bras, tranquille.</w:t>
+      </w:r>
+    </w:p>
+    <w:p>
+      <w:r>
+        <w:t>Deux heures de film. Une vieille image qui me manquait : Bel a les larmes aux yeux, émue par la fin.</w:t>
+      </w:r>
+    </w:p>
+    <w:p>
+      <w:r>
+        <w:lastRenderedPageBreak/>
+        <w:t>« Tu pleures toujours devant les films ? Pleurnicharde. »</w:t>
+      </w:r>
+    </w:p>
+    <w:p>
+      <w:r>
+        <w:t>« C’est triste, voilà tout. » Elle essuie ses larmes d’un revers de main. Je profite de ma manche longue.</w:t>
+      </w:r>
+    </w:p>
+    <w:p>
+      <w:r>
+        <w:t>« Laisse-moi faire… » Je lui essuie doucement les joues. Elle a beau avoir changé, ce côté sensible devant les films est resté le même.</w:t>
+      </w:r>
+    </w:p>
+    <w:p>
+      <w:r>
+        <w:t>Je me sens comme une adolescente, même si j’ai bientôt trente ans. Tenir la main de celle qu’on aime, marcher à ses côtés… c’est si bon. Je me le demande en lui tenant la main, traînant un peu vers le parking.</w:t>
+      </w:r>
+    </w:p>
+    <w:p>
+      <w:r>
+        <w:t>« Pourquoi tu regardes ma main ? » Elle me sourit.</w:t>
+      </w:r>
+    </w:p>
+    <w:p>
+      <w:r>
+        <w:t>« Je suis juste heureuse. » Mes lèvres sont cachées, mais elle m’entend très bien. Elle me sourit, comme pour dire qu’elle est tout aussi heureuse.</w:t>
+      </w:r>
+    </w:p>
+    <w:p>
+      <w:r>
+        <w:t>« Crois-tu qu’au moment où tu es revenue, Bel n’arrêtait pas de supplier pour que tu t’en ailles ? » Je regarde son visage cruel, toujours souriant.</w:t>
+      </w:r>
+    </w:p>
+    <w:p>
+      <w:r>
+        <w:t>« Mais à présent qu’on est revenues ensemble, Bel ne demande plus qu’à ne plus jamais se séparer. Bel est si heureuse qu’elle a oublié toutes ces mauvaises choses. » Elle serre ma main un peu plus fort. Son sourire est sincère, et mes yeux s’embuent plus que devant le film.</w:t>
+      </w:r>
+    </w:p>
+    <w:p>
+      <w:r>
+        <w:t>« Merci… »</w:t>
+      </w:r>
+    </w:p>
+    <w:p>
+      <w:r>
+        <w:t>« Oh, tu vas pleurer ? » Elle s’approche, me prend par la taille. « Dire que tu traites les autres de pleurnichardes, regarde-toi. »</w:t>
+      </w:r>
+    </w:p>
+    <w:p>
+      <w:r>
+        <w:t>« Ce n’est pas pareil. » Je pose ma tête sur son épaule, le cœur gros.</w:t>
+      </w:r>
+    </w:p>
+    <w:p>
+      <w:r>
+        <w:t>On rentre à son appartement vers minuit. Ce n’est pas grave si elle vient chez moi ou moi chez elle, de temps en temps.</w:t>
+      </w:r>
+    </w:p>
+    <w:p>
+      <w:r>
+        <w:t>Elle me donne un verre d’eau, en plaisantant que j’ai dû perdre beaucoup d’eau avec mes larmes, donc il faut me réhydrater. La vanne est agaçante, mais je bois, je la regarde ranger, et je me sens bien.</w:t>
+      </w:r>
+    </w:p>
+    <w:p>
+      <w:r>
+        <w:t>« Tu sais quoi ? Ben n’a jamais eu d’amie fille. Ni de petite amie, d’ailleurs. » Pendant qu’elle range des magazines, elle se tourne vers moi, intéressée.</w:t>
+      </w:r>
+    </w:p>
+    <w:p>
+      <w:r>
+        <w:t>« Petite, Ben était très sollicitée. Je ne pensais qu’à étudier. Quand j’avais des amis, ils n’étaient là que pour profiter de moi, genre copier mes devoirs. Et puis les filles ne m’aimaient pas parce que je n’avais que des amis garçons. Pas de chance, hein ? » Bel a tout laissé tomber pour s’asseoir à côté de moi.</w:t>
+      </w:r>
+    </w:p>
+    <w:p>
+      <w:r>
+        <w:t>« Sollicitée à cause des études ? »</w:t>
+      </w:r>
+    </w:p>
+    <w:p>
+      <w:r>
+        <w:lastRenderedPageBreak/>
+        <w:t>« Oui… Ma mère était très dure. Elle voulait que je sois la meilleure, la plus célèbre, et que je devienne médecin, comme mon père et mes frères. Mais Ben ne voulait pas. Elle voulait une vie simple, un travail, et être heureuse… » Je prends sa main.</w:t>
+      </w:r>
+    </w:p>
+    <w:p>
+      <w:r>
+        <w:t>« Ben pensait qu’elle n’avait besoin que de son père et de ses frères. Jusqu’à ce que je rencontre Bel… Bel a changé le monde de Ben. » Je lui souris, repensant à nos débuts. On dit que le meilleur moment, c’est la période des fiançailles. Même si Bel et moi sommes loin de ça, c’est l’échange de bons sentiments, sans s’en rendre compte.</w:t>
+      </w:r>
+    </w:p>
+    <w:p>
+      <w:r>
+        <w:t>« Tu as tellement de choses en tête, Ben. Trop pour les exprimer. Je ne sais pas par où commencer, ni comment finir. »</w:t>
+      </w:r>
+    </w:p>
+    <w:p>
+      <w:r>
+        <w:t>« Y a-t-il autre chose que tu veux me dire ? » On se regarde. J’aurais encore des choses à dire, mais je ne peux pas. Je dévoilerais le contrat.</w:t>
+      </w:r>
+    </w:p>
+    <w:p>
+      <w:r>
+        <w:t>« Ben t’aime. C’est ça que Ben veut te dire. » Je serre sa main, me blottis contre sa poitrine. Elle ouvre les bras.</w:t>
+      </w:r>
+    </w:p>
+    <w:p>
+      <w:r>
+        <w:t>« Si tu es fatiguée, repose-toi. Bel ne veut pas que Ben s’inquiète autant. » Sa main caresse doucement mes cheveux.</w:t>
+      </w:r>
+    </w:p>
+    <w:p>
+      <w:r>
+        <w:t>« Bel doit rester avec Ben. Ben n’a que toi… » Je la regarde, comme pour attendre une réponse. Elle sourit, hoche la tête.</w:t>
+      </w:r>
+    </w:p>
+    <w:p>
+      <w:r>
+        <w:t>« On écoute de la musique ? » Ce n’est pas vraiment une question. Elle se dégage, va chercher son téléphone, le connecte en Bluetooth. La chanson « Remedy » d’Adele retentit, tandis qu’elle revient s’asseoir à côté de moi.</w:t>
+      </w:r>
+    </w:p>
+    <w:p>
+      <w:r>
+        <w:t>Tout le monde a déjà imaginé être le héros d’une chanson.</w:t>
+      </w:r>
+      <w:r>
+        <w:br/>
+        <w:t>Moi aussi. En écoutant celle-ci, j’ai voulu que quelqu’un me la dédie, me dise : « Je serai là, quoi qu’il arrive. »</w:t>
+      </w:r>
+    </w:p>
+    <w:p>
+      <w:r>
+        <w:t>« Pourquoi cette chanson ? » Je tends l’oreille, tout en l’écoutant.</w:t>
+      </w:r>
+    </w:p>
+    <w:p>
+      <w:r>
+        <w:t>« Parce que c’est ta seule chanson préférée. L’autre jour, dans la voiture, Bel a vu ça dans ta playlist. »</w:t>
+      </w:r>
+    </w:p>
+    <w:p>
+      <w:r>
+        <w:t>« Pourquoi tu es si mignonne, Bel</w:t>
+      </w:r>
+      <w:proofErr w:type="gramStart"/>
+      <w:r>
+        <w:t xml:space="preserve"> ?…</w:t>
+      </w:r>
+      <w:proofErr w:type="gramEnd"/>
+      <w:r>
+        <w:t xml:space="preserve"> »</w:t>
+      </w:r>
+    </w:p>
+    <w:p>
+      <w:r>
+        <w:t>« Parce que Bel… » Elle ne finit pas sa phrase, me prend le visage entre ses mains et m’embrasse. C’est doux, pas comme quand on se bat. Un baiser d’amour et d’attention, plus que de désir.</w:t>
+      </w:r>
+    </w:p>
+    <w:p>
+      <w:r>
+        <w:t>« Ben ne doit pas s’inquiéter… Bel ne partira pas. »</w:t>
+      </w:r>
+    </w:p>
+    <w:p>
+      <w:r>
+        <w:t>Mes larmes reviennent. Je ne savais pas que j’étais aussi anxieuse. Il a fallu que quelqu’un me console pour réaliser à quel point je suis faible. La fille indifférente, autrefois, a complètement disparu. J’ai vraiment changé.</w:t>
+      </w:r>
+    </w:p>
+    <w:p>
+      <w:r>
+        <w:lastRenderedPageBreak/>
+        <w:t>On reste enlacées longtemps. Ma tête sur sa poitrine. Je suis sûre qu’elle sait que je pleure, mais elle ne me pose pas de questions. J’ai perdu plus d’un an à poursuivre un objectif stupide, laissant une personne si bonne derrière moi. Plus jamais. Quoi qu’il arrive, je resterai à ses côtés, comme elle est toujours restée à côté de moi.</w:t>
+      </w:r>
+    </w:p>
+    <w:p>
+      <w:r>
+        <w:t>On sera ensemble…</w:t>
+      </w:r>
+      <w:r>
+        <w:br/>
+        <w:t>Sans que personne ne puisse nous en empêcher.</w:t>
+      </w:r>
+    </w:p>
+    <w:p>
+      <w:r>
+        <w:t xml:space="preserve">Dans un peu plus d’un mois, ce stupide contrat sera fini. Mais </w:t>
+      </w:r>
+      <w:proofErr w:type="spellStart"/>
+      <w:r>
+        <w:t>P’Madmée</w:t>
+      </w:r>
+      <w:proofErr w:type="spellEnd"/>
+      <w:r>
+        <w:t xml:space="preserve"> semble inquiète. Peut-être parce que je n’ai pas renouvelé mon contrat avec la chaîne, qui expire dans trois mois. Ce doit être effrayant, pour une jeune première, de ne pas renouveler. Je fais la sourde oreille, je dis « plus tard ». Si je ne renouvelle pas, vous imaginez la manne financière qui s’envole ?</w:t>
+      </w:r>
+    </w:p>
+    <w:p>
+      <w:r>
+        <w:t xml:space="preserve">« </w:t>
+      </w:r>
+      <w:proofErr w:type="spellStart"/>
+      <w:r>
+        <w:t>P’Madmée</w:t>
+      </w:r>
+      <w:proofErr w:type="spellEnd"/>
+      <w:r>
+        <w:t xml:space="preserve"> insiste pour que tu renouvelles. » </w:t>
+      </w:r>
+      <w:proofErr w:type="spellStart"/>
+      <w:r>
+        <w:t>P’Wi</w:t>
+      </w:r>
+      <w:proofErr w:type="spellEnd"/>
+      <w:r>
+        <w:t xml:space="preserve"> boit son café noir, l’air soucieux. Je soupire plusieurs fois.</w:t>
+      </w:r>
+    </w:p>
+    <w:p>
+      <w:r>
+        <w:t>« Je ne sais pas. Je n’ai pas envie. »</w:t>
+      </w:r>
+    </w:p>
+    <w:p>
+      <w:r>
+        <w:t>« T’es folle ? Si tu ne renouvelles pas, tu vas devenir un fantôme à courir après les contrats ? »</w:t>
+      </w:r>
+    </w:p>
+    <w:p>
+      <w:r>
+        <w:t xml:space="preserve">« Franchement, </w:t>
+      </w:r>
+      <w:proofErr w:type="spellStart"/>
+      <w:r>
+        <w:t>P’Wi</w:t>
+      </w:r>
+      <w:proofErr w:type="spellEnd"/>
+      <w:r>
+        <w:t>. Ben veut quitter le milieu. »</w:t>
+      </w:r>
+    </w:p>
+    <w:p>
+      <w:proofErr w:type="spellStart"/>
+      <w:r>
+        <w:rPr>
+          <w:i/>
+          <w:iCs/>
+        </w:rPr>
+        <w:t>Pling</w:t>
+      </w:r>
+      <w:proofErr w:type="spellEnd"/>
+      <w:r>
+        <w:rPr>
+          <w:i/>
+          <w:iCs/>
+        </w:rPr>
+        <w:t xml:space="preserve"> !</w:t>
+      </w:r>
+    </w:p>
+    <w:p>
+      <w:r>
+        <w:t>Il me regarde, choqué. Je prends des mouchoirs, une petite poubelle, et ramasse les morceaux de verre. Ce que je ne fais jamais.</w:t>
+      </w:r>
+    </w:p>
+    <w:p>
+      <w:r>
+        <w:t>« Qu’est-ce que tu fais ? »</w:t>
+      </w:r>
+    </w:p>
+    <w:p>
+      <w:r>
+        <w:t>« Je ramasse le verre. » Il me regarde, surpris. Je ne fais pas attention, je ramasse doucement.</w:t>
+      </w:r>
+    </w:p>
+    <w:p>
+      <w:r>
+        <w:t xml:space="preserve">« Ça fait si longtemps qu’on est ensemble que je me demande : si Ben n’est plus actrice, qu’est-ce que </w:t>
+      </w:r>
+      <w:proofErr w:type="spellStart"/>
+      <w:r>
+        <w:t>P’Wi</w:t>
+      </w:r>
+      <w:proofErr w:type="spellEnd"/>
+      <w:r>
+        <w:t xml:space="preserve"> fera ? Est-ce que </w:t>
+      </w:r>
+      <w:proofErr w:type="spellStart"/>
+      <w:r>
+        <w:t>P’Wi</w:t>
+      </w:r>
+      <w:proofErr w:type="spellEnd"/>
+      <w:r>
+        <w:t xml:space="preserve"> m’en voudra de choisir une nouvelle voie, de ne plus écouter les autres ? »</w:t>
+      </w:r>
+    </w:p>
+    <w:p>
+      <w:r>
+        <w:t>« Tu es sérieuse ? » Je hoche la tête, sans lever les yeux.</w:t>
+      </w:r>
+    </w:p>
+    <w:p>
+      <w:r>
+        <w:t>« Ben y pense depuis un moment. En vrai, si je suis entrée dans ce milieu, c’était pour vaincre ma mère. Pour lui montrer qu’à la fin, Ben avait réussi, qu’elle n’avait pas besoin de me dicter ma vie. »</w:t>
+      </w:r>
+    </w:p>
+    <w:p>
+      <w:r>
+        <w:t>« … »</w:t>
+      </w:r>
+    </w:p>
+    <w:p>
+      <w:r>
+        <w:t xml:space="preserve">« Mais Ben n’a jamais été heureuse. Elle n’a jamais compris le mot “amour” aussi clairement qu’avec Bel. » Son nom, que </w:t>
+      </w:r>
+      <w:proofErr w:type="spellStart"/>
+      <w:r>
+        <w:t>P’Wi</w:t>
+      </w:r>
+      <w:proofErr w:type="spellEnd"/>
+      <w:r>
+        <w:t xml:space="preserve"> connaît bien, résonne. Je le regarde. Il ferme les yeux, s’adosse à sa chaise.</w:t>
+      </w:r>
+    </w:p>
+    <w:p>
+      <w:r>
+        <w:lastRenderedPageBreak/>
+        <w:t xml:space="preserve">« Ben reste égoïste. Je sais que </w:t>
+      </w:r>
+      <w:proofErr w:type="spellStart"/>
+      <w:r>
+        <w:t>P’Wi</w:t>
+      </w:r>
+      <w:proofErr w:type="spellEnd"/>
+      <w:r>
+        <w:t xml:space="preserve"> sera triste, mais je suis sérieuse. Je ne veux plus signer de contrat, et disparaître tranquillement. »</w:t>
+      </w:r>
+    </w:p>
+    <w:p>
+      <w:r>
+        <w:t>« Et qu’est-ce que tu attends de moi ? Que je te retienne ou que je te laisse partir ? »</w:t>
+      </w:r>
+    </w:p>
+    <w:p>
+      <w:r>
+        <w:t xml:space="preserve">« Ben ne veut pas que </w:t>
+      </w:r>
+      <w:proofErr w:type="spellStart"/>
+      <w:r>
+        <w:t>P’Wi</w:t>
+      </w:r>
+      <w:proofErr w:type="spellEnd"/>
+      <w:r>
+        <w:t xml:space="preserve"> la retienne… » Mes larmes, faciles en ce moment, coulent à nouveau. Je ne veux pas qu’il me voie pleurer. C’est pathétique de pleurer pour une décision que je peux prendre. Mais ce qui serait grave, c’est de l’abandonner, comme j’ai abandonné Bel. « Pourquoi tu pleures ? » Il s’agenouille, me prend dans ses bras. Je m’attendais à ce qu’il se fâche et parte, pas à ça.</w:t>
+      </w:r>
+    </w:p>
+    <w:p>
+      <w:r>
+        <w:t xml:space="preserve">« Et Ben ne veut pas que </w:t>
+      </w:r>
+      <w:proofErr w:type="spellStart"/>
+      <w:r>
+        <w:t>P’Wi</w:t>
+      </w:r>
+      <w:proofErr w:type="spellEnd"/>
+      <w:r>
+        <w:t xml:space="preserve"> n’aime pas Bel. Tout ce que Ben est, ça vient d’elle. »</w:t>
+      </w:r>
+    </w:p>
+    <w:p>
+      <w:r>
+        <w:t>« Pourquoi je n’aimerais pas ta doctoresse ? »</w:t>
+      </w:r>
+    </w:p>
+    <w:p>
+      <w:r>
+        <w:t xml:space="preserve">« Ben a peur que </w:t>
+      </w:r>
+      <w:proofErr w:type="spellStart"/>
+      <w:r>
+        <w:t>P’Wi</w:t>
+      </w:r>
+      <w:proofErr w:type="spellEnd"/>
+      <w:r>
+        <w:t xml:space="preserve"> pense qu’elle m’a tout pris. »</w:t>
+      </w:r>
+    </w:p>
+    <w:p>
+      <w:r>
+        <w:t>« Ne fais pas l’enfant. Je n’ai jamais détesté ta doctoresse. On s’est rapprochés, j’ai mieux compris ta situation grâce à elle. Cette fille froide et distante, toi, tu as pleuré plusieurs fois devant moi. C’est une bonne chose. » Je le regarde, mes larmes coulent toujours. Je ne savais pas avoir deux bonnes personnes dans ma vie. Comme si je n’avais personne, alors qu’en fait, j’avais des gens bien.</w:t>
+      </w:r>
+    </w:p>
+    <w:p>
+      <w:r>
+        <w:t xml:space="preserve">« Merci, </w:t>
+      </w:r>
+      <w:proofErr w:type="spellStart"/>
+      <w:r>
+        <w:t>P’Wi</w:t>
+      </w:r>
+      <w:proofErr w:type="spellEnd"/>
+      <w:r>
+        <w:t>. »</w:t>
+      </w:r>
+    </w:p>
+    <w:p>
+      <w:r>
+        <w:t>« Pour ce que tu as dit, je ne t’arrêterai pas. Fais ce que tu veux. C’est ta vie. »</w:t>
+      </w:r>
+    </w:p>
+    <w:p>
+      <w:r>
+        <w:t>« </w:t>
+      </w:r>
+      <w:r>
+        <w:rPr>
+          <w:i/>
+          <w:iCs/>
+        </w:rPr>
+        <w:t>Hic</w:t>
+      </w:r>
+      <w:r>
+        <w:t>… Merci. »</w:t>
+      </w:r>
+    </w:p>
+    <w:p>
+      <w:r>
+        <w:t>Ma vie est sur le point de changer à nouveau.</w:t>
+      </w:r>
+    </w:p>
+    <w:p>
+      <w:r>
+        <w:t xml:space="preserve">Aujourd’hui, c’est un jour particulier. Depuis ma crise à la maison, je ne remets plus les pieds chez mon père, sauf quand ma mère est absente. Mais aujourd’hui, toute la famille est là, pour l’anniversaire de </w:t>
+      </w:r>
+      <w:proofErr w:type="spellStart"/>
+      <w:r>
+        <w:t>P’Be</w:t>
+      </w:r>
+      <w:proofErr w:type="spellEnd"/>
+      <w:r>
+        <w:t>, mon troisième frère. Je ne peux pas refuser, j’avais promis de venir.</w:t>
+      </w:r>
+    </w:p>
+    <w:p>
+      <w:r>
+        <w:t xml:space="preserve">« Quoi de neuf, première rôle ? » </w:t>
+      </w:r>
+      <w:proofErr w:type="spellStart"/>
+      <w:r>
+        <w:t>P’Bim</w:t>
+      </w:r>
+      <w:proofErr w:type="spellEnd"/>
+      <w:r>
+        <w:t xml:space="preserve"> me prend par le cou.</w:t>
+      </w:r>
+    </w:p>
+    <w:p>
+      <w:r>
+        <w:t xml:space="preserve">« Tu as acheté quoi pour </w:t>
+      </w:r>
+      <w:proofErr w:type="spellStart"/>
+      <w:r>
+        <w:t>P’Be</w:t>
+      </w:r>
+      <w:proofErr w:type="spellEnd"/>
+      <w:r>
+        <w:t xml:space="preserve"> ? »</w:t>
+      </w:r>
+    </w:p>
+    <w:p>
+      <w:r>
+        <w:t>« Une enceinte Marshall. Et toi ? »</w:t>
+      </w:r>
+    </w:p>
+    <w:p>
+      <w:r>
+        <w:t>« Des billets d’avion pour le Japon, aller-retour, et l’hôtel de son choix. » Je souris.</w:t>
+      </w:r>
+    </w:p>
+    <w:p>
+      <w:r>
+        <w:t>« Tu as mis le paquet. Plus cher que moi. »</w:t>
+      </w:r>
+    </w:p>
+    <w:p>
+      <w:r>
+        <w:t xml:space="preserve">« Où est </w:t>
+      </w:r>
+      <w:proofErr w:type="spellStart"/>
+      <w:r>
+        <w:t>P’Boss</w:t>
+      </w:r>
+      <w:proofErr w:type="spellEnd"/>
+      <w:r>
+        <w:t xml:space="preserve"> ? »</w:t>
+      </w:r>
+    </w:p>
+    <w:p>
+      <w:r>
+        <w:t xml:space="preserve">« Là-bas… » Je vois </w:t>
+      </w:r>
+      <w:proofErr w:type="spellStart"/>
+      <w:r>
+        <w:t>P’Boss</w:t>
+      </w:r>
+      <w:proofErr w:type="spellEnd"/>
+      <w:r>
+        <w:t xml:space="preserve"> aider ma mère à descendre l’escalier. Elle me regarde, l’air neutre. Je dégage mon bras et vais m’asseoir à côté de </w:t>
+      </w:r>
+      <w:proofErr w:type="spellStart"/>
+      <w:r>
+        <w:t>P’Be</w:t>
+      </w:r>
+      <w:proofErr w:type="spellEnd"/>
+      <w:r>
+        <w:t>.</w:t>
+      </w:r>
+    </w:p>
+    <w:p>
+      <w:r>
+        <w:lastRenderedPageBreak/>
+        <w:t>« Pourquoi tu te dépêches, je n’ai pas fini de préparer. »</w:t>
+      </w:r>
+    </w:p>
+    <w:p>
+      <w:r>
+        <w:t>« Tu veux savoir ce que ta petite sœur t’a offert ? »</w:t>
+      </w:r>
+    </w:p>
+    <w:p>
+      <w:r>
+        <w:t>« Si tu me le dis, je ne serai pas surpris. » Il me sourit, me frictionne les cheveux.</w:t>
+      </w:r>
+    </w:p>
+    <w:p>
+      <w:r>
+        <w:t>« Alors je ne te dis rien. Va ouvrir. » Il hoche la tête et va dans la cuisine pour sortir deux autres plats.</w:t>
+      </w:r>
+    </w:p>
+    <w:p>
+      <w:r>
+        <w:t>« On devrait revenir plus souvent. Papa demande après toi. »</w:t>
+      </w:r>
+    </w:p>
+    <w:p>
+      <w:r>
+        <w:t>« Je suis mal à l’aise. »</w:t>
+      </w:r>
+    </w:p>
+    <w:p>
+      <w:r>
+        <w:t xml:space="preserve">« Papa est vieux, Ben… » </w:t>
+      </w:r>
+      <w:proofErr w:type="spellStart"/>
+      <w:r>
+        <w:t>P’Be</w:t>
+      </w:r>
+      <w:proofErr w:type="spellEnd"/>
+      <w:r>
+        <w:t xml:space="preserve"> a l’air triste. « Ma mère aussi. »</w:t>
+      </w:r>
+    </w:p>
+    <w:p>
+      <w:r>
+        <w:t>Je détourne le regard, je prends mon téléphone.</w:t>
+      </w:r>
+    </w:p>
+    <w:p>
+      <w:r>
+        <w:rPr>
+          <w:b/>
+          <w:bCs/>
+        </w:rPr>
+        <w:t>Ben :</w:t>
+      </w:r>
+      <w:r>
+        <w:t> Aujourd’hui, je suis chez mon père.</w:t>
+      </w:r>
+    </w:p>
+    <w:p>
+      <w:r>
+        <w:rPr>
+          <w:b/>
+          <w:bCs/>
+        </w:rPr>
+        <w:t>Bell :</w:t>
+      </w:r>
+      <w:r>
+        <w:t> Ah. On se voit aujourd’hui ?</w:t>
+      </w:r>
+    </w:p>
+    <w:p>
+      <w:r>
+        <w:rPr>
+          <w:b/>
+          <w:bCs/>
+        </w:rPr>
+        <w:t>Ben :</w:t>
+      </w:r>
+      <w:r>
+        <w:t> Tu veux ?</w:t>
+      </w:r>
+    </w:p>
+    <w:p>
+      <w:r>
+        <w:rPr>
+          <w:b/>
+          <w:bCs/>
+        </w:rPr>
+        <w:t>Bell :</w:t>
+      </w:r>
+      <w:r>
+        <w:t> Oui</w:t>
+      </w:r>
+    </w:p>
+    <w:p>
+      <w:r>
+        <w:rPr>
+          <w:b/>
+          <w:bCs/>
+        </w:rPr>
+        <w:t>Ben :</w:t>
+      </w:r>
+      <w:r>
+        <w:t xml:space="preserve"> Alors on se voit. Vers vingt heures, chez </w:t>
+      </w:r>
+      <w:proofErr w:type="spellStart"/>
+      <w:r>
+        <w:t>P’Wi</w:t>
+      </w:r>
+      <w:proofErr w:type="spellEnd"/>
+      <w:r>
+        <w:t>. Tu finis tôt, aujourd’hui ?</w:t>
+      </w:r>
+    </w:p>
+    <w:p>
+      <w:r>
+        <w:rPr>
+          <w:b/>
+          <w:bCs/>
+        </w:rPr>
+        <w:t>Bell :</w:t>
+      </w:r>
+      <w:r>
+        <w:t> Oui. Je traîne à l’appartement.</w:t>
+      </w:r>
+    </w:p>
+    <w:p>
+      <w:r>
+        <w:rPr>
+          <w:b/>
+          <w:bCs/>
+        </w:rPr>
+        <w:t>Ben :</w:t>
+      </w:r>
+      <w:r>
+        <w:t> OK. Je reste ici en attendant.</w:t>
+      </w:r>
+    </w:p>
+    <w:p>
+      <w:r>
+        <w:rPr>
+          <w:b/>
+          <w:bCs/>
+        </w:rPr>
+        <w:t>Bell :</w:t>
+      </w:r>
+      <w:r>
+        <w:t> D’accord. Dépêche-toi.</w:t>
+      </w:r>
+    </w:p>
+    <w:p>
+      <w:r>
+        <w:t>Je lève les yeux, mon père descend lentement l’escalier. Je lui prends le bras.</w:t>
+      </w:r>
+    </w:p>
+    <w:p>
+      <w:r>
+        <w:t>« Surprise~ »</w:t>
+      </w:r>
+    </w:p>
+    <w:p>
+      <w:r>
+        <w:t>« Quelle surprise, je t’ai vue arriver. » Je ris, je lui tire la langue. Il a beau ne pas avoir l’air excité, ses yeux brillent.</w:t>
+      </w:r>
+    </w:p>
+    <w:p>
+      <w:r>
+        <w:t>« Tu ne pourrais pas faire semblant pour ta fille ? »</w:t>
+      </w:r>
+    </w:p>
+    <w:p>
+      <w:r>
+        <w:t>Je passe du temps avec ma famille, on ouvre les cadeaux. J’évite le regard de ma mère pour ne pas avoir envie de partir trop vite.</w:t>
+      </w:r>
+    </w:p>
+    <w:p>
+      <w:r>
+        <w:t>« Ben pense sérieusement à ouvrir un café. »</w:t>
+      </w:r>
+    </w:p>
+    <w:p>
+      <w:r>
+        <w:t xml:space="preserve">« Tu auras le temps ? » </w:t>
+      </w:r>
+      <w:proofErr w:type="spellStart"/>
+      <w:r>
+        <w:t>P’Boss</w:t>
+      </w:r>
+      <w:proofErr w:type="spellEnd"/>
+      <w:r>
+        <w:t xml:space="preserve"> lève son verre de vin, m’en tend un autre.</w:t>
+      </w:r>
+    </w:p>
+    <w:p>
+      <w:r>
+        <w:t>« Je trouverai. Ce milieu commence à m’ennuyer. »</w:t>
+      </w:r>
+    </w:p>
+    <w:p>
+      <w:r>
+        <w:t>« On dirait que tu vas arrêter d’être actrice. »</w:t>
+      </w:r>
+    </w:p>
+    <w:p>
+      <w:r>
+        <w:lastRenderedPageBreak/>
+        <w:t>« C’est à peu près ça. » Je lève mon verre, m’arrête quand ma mère se lève et monte. Tout le monde se regarde, ne comprenant pas.</w:t>
+      </w:r>
+    </w:p>
+    <w:p>
+      <w:r>
+        <w:t>« On dirait que Maman ne veut pas… »</w:t>
+      </w:r>
+    </w:p>
+    <w:p>
+      <w:r>
+        <w:t>Mon téléphone sonne. Ce n’est pas plus mal, je n’avais pas envie de savoir pourquoi elle était partie.</w:t>
+      </w:r>
+    </w:p>
+    <w:p>
+      <w:r>
+        <w:t xml:space="preserve">« Oui, </w:t>
+      </w:r>
+      <w:proofErr w:type="spellStart"/>
+      <w:r>
+        <w:t>P’Wi</w:t>
+      </w:r>
+      <w:proofErr w:type="spellEnd"/>
+      <w:r>
+        <w:t xml:space="preserve"> ? »</w:t>
+      </w:r>
+    </w:p>
+    <w:p>
+      <w:r>
+        <w:t>(</w:t>
+      </w:r>
+      <w:r>
+        <w:rPr>
+          <w:i/>
+          <w:iCs/>
+        </w:rPr>
+        <w:t xml:space="preserve">Aujourd’hui, Vich tourne. </w:t>
+      </w:r>
+      <w:proofErr w:type="spellStart"/>
+      <w:r>
+        <w:rPr>
+          <w:i/>
+          <w:iCs/>
+        </w:rPr>
+        <w:t>P’Madmée</w:t>
+      </w:r>
+      <w:proofErr w:type="spellEnd"/>
+      <w:r>
+        <w:rPr>
+          <w:i/>
+          <w:iCs/>
+        </w:rPr>
+        <w:t xml:space="preserve"> a dit que tu dois venir sur le plateau.</w:t>
+      </w:r>
+      <w:r>
+        <w:t>)</w:t>
+      </w:r>
+    </w:p>
+    <w:p>
+      <w:r>
+        <w:t>« Pourquoi faire ? Je ne tourne pas avec lui. »</w:t>
+      </w:r>
+    </w:p>
+    <w:p>
+      <w:r>
+        <w:t>(</w:t>
+      </w:r>
+      <w:r>
+        <w:rPr>
+          <w:i/>
+          <w:iCs/>
+        </w:rPr>
+        <w:t>Apporte-lui des gâteaux. Je te les ai préparés.</w:t>
+      </w:r>
+      <w:r>
+        <w:t>)</w:t>
+      </w:r>
+    </w:p>
+    <w:p>
+      <w:r>
+        <w:t>« Pour quoi faire ? Je ne peux pas ne pas y aller ? »</w:t>
+      </w:r>
+    </w:p>
+    <w:p>
+      <w:r>
+        <w:t>(</w:t>
+      </w:r>
+      <w:r>
+        <w:rPr>
+          <w:i/>
+          <w:iCs/>
+        </w:rPr>
+        <w:t>Vas-y. Fais bonne figure avant de la plaquer.</w:t>
+      </w:r>
+      <w:r>
+        <w:t>)</w:t>
+      </w:r>
+    </w:p>
+    <w:p>
+      <w:r>
+        <w:t>Je me tais. Il a raison. Je devrais y aller. Je dois au moins obéir un peu avant de partir.</w:t>
+      </w:r>
+    </w:p>
+    <w:p>
+      <w:r>
+        <w:t>« Viens me chercher chez mon père. »</w:t>
+      </w:r>
+    </w:p>
+    <w:p>
+      <w:r>
+        <w:rPr>
+          <w:b/>
+          <w:bCs/>
+        </w:rPr>
+        <w:t>Ben :</w:t>
+      </w:r>
+      <w:r>
+        <w:t> Je suis désolée, Bel. On ne pourra pas se voir aujourd’hui.</w:t>
+      </w:r>
+    </w:p>
+    <w:p>
+      <w:r>
+        <w:rPr>
+          <w:b/>
+          <w:bCs/>
+        </w:rPr>
+        <w:t>Ben :</w:t>
+      </w:r>
+      <w:r>
+        <w:t> Je dois travailler, vite.</w:t>
+      </w:r>
+    </w:p>
+    <w:p>
+      <w:r>
+        <w:t>Je verrouille l’écran, coupable, mais je n’ai pas le choix. Rompre une promesse à Bel maintenant, pour pouvoir rester avec elle longtemps, ça en vaut la peine.</w:t>
+      </w:r>
+    </w:p>
+    <w:p>
+      <w:r>
+        <w:t>J’arrive sur le plateau, dans une grande maison. Vich et Mimi jouent une scène ensemble. Oui, cette Mimi. Le nouveau feuilleton vient de commencer, c’est le premier jour. Le plateau est bondé, bruyant. Le bruit cesse quand j’arrive. Plusieurs regards m’observent, certains avec admiration, d’autres, moins contents, comme si j’allais voler la vedette au couple principal.</w:t>
+      </w:r>
+    </w:p>
+    <w:p>
+      <w:r>
+        <w:t>« Qui voilà ! » Le réalisateur, que je connais bien, vient vers moi, souriant. Je lui souris.</w:t>
+      </w:r>
+    </w:p>
+    <w:p>
+      <w:r>
+        <w:t>« Je suis passée apporter des gâteaux. »</w:t>
+      </w:r>
+    </w:p>
+    <w:p>
+      <w:r>
+        <w:t>« Pour quelqu’un en particulier ? » Des cris dans le plateau. Je souris, faussement timide.</w:t>
+      </w:r>
+    </w:p>
+    <w:p>
+      <w:r>
+        <w:t>« Vich est par-là. » Je vais dans la direction indiquée. Je salue Vich, assis non loin de Mimi. Rien que des trucs qui m’embêtent, aujourd’hui.</w:t>
+      </w:r>
+    </w:p>
+    <w:p>
+      <w:r>
+        <w:t>« Comment tu as su ? Tu as apporté des gâteaux ? »</w:t>
+      </w:r>
+    </w:p>
+    <w:p>
+      <w:r>
+        <w:t>« Oui… » On se regarde, on sait à quoi sert cette mascarade. Créer le buzz, comme le veulent les grands pontes.</w:t>
+      </w:r>
+    </w:p>
+    <w:p>
+      <w:r>
+        <w:lastRenderedPageBreak/>
+        <w:t>Je jette un œil à Mimi. Elle nous regarde aussi. Mon malaise augmente. Je pose les gâteaux sur la table, j’évite son regard.</w:t>
+      </w:r>
+    </w:p>
+    <w:p>
+      <w:r>
+        <w:t>« Bon appétit. Je repars. »</w:t>
+      </w:r>
+    </w:p>
+    <w:p>
+      <w:r>
+        <w:rPr>
+          <w:i/>
+          <w:iCs/>
+        </w:rPr>
+        <w:t>« Pourquoi si vite, Nong Ben ? Tu apportes des gâteaux à Nong Vich, tu pourrais les lui donner devant nous. »</w:t>
+      </w:r>
+      <w:r>
+        <w:t> Le coiffeur insiste. Je ris jaune.</w:t>
+      </w:r>
+    </w:p>
+    <w:p>
+      <w:r>
+        <w:t xml:space="preserve">« </w:t>
+      </w:r>
+      <w:proofErr w:type="spellStart"/>
+      <w:r>
+        <w:t>P’Wi</w:t>
+      </w:r>
+      <w:proofErr w:type="spellEnd"/>
+      <w:r>
+        <w:t xml:space="preserve"> va me gronder. »</w:t>
+      </w:r>
+    </w:p>
+    <w:p>
+      <w:r>
+        <w:rPr>
+          <w:i/>
+          <w:iCs/>
+        </w:rPr>
+        <w:t>« Donne-lui. »</w:t>
+      </w:r>
+      <w:r>
+        <w:t xml:space="preserve"> Je me retourne vers </w:t>
+      </w:r>
+      <w:proofErr w:type="spellStart"/>
+      <w:r>
+        <w:t>P’Wi</w:t>
+      </w:r>
+      <w:proofErr w:type="spellEnd"/>
+      <w:r>
+        <w:t>, furieuse. Il hoche la tête, comme pour dire « Vas-y, comme ça on rentre ».</w:t>
+      </w:r>
+    </w:p>
+    <w:p>
+      <w:r>
+        <w:t>Je m’assois à côté de Vich, j’ouvre les paquets et je les lui donne, le plus naturellement possible. Certains hurlent de joie. Mais du coin de l’œil, je vois Mimi prendre une photo. Je la regarde, méchamment.</w:t>
+      </w:r>
+    </w:p>
+    <w:p>
+      <w:r>
+        <w:t>« Quoi ? Mimi est aussi fan de vous deux. Un couple si parfait~ » Je ne sais pas pourquoi elle a pris cette photo. Pour m’embêter, pour attirer mon attention. Je n’ai plus envie de rester.</w:t>
+      </w:r>
+    </w:p>
+    <w:p>
+      <w:r>
+        <w:t>« Tu repars ? »</w:t>
+      </w:r>
+    </w:p>
+    <w:p>
+      <w:r>
+        <w:t>« Oui. Bon courage. » Je pars.</w:t>
+      </w:r>
+    </w:p>
+    <w:p>
+      <w:r>
+        <w:t>(</w:t>
+      </w:r>
+      <w:r>
+        <w:rPr>
+          <w:i/>
+          <w:iCs/>
+        </w:rPr>
+        <w:t>Dans quelques jours, les journalistes te poseront des questions. Tu répondras que tu es venue encourager ton collègue, un point c’est tout.</w:t>
+      </w:r>
+      <w:r>
+        <w:t>)</w:t>
+      </w:r>
+    </w:p>
+    <w:p>
+      <w:r>
+        <w:t>« Oui. »</w:t>
+      </w:r>
+    </w:p>
+    <w:p>
+      <w:r>
+        <w:t>(</w:t>
+      </w:r>
+      <w:r>
+        <w:rPr>
+          <w:i/>
+          <w:iCs/>
+        </w:rPr>
+        <w:t>Rentre chez toi.</w:t>
+      </w:r>
+      <w:r>
+        <w:t>) Je rentre, sans rien dire.</w:t>
+      </w:r>
+    </w:p>
+    <w:p>
+      <w:r>
+        <w:t>Je suis trop fatiguée, aujourd’hui. Et je n’ai pas eu ma recharge d’énergie. Je prends mes clés, conduis jusqu’au condo de Bel.</w:t>
+      </w:r>
+    </w:p>
+    <w:p>
+      <w:r>
+        <w:t>Je traverse les bouchons. Dès que j’arrive, je monte. La porte de la chambre ouverte, j’entends l’eau de la douche. Je sais qu’elle n’est pas loin.</w:t>
+      </w:r>
+    </w:p>
+    <w:p>
+      <w:r>
+        <w:t>« Bel… je suis là. » Je colle mes lèvres à la porte de la salle de bain, câline. Pas de réponse.</w:t>
+      </w:r>
+    </w:p>
+    <w:p>
+      <w:r>
+        <w:t>« Bel… »</w:t>
+      </w:r>
+    </w:p>
+    <w:p>
+      <w:r>
+        <w:rPr>
+          <w:i/>
+          <w:iCs/>
+        </w:rPr>
+        <w:t>Clac.</w:t>
+      </w:r>
+    </w:p>
+    <w:p>
+      <w:r>
+        <w:t>La porte s’ouvre. Mon cœur s’arrête. Mes jambes ne bougent plus. La beauté familière du visage, combinée aux battements fous de mon cœur…</w:t>
+      </w:r>
+    </w:p>
+    <w:p>
+      <w:r>
+        <w:t>Pourquoi est-elle dans l’appartement de Bel ?</w:t>
+      </w:r>
+    </w:p>
+    <w:p>
+      <w:r>
+        <w:t>« Comment es-tu entrée ? Comment es-tu entrée, Mimi ! »</w:t>
+      </w:r>
+    </w:p>
+    <w:p/>
+    <w:p>
+      <w:pPr>
+        <w:rPr>
+          <w:b/>
+          <w:bCs/>
+          <w:sz w:val="40"/>
+          <w:szCs w:val="40"/>
+        </w:rPr>
+      </w:pPr>
+      <w:r>
+        <w:rPr>
+          <w:b/>
+          <w:bCs/>
+          <w:sz w:val="40"/>
+          <w:szCs w:val="40"/>
+        </w:rPr>
+        <w:lastRenderedPageBreak/>
+        <w:t>Chapitre 26</w:t>
+      </w:r>
+    </w:p>
+    <w:p>
+      <w:pPr>
+        <w:rPr>
+          <w:b/>
+          <w:bCs/>
+          <w:sz w:val="40"/>
+          <w:szCs w:val="40"/>
+        </w:rPr>
+      </w:pPr>
+    </w:p>
+    <w:p>
+      <w:pPr>
+        <w:rPr>
+          <w:b/>
+          <w:bCs/>
+          <w:sz w:val="40"/>
+          <w:szCs w:val="40"/>
+        </w:rPr>
+      </w:pPr>
+    </w:p>
+    <w:p>
+      <w:r>
+        <w:rPr>
+          <w:i/>
+          <w:iCs/>
+        </w:rPr>
+        <w:t>Han.</w:t>
+      </w:r>
+    </w:p>
+    <w:p>
+      <w:r>
+        <w:t>« Qu'est-ce qu'il y a ? Tu m'as fait peur ! »</w:t>
+      </w:r>
+    </w:p>
+    <w:p>
+      <w:r>
+        <w:t>« Où suis-je ? » Je regarde à gauche, à droite, comme si je sortais d'un rêve. Qu'est-ce que c'était que ce bordel ?</w:t>
+      </w:r>
+    </w:p>
+    <w:p>
+      <w:r>
+        <w:t>« Je te raccompagnais à la maison. Qu'est-ce que tu as ? »</w:t>
+      </w:r>
+    </w:p>
+    <w:p>
+      <w:r>
+        <w:t>« On vient d'apporter des gâteaux à Vich ? »</w:t>
+      </w:r>
+    </w:p>
+    <w:p>
+      <w:r>
+        <w:t>« Oui. »</w:t>
+      </w:r>
+    </w:p>
+    <w:p>
+      <w:r>
+        <w:t>« Un rêve… » Je marmonne, me frotte le visage, puis expire bruyamment plusieurs fois.</w:t>
+      </w:r>
+    </w:p>
+    <w:p>
+      <w:r>
+        <w:t xml:space="preserve">« Qu'est-ce qui se passe, bon sang ? » </w:t>
+      </w:r>
+      <w:proofErr w:type="spellStart"/>
+      <w:r>
+        <w:t>P'Wi</w:t>
+      </w:r>
+      <w:proofErr w:type="spellEnd"/>
+      <w:r>
+        <w:t xml:space="preserve"> pose sa main sur mon épaule, inquiet. Je hoche la tête.</w:t>
+      </w:r>
+    </w:p>
+    <w:p>
+      <w:r>
+        <w:t>« Un cauchemar. Tu peux me déposer au condo de Bel ? »</w:t>
+      </w:r>
+    </w:p>
+    <w:p>
+      <w:r>
+        <w:t>« Maintenant ? »</w:t>
+      </w:r>
+    </w:p>
+    <w:p>
+      <w:r>
+        <w:t>« Oui… »</w:t>
+      </w:r>
+    </w:p>
+    <w:p>
+      <w:r>
+        <w:t>Je me regarde dans le rétroviseur : mon visage est si tendu qu'il accepte de m'y emmener, même s'il n'est pas très chaud.</w:t>
+      </w:r>
+    </w:p>
+    <w:p>
+      <w:r>
+        <w:t>Une demi-heure plus tard, je suis dans l'appartement de Bel. Il est silencieux, comme vide. Je fais le tour, puis pousse la porte de sa chambre. Dès que j'entre, l'eau de la douche coule. L'image de mon rêve me revient.</w:t>
+      </w:r>
+    </w:p>
+    <w:p>
+      <w:proofErr w:type="spellStart"/>
+      <w:r>
+        <w:rPr>
+          <w:i/>
+          <w:iCs/>
+        </w:rPr>
+        <w:t>Thump</w:t>
+      </w:r>
+      <w:proofErr w:type="spellEnd"/>
+      <w:r>
+        <w:rPr>
+          <w:i/>
+          <w:iCs/>
+        </w:rPr>
+        <w:t xml:space="preserve"> </w:t>
+      </w:r>
+      <w:proofErr w:type="spellStart"/>
+      <w:r>
+        <w:rPr>
+          <w:i/>
+          <w:iCs/>
+        </w:rPr>
+        <w:t>thump</w:t>
+      </w:r>
+      <w:proofErr w:type="spellEnd"/>
+      <w:r>
+        <w:rPr>
+          <w:i/>
+          <w:iCs/>
+        </w:rPr>
+        <w:t xml:space="preserve">. </w:t>
+      </w:r>
+      <w:proofErr w:type="spellStart"/>
+      <w:r>
+        <w:rPr>
+          <w:i/>
+          <w:iCs/>
+        </w:rPr>
+        <w:t>Thump</w:t>
+      </w:r>
+      <w:proofErr w:type="spellEnd"/>
+      <w:r>
+        <w:rPr>
+          <w:i/>
+          <w:iCs/>
+        </w:rPr>
+        <w:t xml:space="preserve"> </w:t>
+      </w:r>
+      <w:proofErr w:type="spellStart"/>
+      <w:r>
+        <w:rPr>
+          <w:i/>
+          <w:iCs/>
+        </w:rPr>
+        <w:t>thump</w:t>
+      </w:r>
+      <w:proofErr w:type="spellEnd"/>
+      <w:r>
+        <w:rPr>
+          <w:i/>
+          <w:iCs/>
+        </w:rPr>
+        <w:t>.</w:t>
+      </w:r>
+    </w:p>
+    <w:p>
+      <w:r>
+        <w:t>J'ai peur.</w:t>
+      </w:r>
+      <w:r>
+        <w:br/>
+        <w:t>Oui… j'ai peur que celle qui est derrière cette porte ne soit pas Bel. Mais en arriver là, puis reculer et me laisser hanter par ce rêve stupide… ce n'est pas possible.</w:t>
+      </w:r>
+    </w:p>
+    <w:p>
+      <w:r>
+        <w:t>« B… Bel, tu te douches ? » Je colle mes lèvres à la porte. L'eau s'arrête.</w:t>
+      </w:r>
+    </w:p>
+    <w:p>
+      <w:r>
+        <w:t>« … »</w:t>
+      </w:r>
+    </w:p>
+    <w:p>
+      <w:r>
+        <w:t>« Bel… je suis là. »</w:t>
+      </w:r>
+    </w:p>
+    <w:p>
+      <w:r>
+        <w:t>« C'est Ben ? » La voix de la femme que j'aime résonne. Toute mon angoisse disparaît.</w:t>
+      </w:r>
+    </w:p>
+    <w:p>
+      <w:r>
+        <w:rPr>
+          <w:i/>
+          <w:iCs/>
+        </w:rPr>
+        <w:lastRenderedPageBreak/>
+        <w:t>Clac.</w:t>
+      </w:r>
+    </w:p>
+    <w:p>
+      <w:r>
+        <w:t>Elle passe la tête, couverte de mousse et de shampooing. Je ris doucement, soulagée : celle qui est dans la salle de bain est toujours celle que j'aime.</w:t>
+      </w:r>
+    </w:p>
+    <w:p>
+      <w:r>
+        <w:t>« Oh, le shampooing m'est tombé dans l'œil ! » Elle rentre. Je la suis. J'ouvre l'eau, lui rince doucement les cheveux. Ses beaux yeux s'ouvrent, le blanc de l'œil légèrement injecté de sang.</w:t>
+      </w:r>
+    </w:p>
+    <w:p>
+      <w:r>
+        <w:t>Mes lèvres se posent sur ses paupières. J'enlève mon tee-shirt, tranquillement. Elle me regarde, surprise, mais ne proteste pas.</w:t>
+      </w:r>
+    </w:p>
+    <w:p>
+      <w:r>
+        <w:t>« Tu m'as tellement manqué. » On s'embrasse, goulûment. Comme si on s'était quittées depuis longtemps. Ou peut-être que c'est moi qui ai trop besoin d'elle. Je dois trouver un moyen de dissiper cette angoisse, sinon je vais devenir folle à faire des cauchemars encore et encore.</w:t>
+      </w:r>
+    </w:p>
+    <w:p>
+      <w:r>
+        <w:t>« Tu vas être trempée. » Ses yeux sont rouges, son visage encore plus.</w:t>
+      </w:r>
+    </w:p>
+    <w:p>
+      <w:r>
+        <w:t>« Ben peut être plus trempée que ça. Tu as bu</w:t>
+      </w:r>
+      <w:proofErr w:type="gramStart"/>
+      <w:r>
+        <w:t xml:space="preserve"> ?…</w:t>
+      </w:r>
+      <w:proofErr w:type="gramEnd"/>
+      <w:r>
+        <w:t xml:space="preserve"> » L'odeur familière me frappe. Elle hoche la tête, comme si elle ne voulait pas répondre.</w:t>
+      </w:r>
+    </w:p>
+    <w:p>
+      <w:r>
+        <w:t>« Pourquoi tu as bu ? »</w:t>
+      </w:r>
+    </w:p>
+    <w:p>
+      <w:r>
+        <w:t>« Je n'avais rien à faire… » Comme si elle cherchait une excuse, pour que je ne la gronde pas. Ça me donne encore plus envie de l'aimer.</w:t>
+      </w:r>
+    </w:p>
+    <w:p>
+      <w:r>
+        <w:t>« Tant mieux. Parce qu'à partir de maintenant, tu n'auras plus un moment de libre. » Je la plaque contre le mur de la salle de bain, caresse sa joue, l'embrasse à nouveau.</w:t>
+      </w:r>
+    </w:p>
+    <w:p>
+      <w:r>
+        <w:t>On s'embrasse longtemps, tout en me caressant.</w:t>
+      </w:r>
+    </w:p>
+    <w:p>
+      <w:r>
+        <w:t>« Quelque chose ne va pas ? »</w:t>
+      </w:r>
+    </w:p>
+    <w:p>
+      <w:r>
+        <w:t>« Est-ce que Bel aime Ben ? »</w:t>
+      </w:r>
+    </w:p>
+    <w:p>
+      <w:r>
+        <w:t>« … »</w:t>
+      </w:r>
+    </w:p>
+    <w:p>
+      <w:r>
+        <w:t>« Tu m'aimes, oui ou non ? »</w:t>
+      </w:r>
+    </w:p>
+    <w:p>
+      <w:r>
+        <w:t>« Tu n'as même pas besoin de poser la question. » Elle m'attire contre elle, comme pour le prouver par des actes plutôt que des paroles. Mon angoisse est partie, mais je me sens quand même mal. Peut-être parce que j'ai trop de choses en tête : le contrat avec Bel, mon envie d'arrêter d'être actrice, l'ouverture du café… J'ai l'impression de tout mener de front, ce qui me stresse plus que jamais.</w:t>
+      </w:r>
+      <w:r>
+        <w:br/>
+        <w:t>Au fond de moi, je m'inquiète d'échouer dans tout.</w:t>
+      </w:r>
+    </w:p>
+    <w:p>
+      <w:r>
+        <w:lastRenderedPageBreak/>
+        <w:t>Toutes ces pensées se mélangent à notre désir. Soudain, je me retrouve sur le lit. Bel est nue, moi, j'ai encore un short. Elle embrasse mon cou, glisse la main dans mon short, la fermeture déjà ouverte.</w:t>
+      </w:r>
+    </w:p>
+    <w:p>
+      <w:r>
+        <w:t>Mon cœur hésite, puis mes soucis disparaissent. Je ne suis pas pleinement heureuse, mais au moins, ce moment est à moi.</w:t>
+      </w:r>
+    </w:p>
+    <w:p>
+      <w:r>
+        <w:t>« Mmm… » Elle accélère. Je m'agrippe aux draps. On dirait qu'elle est en colère, mais non, elle est juste ravie de mener le jeu.</w:t>
+      </w:r>
+    </w:p>
+    <w:p>
+      <w:r>
+        <w:t>Un jeu dont, quelle que soit l'issue, je suis gagnante.</w:t>
+      </w:r>
+    </w:p>
+    <w:p>
+      <w:r>
+        <w:t>« </w:t>
+      </w:r>
+      <w:proofErr w:type="spellStart"/>
+      <w:r>
+        <w:rPr>
+          <w:i/>
+          <w:iCs/>
+        </w:rPr>
+        <w:t>Heuh</w:t>
+      </w:r>
+      <w:proofErr w:type="spellEnd"/>
+      <w:r>
+        <w:t>… »</w:t>
+      </w:r>
+    </w:p>
+    <w:p>
+      <w:r>
+        <w:t>Je ferme les yeux, épuisée. Elle me caresse les cheveux.</w:t>
+      </w:r>
+    </w:p>
+    <w:p>
+      <w:r>
+        <w:t xml:space="preserve">« Tu travailles, demain ? » Je </w:t>
+      </w:r>
+      <w:r>
+        <w:t>hoche</w:t>
+      </w:r>
+      <w:r>
+        <w:t xml:space="preserve"> la tête, porte sa main à ma joue, câline.</w:t>
+      </w:r>
+    </w:p>
+    <w:p>
+      <w:r>
+        <w:t>« Alors dors. Bel veillera sur toi jusqu'à ce que tu t'endormes. » Juste cette phrase, et ma fatigue augmente. Je m'endors facilement.</w:t>
+      </w:r>
+    </w:p>
+    <w:p>
+      <w:r>
+        <w:t>« Ben ne te quittera jamais. »</w:t>
+      </w:r>
+    </w:p>
+    <w:p>
+      <w:r>
+        <w:t>Sa voix, avant que je ne m'endorme, me rassure. C'est comme si elle se donnait la certitude que je ne la quitterai pas.</w:t>
+      </w:r>
+    </w:p>
+    <w:p>
+      <w:r>
+        <w:t>Oui… Je ne quitterai jamais Bel.</w:t>
+      </w:r>
+    </w:p>
+    <w:p>
+      <w:r>
+        <w:t>« On part en voyage ! »</w:t>
+      </w:r>
+    </w:p>
+    <w:p>
+      <w:r>
+        <w:t>Je suis si excitée que la doctoresse, qui prépare des sandwiches, lève la tête.</w:t>
+      </w:r>
+    </w:p>
+    <w:p>
+      <w:r>
+        <w:t>« On y va quand ? »</w:t>
+      </w:r>
+    </w:p>
+    <w:p>
+      <w:r>
+        <w:t xml:space="preserve">« Tout de suite. » Je lui souris, prends mon téléphone et envoie un message à </w:t>
+      </w:r>
+      <w:proofErr w:type="spellStart"/>
+      <w:r>
+        <w:t>P'Wi</w:t>
+      </w:r>
+      <w:proofErr w:type="spellEnd"/>
+      <w:r>
+        <w:t xml:space="preserve"> pour qu'il réserve. Bel m'avait envoyé des photos de la mer, en disant qu'elle avait envie d'y aller. C'est parfait. Je l'emmène dans un endroit calme, intime, où j'étais déjà allée l'année dernière.</w:t>
+      </w:r>
+    </w:p>
+    <w:p>
+      <w:r>
+        <w:t>« On n'a que deux jours de repos, Ben. C'est épuisant de partir. Autant rester ici, on ne croise personne. »</w:t>
+      </w:r>
+    </w:p>
+    <w:p>
+      <w:r>
+        <w:t>« En semaine, il n'y a personne. Bel a envie d'y aller. On va à la mer. »</w:t>
+      </w:r>
+    </w:p>
+    <w:p>
+      <w:r>
+        <w:t>« J'ai peur que tu sois fatiguée. »</w:t>
+      </w:r>
+    </w:p>
+    <w:p>
+      <w:r>
+        <w:t>« Mais j'ai déjà réservé… » Je lui montre mon téléphone. Elle n'ose pas refuser. Elle en a autant envie que moi.</w:t>
+      </w:r>
+    </w:p>
+    <w:p>
+      <w:r>
+        <w:t>« Alors qu'est-ce qu'on attend ! On va faire les valises ! »</w:t>
+      </w:r>
+    </w:p>
+    <w:p>
+      <w:r>
+        <w:t>« Ouais ! »</w:t>
+      </w:r>
+    </w:p>
+    <w:p>
+      <w:r>
+        <w:lastRenderedPageBreak/>
+        <w:t xml:space="preserve">Deux heures de route, un peu de bateau, et nous voilà à Koh </w:t>
+      </w:r>
+      <w:proofErr w:type="spellStart"/>
+      <w:r>
+        <w:t>Sichang</w:t>
+      </w:r>
+      <w:proofErr w:type="spellEnd"/>
+      <w:r>
+        <w:t>, l’île où j’étais venue me cacher. Mais cette fois, la personne que je fuyais est là, avec moi.</w:t>
+      </w:r>
+    </w:p>
+    <w:p>
+      <w:r>
+        <w:t>J’ai ma casquette, mes lunettes, mon masque. Comme au cinéma. La différence, c’est qu’il fait une chaleur à crever. Même avec le vent, je suis presque morte.</w:t>
+      </w:r>
+    </w:p>
+    <w:p>
+      <w:r>
+        <w:t>« Ça va ? » Elle prend mon sac, me fait de l’air avec un éventail, comme si j’allais m’évanouir.</w:t>
+      </w:r>
+    </w:p>
+    <w:p>
+      <w:r>
+        <w:t>« Presque pas. On va à l’hôtel. » Elle me prend la main.</w:t>
+      </w:r>
+    </w:p>
+    <w:p>
+      <w:r>
+        <w:t>Mon cœur gonflé, j’oublie un instant la chaleur. Qui aurait cru qu’un voyage avec celle qu’on aime serait aussi génial ? C’est la première fois qu’on fait vraiment quelque chose ensemble. Je me sens si bien, même s’il fait une chaleur d’enfer.</w:t>
+      </w:r>
+    </w:p>
+    <w:p>
+      <w:r>
+        <w:t>« Ah ! »</w:t>
+      </w:r>
+    </w:p>
+    <w:p>
+      <w:r>
+        <w:t>La chaleur extérieure n’est rien comparée à celle de la doctoresse, qui se déchaîne sur le lit. Qui aurait cru que cette femme si douce, si attentionnée, deviendrait aussi brûlante au lit ? À vingt degrés, la clim n’arrive pas à refroidir l’atmosphère.</w:t>
+      </w:r>
+    </w:p>
+    <w:p>
+      <w:r>
+        <w:t>Elle me touche encore le ventre, alors qu’elle sait que la dernière fois, je n’arrive même pas à reprendre mon souffle. On dirait qu’elle veut me torturer à mort, elle ranime mon désir.</w:t>
+      </w:r>
+    </w:p>
+    <w:p>
+      <w:r>
+        <w:t>« Tu sais que je suis fragile… </w:t>
+      </w:r>
+      <w:proofErr w:type="spellStart"/>
+      <w:r>
+        <w:rPr>
+          <w:i/>
+          <w:iCs/>
+        </w:rPr>
+        <w:t>Heuh</w:t>
+      </w:r>
+      <w:proofErr w:type="spellEnd"/>
+      <w:r>
+        <w:t>… et tu en profites. » Je lui prends les épaules, comme pour la gronder, mais c’est un compliment.</w:t>
+      </w:r>
+    </w:p>
+    <w:p>
+      <w:r>
+        <w:t>« Bel ne sait pas que tu es fragile. Elle sait juste que tu aimes ça. »</w:t>
+      </w:r>
+    </w:p>
+    <w:p>
+      <w:proofErr w:type="spellStart"/>
+      <w:r>
+        <w:rPr>
+          <w:i/>
+          <w:iCs/>
+        </w:rPr>
+        <w:t>Thump</w:t>
+      </w:r>
+      <w:proofErr w:type="spellEnd"/>
+      <w:r>
+        <w:rPr>
+          <w:i/>
+          <w:iCs/>
+        </w:rPr>
+        <w:t xml:space="preserve"> </w:t>
+      </w:r>
+      <w:proofErr w:type="spellStart"/>
+      <w:r>
+        <w:rPr>
+          <w:i/>
+          <w:iCs/>
+        </w:rPr>
+        <w:t>thump</w:t>
+      </w:r>
+      <w:proofErr w:type="spellEnd"/>
+      <w:r>
+        <w:rPr>
+          <w:i/>
+          <w:iCs/>
+        </w:rPr>
+        <w:t xml:space="preserve">. </w:t>
+      </w:r>
+      <w:proofErr w:type="spellStart"/>
+      <w:r>
+        <w:rPr>
+          <w:i/>
+          <w:iCs/>
+        </w:rPr>
+        <w:t>Thump</w:t>
+      </w:r>
+      <w:proofErr w:type="spellEnd"/>
+      <w:r>
+        <w:rPr>
+          <w:i/>
+          <w:iCs/>
+        </w:rPr>
+        <w:t xml:space="preserve"> </w:t>
+      </w:r>
+      <w:proofErr w:type="spellStart"/>
+      <w:r>
+        <w:rPr>
+          <w:i/>
+          <w:iCs/>
+        </w:rPr>
+        <w:t>thump</w:t>
+      </w:r>
+      <w:proofErr w:type="spellEnd"/>
+      <w:r>
+        <w:rPr>
+          <w:i/>
+          <w:iCs/>
+        </w:rPr>
+        <w:t>.</w:t>
+      </w:r>
+    </w:p>
+    <w:p>
+      <w:r>
+        <w:t>Je souris à ces mots simples, attentionnés. Comment ne pas fondre ? Tellement de facettes, je ne sais plus laquelle est la vraie. Mais ce qui est étrange, c’est que je les aime toutes. Le seul défaut, c’est sa force. Où trouve-t-elle l’énergie, elle qui travaille presque tous les jours, pour me tenir tête sans jamais faiblir ?</w:t>
+      </w:r>
+    </w:p>
+    <w:p>
+      <w:r>
+        <w:t>« Ben est de plus en plus amoureuse, chaque jour… »</w:t>
+      </w:r>
+    </w:p>
+    <w:p>
+      <w:r>
+        <w:t>« Ben le sera encore plus. »</w:t>
+      </w:r>
+    </w:p>
+    <w:p>
+      <w:r>
+        <w:t>« Ah ! »</w:t>
+      </w:r>
+    </w:p>
+    <w:p>
+      <w:r>
+        <w:t>On a joué longtemps. Le soleil se couche. La vue sur la piscine privée est superbe. On s’y baigne, on s’enlace, on regarde le coucher de soleil, sans peur d’être vues.</w:t>
+      </w:r>
+    </w:p>
+    <w:p>
+      <w:r>
+        <w:t>Elle me tient par-derrière, le menton sur mon épaule. C’est câlin. Si je n’étais pas aussi fatiguée, je la plaquerais contre le bord de la piscine.</w:t>
+      </w:r>
+    </w:p>
+    <w:p>
+      <w:r>
+        <w:t>« On peut appeler ça notre premier vrai voyage ? » Elle m’embrasse la joue.</w:t>
+      </w:r>
+    </w:p>
+    <w:p>
+      <w:r>
+        <w:lastRenderedPageBreak/>
+        <w:t>« Si on oublie le cinéma, les restos, Bangkok… oui, sans doute. » Je l’embrasse sur la tempe, elle sourit.</w:t>
+      </w:r>
+    </w:p>
+    <w:p>
+      <w:r>
+        <w:t>« Le coucher de soleil est magnifique. »</w:t>
+      </w:r>
+    </w:p>
+    <w:p>
+      <w:r>
+        <w:t>« Mmm… »</w:t>
+      </w:r>
+    </w:p>
+    <w:p>
+      <w:r>
+        <w:t xml:space="preserve">« Si beau que je </w:t>
+      </w:r>
+      <w:proofErr w:type="gramStart"/>
+      <w:r>
+        <w:t>n’ai</w:t>
+      </w:r>
+      <w:proofErr w:type="gramEnd"/>
+      <w:r>
+        <w:t xml:space="preserve"> plus envie de travailler. On s’enfuit un mois, non ? »</w:t>
+      </w:r>
+    </w:p>
+    <w:p>
+      <w:r>
+        <w:t>« Tu parles comme si tu pouvais laisser tes patients. Quelqu’un comme toi ne laisse personne tomber. »</w:t>
+      </w:r>
+    </w:p>
+    <w:p>
+      <w:r>
+        <w:t>« C’est vrai… » Elle rit, me serre plus fort. Je ne dis rien. Plus elle me serre, plus je me sens en sécurité.</w:t>
+      </w:r>
+    </w:p>
+    <w:p>
+      <w:proofErr w:type="spellStart"/>
+      <w:r>
+        <w:rPr>
+          <w:b/>
+          <w:bCs/>
+        </w:rPr>
+        <w:t>P’Vee</w:t>
+      </w:r>
+      <w:proofErr w:type="spellEnd"/>
+      <w:r>
+        <w:rPr>
+          <w:b/>
+          <w:bCs/>
+        </w:rPr>
+        <w:t xml:space="preserve"> :</w:t>
+      </w:r>
+      <w:r>
+        <w:t> Tu kiffes, hein !</w:t>
+      </w:r>
+    </w:p>
+    <w:p>
+      <w:r>
+        <w:rPr>
+          <w:b/>
+          <w:bCs/>
+        </w:rPr>
+        <w:t>Ben :</w:t>
+      </w:r>
+      <w:r>
+        <w:t> Quoi ?</w:t>
+      </w:r>
+    </w:p>
+    <w:p>
+      <w:proofErr w:type="spellStart"/>
+      <w:r>
+        <w:rPr>
+          <w:b/>
+          <w:bCs/>
+        </w:rPr>
+        <w:t>P’Vee</w:t>
+      </w:r>
+      <w:proofErr w:type="spellEnd"/>
+      <w:r>
+        <w:rPr>
+          <w:b/>
+          <w:bCs/>
+        </w:rPr>
+        <w:t xml:space="preserve"> :</w:t>
+      </w:r>
+      <w:r>
+        <w:t xml:space="preserve"> Oh là </w:t>
+      </w:r>
+      <w:proofErr w:type="spellStart"/>
+      <w:r>
+        <w:t>là</w:t>
+      </w:r>
+      <w:proofErr w:type="spellEnd"/>
+      <w:r>
+        <w:t>, faut que je te le dise ? Réserver une chambre à prix d’or, ce n’est pas pour y dormir.</w:t>
+      </w:r>
+    </w:p>
+    <w:p>
+      <w:r>
+        <w:rPr>
+          <w:b/>
+          <w:bCs/>
+        </w:rPr>
+        <w:t>Ben :</w:t>
+      </w:r>
+      <w:r>
+        <w:t> Tu sais tout, toi. Tu dors sous le lit ?</w:t>
+      </w:r>
+    </w:p>
+    <w:p>
+      <w:proofErr w:type="spellStart"/>
+      <w:r>
+        <w:rPr>
+          <w:b/>
+          <w:bCs/>
+        </w:rPr>
+        <w:t>P’Vee</w:t>
+      </w:r>
+      <w:proofErr w:type="spellEnd"/>
+      <w:r>
+        <w:rPr>
+          <w:b/>
+          <w:bCs/>
+        </w:rPr>
+        <w:t xml:space="preserve"> :</w:t>
+      </w:r>
+      <w:r>
+        <w:t> Pas sous le lit, mais je t’ai attendue en bas de l’escalier, oui.</w:t>
+      </w:r>
+    </w:p>
+    <w:p>
+      <w:r>
+        <w:rPr>
+          <w:b/>
+          <w:bCs/>
+        </w:rPr>
+        <w:t>Ben :</w:t>
+      </w:r>
+      <w:r>
+        <w:t> Aïe ! Tu m’appelles juste pour te moquer ?</w:t>
+      </w:r>
+    </w:p>
+    <w:p>
+      <w:proofErr w:type="spellStart"/>
+      <w:r>
+        <w:rPr>
+          <w:b/>
+          <w:bCs/>
+        </w:rPr>
+        <w:t>P’Vee</w:t>
+      </w:r>
+      <w:proofErr w:type="spellEnd"/>
+      <w:r>
+        <w:rPr>
+          <w:b/>
+          <w:bCs/>
+        </w:rPr>
+        <w:t xml:space="preserve"> :</w:t>
+      </w:r>
+      <w:r>
+        <w:t> Non. Pour te dire que le boulot d’après-demain est décalé à dix-huit heures. Tu peux passer chez moi, si tu veux te… prolonger avec ta doctoresse.</w:t>
+      </w:r>
+    </w:p>
+    <w:p>
+      <w:r>
+        <w:rPr>
+          <w:i/>
+          <w:iCs/>
+        </w:rPr>
+        <w:t>Prout ! Boum !</w:t>
+      </w:r>
+    </w:p>
+    <w:p>
+      <w:r>
+        <w:t>Avant que j’aie le temps de répondre, mon téléphone s’envole, atterrit dans la panière de linge sale. Heureusement, il n’est pas tombé par terre.</w:t>
+      </w:r>
+    </w:p>
+    <w:p>
+      <w:r>
+        <w:t>« Tu jettes mon téléphone, pourquoi… » Pas le temps de finir ma phrase, elle m’embrasse, et je sens couler quelque chose.</w:t>
+      </w:r>
+      <w:r>
+        <w:br/>
+        <w:t>Un bon vin, qu’on avait apporté. Elle me le donne de sa bouche. J’en oublie tout.</w:t>
+      </w:r>
+    </w:p>
+    <w:p>
+      <w:r>
+        <w:t>Je regarde ses yeux provocateurs. Je pense à une scène de film. Mais dans mon histoire à moi, Bel est en train de me provoquer, et mon cœur s’emballe.</w:t>
+      </w:r>
+    </w:p>
+    <w:p>
+      <w:r>
+        <w:t>« Tu ne veux pas faire autre chose ? » Je lui caresse le ventre, elle défait sa ceinture.</w:t>
+      </w:r>
+    </w:p>
+    <w:p>
+      <w:r>
+        <w:t>« Arrête de m’exciter. »</w:t>
+      </w:r>
+    </w:p>
+    <w:p>
+      <w:r>
+        <w:t>« Idiote… »</w:t>
+      </w:r>
+    </w:p>
+    <w:p>
+      <w:r>
+        <w:t>« Te posséder tout le temps, Bel ne sait pas si ça suffit… »</w:t>
+      </w:r>
+    </w:p>
+    <w:p>
+      <w:r>
+        <w:lastRenderedPageBreak/>
+        <w:t>Je ne sais où elle trouve toutes ces paroles sexy. Mais à chaque fois, je me laisse faire. Je peux tout lui donner, sans discuter.</w:t>
+      </w:r>
+    </w:p>
+    <w:p>
+      <w:r>
+        <w:t>La nuit, douce et brûlante, passe vite. Dommage que le temps file, mais ça vaut le coup.</w:t>
+      </w:r>
+    </w:p>
+    <w:p>
+      <w:r>
+        <w:t>Le matin, on a commandé à manger, puis on a nagé dans la piscine privée. La mer nous faisait envie, mais on sait que plus personne ne sait que je suis là, mieux c’est.</w:t>
+      </w:r>
+    </w:p>
+    <w:p>
+      <w:r>
+        <w:t>« On change d’air ? » Elle enlève mon bikini. Pas de réponse, elle n’attend pas.</w:t>
+      </w:r>
+    </w:p>
+    <w:p>
+      <w:r>
+        <w:t>« Bonne idée ? »</w:t>
+      </w:r>
+    </w:p>
+    <w:p>
+      <w:r>
+        <w:t>« Tu ne sauras pas si tu n’essaies pas. » Elle enlève tout, jette le haut et la culotte hors de l’eau, comme si j’allais changer d’avis.</w:t>
+      </w:r>
+    </w:p>
+    <w:p>
+      <w:r>
+        <w:t>« Encore Ben ? » Je passe mes bras autour de son cou. J’ai l’air de me plaindre, mais mon corps est tellement d’accord qu’elle sourit.</w:t>
+      </w:r>
+    </w:p>
+    <w:p>
+      <w:r>
+        <w:t>« Il n’y a que toi, Ben… »</w:t>
+      </w:r>
+    </w:p>
+    <w:p>
+      <w:r>
+        <w:t>Les bons moments passent toujours vite. Mais cette phrase, mille fois répétée, est toujours vraie quand je suis avec ma belle doctoresse, qui prolonge mon bonheur.</w:t>
+      </w:r>
+    </w:p>
+    <w:p>
+      <w:r>
+        <w:t xml:space="preserve">Qui aurait cru que, deux heures avant mon boulot, elle conduirait jusqu’à la maison de </w:t>
+      </w:r>
+      <w:proofErr w:type="spellStart"/>
+      <w:r>
+        <w:t>P’Wi</w:t>
+      </w:r>
+      <w:proofErr w:type="spellEnd"/>
+      <w:r>
+        <w:t xml:space="preserve"> pour me redonner de l’énergie ?</w:t>
+      </w:r>
+    </w:p>
+    <w:p>
+      <w:r>
+        <w:t>« </w:t>
+      </w:r>
+      <w:proofErr w:type="spellStart"/>
+      <w:r>
+        <w:rPr>
+          <w:i/>
+          <w:iCs/>
+        </w:rPr>
+        <w:t>Heuh</w:t>
+      </w:r>
+      <w:proofErr w:type="spellEnd"/>
+      <w:r>
+        <w:t>. </w:t>
+      </w:r>
+      <w:proofErr w:type="spellStart"/>
+      <w:r>
+        <w:rPr>
+          <w:i/>
+          <w:iCs/>
+        </w:rPr>
+        <w:t>Heuh</w:t>
+      </w:r>
+      <w:proofErr w:type="spellEnd"/>
+      <w:r>
+        <w:t>… »</w:t>
+      </w:r>
+    </w:p>
+    <w:p>
+      <w:proofErr w:type="spellStart"/>
+      <w:r>
+        <w:rPr>
+          <w:i/>
+          <w:iCs/>
+        </w:rPr>
+        <w:t>Criiit</w:t>
+      </w:r>
+      <w:proofErr w:type="spellEnd"/>
+      <w:r>
+        <w:rPr>
+          <w:i/>
+          <w:iCs/>
+        </w:rPr>
+        <w:t>.</w:t>
+      </w:r>
+    </w:p>
+    <w:p>
+      <w:r>
+        <w:t>« </w:t>
+      </w:r>
+      <w:proofErr w:type="spellStart"/>
+      <w:r>
+        <w:rPr>
+          <w:i/>
+          <w:iCs/>
+        </w:rPr>
+        <w:t>Heuh</w:t>
+      </w:r>
+      <w:proofErr w:type="spellEnd"/>
+      <w:r>
+        <w:t>… Mmm… Ben… »</w:t>
+      </w:r>
+    </w:p>
+    <w:p>
+      <w:proofErr w:type="spellStart"/>
+      <w:r>
+        <w:rPr>
+          <w:i/>
+          <w:iCs/>
+        </w:rPr>
+        <w:t>Criiit</w:t>
+      </w:r>
+      <w:proofErr w:type="spellEnd"/>
+      <w:r>
+        <w:rPr>
+          <w:i/>
+          <w:iCs/>
+        </w:rPr>
+        <w:t>.</w:t>
+      </w:r>
+    </w:p>
+    <w:p>
+      <w:r>
+        <w:t>« R… Réponds… Ben. » Elle a l’air de manquer d’air, les yeux fermés sur l’oreiller. C’est sexy, j’ai envie de la dévorer.</w:t>
+      </w:r>
+    </w:p>
+    <w:p>
+      <w:r>
+        <w:t>« Je ne veux pas. Bel est si belle… » J’accélère, elle tremble. Elle n’en a plus pour longtemps.</w:t>
+      </w:r>
+    </w:p>
+    <w:p>
+      <w:r>
+        <w:rPr>
+          <w:i/>
+          <w:iCs/>
+        </w:rPr>
+        <w:t>Han.</w:t>
+      </w:r>
+    </w:p>
+    <w:p>
+      <w:r>
+        <w:t xml:space="preserve">Quand tout revient à la normale, je l’embrasse, puis vais me doucher. </w:t>
+      </w:r>
+      <w:proofErr w:type="spellStart"/>
+      <w:r>
+        <w:t>P’Wi</w:t>
+      </w:r>
+      <w:proofErr w:type="spellEnd"/>
+      <w:r>
+        <w:t xml:space="preserve"> ne va pas tarder.</w:t>
+      </w:r>
+    </w:p>
+    <w:p>
+      <w:r>
+        <w:t>« Va te doucher aussi. »</w:t>
+      </w:r>
+    </w:p>
+    <w:p>
+      <w:r>
+        <w:t>« Je suis fatiguée. »</w:t>
+      </w:r>
+    </w:p>
+    <w:p>
+      <w:r>
+        <w:t>« Menteuse. Quelqu’un d’infatigable comme toi ne connaît pas la fatigue. » Je ris, la tire vers moi. Elle attrape une serviette.</w:t>
+      </w:r>
+    </w:p>
+    <w:p>
+      <w:r>
+        <w:t>« Tu peux mettre les vêtements de Ben, dans l’armoire ? » Je hoche la tête. Tous neufs, achetés exprès pour qu’on les partage.</w:t>
+      </w:r>
+    </w:p>
+    <w:p>
+      <w:r>
+        <w:rPr>
+          <w:i/>
+          <w:iCs/>
+        </w:rPr>
+        <w:lastRenderedPageBreak/>
+        <w:t>Toc, toc, toc.</w:t>
+      </w:r>
+    </w:p>
+    <w:p>
+      <w:r>
+        <w:t>Je regarde la porte, prends mon téléphone.</w:t>
+      </w:r>
+    </w:p>
+    <w:p>
+      <w:r>
+        <w:t xml:space="preserve">« Une demi-heure d’avance… et il n’appelle même pas. » </w:t>
+      </w:r>
+      <w:proofErr w:type="spellStart"/>
+      <w:r>
+        <w:t>P’Wi</w:t>
+      </w:r>
+      <w:proofErr w:type="spellEnd"/>
+      <w:r>
+        <w:t xml:space="preserve"> est en avance. J’ouvre, juste une serviette sur moi, pas gênée.</w:t>
+      </w:r>
+    </w:p>
+    <w:p>
+      <w:proofErr w:type="spellStart"/>
+      <w:r>
+        <w:rPr>
+          <w:i/>
+          <w:iCs/>
+        </w:rPr>
+        <w:t>Criiit</w:t>
+      </w:r>
+      <w:proofErr w:type="spellEnd"/>
+      <w:r>
+        <w:rPr>
+          <w:i/>
+          <w:iCs/>
+        </w:rPr>
+        <w:t>…</w:t>
+      </w:r>
+    </w:p>
+    <w:p>
+      <w:r>
+        <w:t xml:space="preserve">« </w:t>
+      </w:r>
+      <w:proofErr w:type="spellStart"/>
+      <w:r>
+        <w:t>P’Wi</w:t>
+      </w:r>
+      <w:proofErr w:type="spellEnd"/>
+      <w:r>
+        <w:t xml:space="preserve"> m’a envoyé pour t’apporter tes vêtements. »</w:t>
+      </w:r>
+    </w:p>
+    <w:p>
+      <w:r>
+        <w:t>Mince…</w:t>
+      </w:r>
+    </w:p>
+    <w:p>
+      <w:r>
+        <w:t xml:space="preserve">« </w:t>
+      </w:r>
+      <w:proofErr w:type="spellStart"/>
+      <w:r>
+        <w:t>P’Madmée</w:t>
+      </w:r>
+      <w:proofErr w:type="spellEnd"/>
+      <w:r>
+        <w:t>… »</w:t>
+      </w:r>
+    </w:p>
     <w:p/>
     <w:p/>
     <w:p/>

</xml_diff>